<commit_message>
updated files in reaction kinetics
</commit_message>
<xml_diff>
--- a/01-Reaction-Kinetics/Instructor-key.docx
+++ b/01-Reaction-Kinetics/Instructor-key.docx
@@ -1,6 +1,6 @@
 
 <file path=word/document.xml><?xml version="1.0" encoding="utf-8"?>
-<w:document xmlns:wpc="http://schemas.microsoft.com/office/word/2010/wordprocessingCanvas" xmlns:cx="http://schemas.microsoft.com/office/drawing/2014/chartex" xmlns:cx1="http://schemas.microsoft.com/office/drawing/2015/9/8/chartex" xmlns:cx2="http://schemas.microsoft.com/office/drawing/2015/10/21/chartex" xmlns:cx3="http://schemas.microsoft.com/office/drawing/2016/5/9/chartex" xmlns:cx4="http://schemas.microsoft.com/office/drawing/2016/5/10/chartex" xmlns:cx5="http://schemas.microsoft.com/office/drawing/2016/5/11/chartex" xmlns:cx6="http://schemas.microsoft.com/office/drawing/2016/5/12/chartex" xmlns:cx7="http://schemas.microsoft.com/office/drawing/2016/5/13/chartex" xmlns:cx8="http://schemas.microsoft.com/office/drawing/2016/5/14/chartex" xmlns:mc="http://schemas.openxmlformats.org/markup-compatibility/2006" xmlns:aink="http://schemas.microsoft.com/office/drawing/2016/ink" xmlns:am3d="http://schemas.microsoft.com/office/drawing/2017/model3d" xmlns:o="urn:schemas-microsoft-com:office:office" xmlns:oel="http://schemas.microsoft.com/office/2019/extlst" xmlns:r="http://schemas.openxmlformats.org/officeDocument/2006/relationships" xmlns:m="http://schemas.openxmlformats.org/officeDocument/2006/math" xmlns:v="urn:schemas-microsoft-com:vml" xmlns:wp14="http://schemas.microsoft.com/office/word/2010/wordprocessingDrawing" xmlns:wp="http://schemas.openxmlformats.org/drawingml/2006/wordprocessingDrawing" xmlns:w10="urn:schemas-microsoft-com:office:word" xmlns:w="http://schemas.openxmlformats.org/wordprocessingml/2006/main" xmlns:w14="http://schemas.microsoft.com/office/word/2010/wordml" xmlns:w15="http://schemas.microsoft.com/office/word/2012/wordml" xmlns:w16cex="http://schemas.microsoft.com/office/word/2018/wordml/cex" xmlns:w16cid="http://schemas.microsoft.com/office/word/2016/wordml/cid" xmlns:w16="http://schemas.microsoft.com/office/word/2018/wordml" xmlns:w16du="http://schemas.microsoft.com/office/word/2023/wordml/word16du" xmlns:w16sdtdh="http://schemas.microsoft.com/office/word/2020/wordml/sdtdatahash" xmlns:w16sdtfl="http://schemas.microsoft.com/office/word/2024/wordml/sdtformatlock" xmlns:w16se="http://schemas.microsoft.com/office/word/2015/wordml/symex" xmlns:wpg="http://schemas.microsoft.com/office/word/2010/wordprocessingGroup" xmlns:wpi="http://schemas.microsoft.com/office/word/2010/wordprocessingInk" xmlns:wne="http://schemas.microsoft.com/office/word/2006/wordml" xmlns:wps="http://schemas.microsoft.com/office/word/2010/wordprocessingShape" xmlns:a="http://schemas.openxmlformats.org/drawingml/2006/main" xmlns:pic="http://schemas.openxmlformats.org/drawingml/2006/picture" xmlns:a14="http://schemas.microsoft.com/office/drawing/2010/main" mc:Ignorable="w14 w15 w16se w16cid w16 w16cex w16sdtdh w16sdtfl w16du wp14">
+<w:document xmlns:wpc="http://schemas.microsoft.com/office/word/2010/wordprocessingCanvas" xmlns:cx="http://schemas.microsoft.com/office/drawing/2014/chartex" xmlns:cx1="http://schemas.microsoft.com/office/drawing/2015/9/8/chartex" xmlns:cx2="http://schemas.microsoft.com/office/drawing/2015/10/21/chartex" xmlns:cx3="http://schemas.microsoft.com/office/drawing/2016/5/9/chartex" xmlns:cx4="http://schemas.microsoft.com/office/drawing/2016/5/10/chartex" xmlns:cx5="http://schemas.microsoft.com/office/drawing/2016/5/11/chartex" xmlns:cx6="http://schemas.microsoft.com/office/drawing/2016/5/12/chartex" xmlns:cx7="http://schemas.microsoft.com/office/drawing/2016/5/13/chartex" xmlns:cx8="http://schemas.microsoft.com/office/drawing/2016/5/14/chartex" xmlns:mc="http://schemas.openxmlformats.org/markup-compatibility/2006" xmlns:m="http://schemas.openxmlformats.org/officeDocument/2006/math" xmlns:aink="http://schemas.microsoft.com/office/drawing/2016/ink" xmlns:am3d="http://schemas.microsoft.com/office/drawing/2017/model3d" xmlns:oel="http://schemas.microsoft.com/office/2019/extlst" xmlns:r="http://schemas.openxmlformats.org/officeDocument/2006/relationships" xmlns:wp14="http://schemas.microsoft.com/office/word/2010/wordprocessingDrawing" xmlns:wp="http://schemas.openxmlformats.org/drawingml/2006/wordprocessingDrawing" xmlns:wpg="http://schemas.microsoft.com/office/word/2010/wordprocessingGroup" xmlns:wpi="http://schemas.microsoft.com/office/word/2010/wordprocessingInk" xmlns:wps="http://schemas.microsoft.com/office/word/2010/wordprocessingShape" xmlns:o="urn:schemas-microsoft-com:office:office" xmlns:v="urn:schemas-microsoft-com:vml" xmlns:w10="urn:schemas-microsoft-com:office:word" xmlns:w="http://schemas.openxmlformats.org/wordprocessingml/2006/main" xmlns:w14="http://schemas.microsoft.com/office/word/2010/wordml" xmlns:w15="http://schemas.microsoft.com/office/word/2012/wordml" xmlns:w16cex="http://schemas.microsoft.com/office/word/2018/wordml/cex" xmlns:w16cid="http://schemas.microsoft.com/office/word/2016/wordml/cid" xmlns:w16="http://schemas.microsoft.com/office/word/2018/wordml" xmlns:w16sdtdh="http://schemas.microsoft.com/office/word/2020/wordml/sdtdatahash" xmlns:w16sdtfl="http://schemas.microsoft.com/office/word/2024/wordml/sdtformatlock" xmlns:w16se="http://schemas.microsoft.com/office/word/2015/wordml/symex" xmlns:w16du="http://schemas.microsoft.com/office/word/2023/wordml/word16du" xmlns:wne="http://schemas.microsoft.com/office/word/2006/wordml" mc:Ignorable="w14 w15 w16se w16cid w16 w16cex w16sdtdh w16sdtfl w16du wp14">
   <w:body>
     <w:p>
       <w:pPr>
@@ -10,7 +10,7 @@
         <w:adjustRightInd w:val="0"/>
         <w:jc w:val="center"/>
         <w:rPr>
-          <w:rFonts w:ascii="Calibri" w:hAnsi="Calibri" w:cs="Calibri" w:eastAsiaTheme="minorHAnsi"/>
+          <w:rFonts w:ascii="Calibri" w:eastAsiaTheme="minorHAnsi" w:hAnsi="Calibri" w:cs="Calibri"/>
           <w:b/>
           <w:bCs/>
           <w:sz w:val="28"/>
@@ -19,7 +19,7 @@
       </w:pPr>
       <w:r>
         <w:rPr>
-          <w:rFonts w:ascii="Calibri" w:hAnsi="Calibri" w:cs="Calibri" w:eastAsiaTheme="minorHAnsi"/>
+          <w:rFonts w:ascii="Calibri" w:eastAsiaTheme="minorHAnsi" w:hAnsi="Calibri" w:cs="Calibri"/>
           <w:b/>
           <w:bCs/>
           <w:sz w:val="28"/>
@@ -29,7 +29,7 @@
       </w:r>
       <w:r>
         <w:rPr>
-          <w:rFonts w:ascii="Calibri" w:hAnsi="Calibri" w:cs="Calibri" w:eastAsiaTheme="minorHAnsi"/>
+          <w:rFonts w:ascii="Calibri" w:eastAsiaTheme="minorHAnsi" w:hAnsi="Calibri" w:cs="Calibri"/>
           <w:b/>
           <w:bCs/>
           <w:sz w:val="28"/>
@@ -39,7 +39,7 @@
       </w:r>
       <w:r>
         <w:rPr>
-          <w:rFonts w:ascii="Calibri" w:hAnsi="Calibri" w:cs="Calibri" w:eastAsiaTheme="minorHAnsi"/>
+          <w:rFonts w:ascii="Calibri" w:eastAsiaTheme="minorHAnsi" w:hAnsi="Calibri" w:cs="Calibri"/>
           <w:b/>
           <w:bCs/>
           <w:sz w:val="28"/>
@@ -65,7 +65,7 @@
         <w:autoSpaceDN w:val="0"/>
         <w:adjustRightInd w:val="0"/>
         <w:rPr>
-          <w:rFonts w:ascii="Calibri" w:hAnsi="Calibri" w:cs="Calibri" w:eastAsiaTheme="minorHAnsi"/>
+          <w:rFonts w:ascii="Calibri" w:eastAsiaTheme="minorHAnsi" w:hAnsi="Calibri" w:cs="Calibri"/>
         </w:rPr>
       </w:pPr>
     </w:p>
@@ -141,7 +141,14 @@
           <w:rFonts w:ascii="Calibri" w:hAnsi="Calibri" w:cs="Calibri"/>
           <w:color w:val="1F1F1F"/>
         </w:rPr>
-        <w:t> This module is created with the assistance of Google Gemini.</w:t>
+        <w:t> </w:t>
+      </w:r>
+      <w:r>
+        <w:rPr>
+          <w:rFonts w:ascii="Calibri" w:hAnsi="Calibri" w:cs="Calibri"/>
+          <w:color w:val="1F1F1F"/>
+        </w:rPr>
+        <w:t>Google Gemini was used to improve clarity and organization of the Module's written text.</w:t>
       </w:r>
     </w:p>
     <w:p>
@@ -652,6 +659,7 @@
           <w:sz w:val="28"/>
           <w:szCs w:val="28"/>
         </w:rPr>
+        <w:lastRenderedPageBreak/>
         <w:t>Getting Started</w:t>
       </w:r>
       <w:r>
@@ -732,7 +740,7 @@
         <w:pStyle w:val="Heading2"/>
         <w:spacing w:before="0" w:after="120"/>
         <w:rPr>
-          <w:rFonts w:ascii="Calibri" w:hAnsi="Calibri" w:eastAsia="Times New Roman" w:cs="Calibri"/>
+          <w:rFonts w:ascii="Calibri" w:eastAsia="Times New Roman" w:hAnsi="Calibri" w:cs="Calibri"/>
           <w:color w:val="1F1F1F"/>
           <w:sz w:val="24"/>
           <w:szCs w:val="24"/>
@@ -741,8 +749,8 @@
       <w:r>
         <w:rPr>
           <w:rFonts w:ascii="Calibri" w:hAnsi="Calibri" w:cs="Calibri"/>
-          <w:b w:val="1"/>
-          <w:bCs w:val="1"/>
+          <w:b/>
+          <w:bCs/>
           <w:color w:val="1F1F1F"/>
           <w:sz w:val="24"/>
           <w:szCs w:val="24"/>
@@ -752,8 +760,8 @@
       <w:r>
         <w:rPr>
           <w:rFonts w:ascii="Calibri" w:hAnsi="Calibri" w:cs="Calibri"/>
-          <w:b w:val="1"/>
-          <w:bCs w:val="1"/>
+          <w:b/>
+          <w:bCs/>
           <w:color w:val="0432FF"/>
           <w:sz w:val="24"/>
           <w:szCs w:val="24"/>
@@ -763,8 +771,8 @@
       <w:r>
         <w:rPr>
           <w:rFonts w:ascii="Calibri" w:hAnsi="Calibri" w:cs="Calibri"/>
-          <w:b w:val="1"/>
-          <w:bCs w:val="1"/>
+          <w:b/>
+          <w:bCs/>
           <w:color w:val="1F1F1F"/>
           <w:sz w:val="24"/>
           <w:szCs w:val="24"/>
@@ -1025,11 +1033,11 @@
         </w:rPr>
         <w:t> </w:t>
       </w:r>
-      <w:hyperlink w:tgtFrame="_blank" w:history="1" r:id="rId7">
+      <w:hyperlink r:id="rId7" w:tgtFrame="_blank" w:history="1">
         <w:r>
           <w:rPr>
             <w:rStyle w:val="Hyperlink"/>
-            <w:rFonts w:ascii="Calibri" w:hAnsi="Calibri" w:eastAsia="Arial" w:cs="Calibri"/>
+            <w:rFonts w:ascii="Calibri" w:eastAsia="Arial" w:hAnsi="Calibri" w:cs="Calibri"/>
           </w:rPr>
           <w:t>https://colab.research.google.com/</w:t>
         </w:r>
@@ -1091,7 +1099,7 @@
         <w:snapToGrid w:val="0"/>
         <w:spacing w:before="0" w:after="120"/>
         <w:rPr>
-          <w:rFonts w:ascii="Calibri" w:hAnsi="Calibri" w:eastAsia="Times New Roman" w:cs="Calibri"/>
+          <w:rFonts w:ascii="Calibri" w:eastAsia="Times New Roman" w:hAnsi="Calibri" w:cs="Calibri"/>
           <w:color w:val="1F1F1F"/>
           <w:sz w:val="24"/>
           <w:szCs w:val="24"/>
@@ -1451,7 +1459,7 @@
         <w:snapToGrid w:val="0"/>
         <w:spacing w:before="0" w:after="120"/>
         <w:rPr>
-          <w:rFonts w:ascii="Calibri" w:hAnsi="Calibri" w:eastAsia="Times New Roman" w:cs="Calibri"/>
+          <w:rFonts w:ascii="Calibri" w:eastAsia="Times New Roman" w:hAnsi="Calibri" w:cs="Calibri"/>
           <w:color w:val="1F1F1F"/>
           <w:sz w:val="24"/>
           <w:szCs w:val="24"/>
@@ -2097,7 +2105,7 @@
             <m:ctrlPr>
               <w:rPr>
                 <w:rStyle w:val="md-ignore"/>
-                <w:rFonts w:ascii="Cambria Math" w:hAnsi="Cambria Math" w:eastAsia="Arial" w:cs="Calibri"/>
+                <w:rFonts w:ascii="Cambria Math" w:eastAsia="Arial" w:hAnsi="Cambria Math" w:cs="Calibri"/>
                 <w:i/>
                 <w:color w:val="1F1F1F"/>
                 <w:lang w:eastAsia="en-US"/>
@@ -2780,6 +2788,7 @@
           <w:sz w:val="28"/>
           <w:szCs w:val="28"/>
         </w:rPr>
+        <w:lastRenderedPageBreak/>
         <w:t xml:space="preserve">Step 2: </w:t>
       </w:r>
       <w:r>
@@ -3646,7 +3655,7 @@
           <m:sSubPr>
             <m:ctrlPr>
               <w:rPr>
-                <w:rFonts w:ascii="Cambria Math" w:hAnsi="Cambria Math" w:eastAsia="Times New Roman" w:cs="Calibri"/>
+                <w:rFonts w:ascii="Cambria Math" w:eastAsia="Times New Roman" w:hAnsi="Cambria Math" w:cs="Calibri"/>
                 <w:b/>
                 <w:bCs/>
                 <w:i/>
@@ -4046,7 +4055,7 @@
             <m:ctrlPr>
               <w:rPr>
                 <w:rStyle w:val="md-ignore"/>
-                <w:rFonts w:ascii="Cambria Math" w:hAnsi="Cambria Math" w:eastAsia="Arial" w:cs="Calibri"/>
+                <w:rFonts w:ascii="Cambria Math" w:eastAsia="Arial" w:hAnsi="Cambria Math" w:cs="Calibri"/>
                 <w:i/>
                 <w:color w:val="1F1F1F"/>
               </w:rPr>
@@ -4056,7 +4065,7 @@
             <m:r>
               <w:rPr>
                 <w:rStyle w:val="md-ignore"/>
-                <w:rFonts w:ascii="Cambria Math" w:hAnsi="Cambria Math" w:eastAsia="Arial" w:cs="Calibri"/>
+                <w:rFonts w:ascii="Cambria Math" w:eastAsia="Arial" w:hAnsi="Cambria Math" w:cs="Calibri"/>
                 <w:color w:val="1F1F1F"/>
               </w:rPr>
               <m:t>A</m:t>
@@ -4066,7 +4075,7 @@
         <m:r>
           <w:rPr>
             <w:rStyle w:val="md-ignore"/>
-            <w:rFonts w:ascii="Cambria Math" w:hAnsi="Cambria Math" w:eastAsia="Arial" w:cs="Calibri"/>
+            <w:rFonts w:ascii="Cambria Math" w:eastAsia="Arial" w:hAnsi="Cambria Math" w:cs="Calibri"/>
             <w:color w:val="1F1F1F"/>
           </w:rPr>
           <m:t xml:space="preserve">= </m:t>
@@ -4076,7 +4085,7 @@
             <m:ctrlPr>
               <w:rPr>
                 <w:rStyle w:val="md-ignore"/>
-                <w:rFonts w:ascii="Cambria Math" w:hAnsi="Cambria Math" w:eastAsia="Arial" w:cs="Calibri"/>
+                <w:rFonts w:ascii="Cambria Math" w:eastAsia="Arial" w:hAnsi="Cambria Math" w:cs="Calibri"/>
                 <w:i/>
                 <w:color w:val="1F1F1F"/>
               </w:rPr>
@@ -4090,7 +4099,7 @@
                 <m:ctrlPr>
                   <w:rPr>
                     <w:rStyle w:val="md-ignore"/>
-                    <w:rFonts w:ascii="Cambria Math" w:hAnsi="Cambria Math" w:eastAsia="Arial" w:cs="Calibri"/>
+                    <w:rFonts w:ascii="Cambria Math" w:eastAsia="Arial" w:hAnsi="Cambria Math" w:cs="Calibri"/>
                     <w:i/>
                     <w:color w:val="1F1F1F"/>
                   </w:rPr>
@@ -4100,7 +4109,7 @@
                 <m:r>
                   <w:rPr>
                     <w:rStyle w:val="md-ignore"/>
-                    <w:rFonts w:ascii="Cambria Math" w:hAnsi="Cambria Math" w:eastAsia="Arial" w:cs="Calibri"/>
+                    <w:rFonts w:ascii="Cambria Math" w:eastAsia="Arial" w:hAnsi="Cambria Math" w:cs="Calibri"/>
                     <w:color w:val="1F1F1F"/>
                   </w:rPr>
                   <m:t>A</m:t>
@@ -4112,7 +4121,7 @@
             <m:r>
               <w:rPr>
                 <w:rStyle w:val="md-ignore"/>
-                <w:rFonts w:ascii="Cambria Math" w:hAnsi="Cambria Math" w:eastAsia="Arial" w:cs="Calibri"/>
+                <w:rFonts w:ascii="Cambria Math" w:eastAsia="Arial" w:hAnsi="Cambria Math" w:cs="Calibri"/>
                 <w:color w:val="1F1F1F"/>
               </w:rPr>
               <m:t>0</m:t>
@@ -4124,7 +4133,7 @@
             <m:ctrlPr>
               <w:rPr>
                 <w:rStyle w:val="md-ignore"/>
-                <w:rFonts w:ascii="Cambria Math" w:hAnsi="Cambria Math" w:eastAsia="Arial" w:cs="Calibri"/>
+                <w:rFonts w:ascii="Cambria Math" w:eastAsia="Arial" w:hAnsi="Cambria Math" w:cs="Calibri"/>
                 <w:i/>
                 <w:color w:val="1F1F1F"/>
               </w:rPr>
@@ -4134,7 +4143,7 @@
             <m:r>
               <w:rPr>
                 <w:rStyle w:val="md-ignore"/>
-                <w:rFonts w:ascii="Cambria Math" w:hAnsi="Cambria Math" w:eastAsia="Arial" w:cs="Calibri"/>
+                <w:rFonts w:ascii="Cambria Math" w:eastAsia="Arial" w:hAnsi="Cambria Math" w:cs="Calibri"/>
                 <w:color w:val="1F1F1F"/>
               </w:rPr>
               <m:t>e</m:t>
@@ -4144,7 +4153,7 @@
             <m:r>
               <w:rPr>
                 <w:rStyle w:val="md-ignore"/>
-                <w:rFonts w:ascii="Cambria Math" w:hAnsi="Cambria Math" w:eastAsia="Arial" w:cs="Calibri"/>
+                <w:rFonts w:ascii="Cambria Math" w:eastAsia="Arial" w:hAnsi="Cambria Math" w:cs="Calibri"/>
                 <w:color w:val="1F1F1F"/>
               </w:rPr>
               <m:t>-</m:t>
@@ -4154,7 +4163,7 @@
                 <m:ctrlPr>
                   <w:rPr>
                     <w:rStyle w:val="md-ignore"/>
-                    <w:rFonts w:ascii="Cambria Math" w:hAnsi="Cambria Math" w:eastAsia="Arial" w:cs="Calibri"/>
+                    <w:rFonts w:ascii="Cambria Math" w:eastAsia="Arial" w:hAnsi="Cambria Math" w:cs="Calibri"/>
                     <w:i/>
                     <w:color w:val="1F1F1F"/>
                   </w:rPr>
@@ -4164,7 +4173,7 @@
                 <m:r>
                   <w:rPr>
                     <w:rStyle w:val="md-ignore"/>
-                    <w:rFonts w:ascii="Cambria Math" w:hAnsi="Cambria Math" w:eastAsia="Arial" w:cs="Calibri"/>
+                    <w:rFonts w:ascii="Cambria Math" w:eastAsia="Arial" w:hAnsi="Cambria Math" w:cs="Calibri"/>
                     <w:color w:val="1F1F1F"/>
                   </w:rPr>
                   <m:t>k</m:t>
@@ -4174,7 +4183,7 @@
                 <m:r>
                   <w:rPr>
                     <w:rStyle w:val="md-ignore"/>
-                    <w:rFonts w:ascii="Cambria Math" w:hAnsi="Cambria Math" w:eastAsia="Arial" w:cs="Calibri"/>
+                    <w:rFonts w:ascii="Cambria Math" w:eastAsia="Arial" w:hAnsi="Cambria Math" w:cs="Calibri"/>
                     <w:color w:val="1F1F1F"/>
                   </w:rPr>
                   <m:t>1</m:t>
@@ -4184,7 +4193,7 @@
             <m:r>
               <w:rPr>
                 <w:rStyle w:val="md-ignore"/>
-                <w:rFonts w:ascii="Cambria Math" w:hAnsi="Cambria Math" w:eastAsia="Arial" w:cs="Calibri"/>
+                <w:rFonts w:ascii="Cambria Math" w:eastAsia="Arial" w:hAnsi="Cambria Math" w:cs="Calibri"/>
                 <w:color w:val="1F1F1F"/>
               </w:rPr>
               <m:t>t</m:t>
@@ -4195,7 +4204,7 @@
       <w:r>
         <w:rPr>
           <w:rStyle w:val="md-ignore"/>
-          <w:rFonts w:ascii="Calibri" w:hAnsi="Calibri" w:eastAsia="Arial" w:cs="Calibri"/>
+          <w:rFonts w:ascii="Calibri" w:eastAsia="Arial" w:hAnsi="Calibri" w:cs="Calibri"/>
           <w:color w:val="1F1F1F"/>
         </w:rPr>
         <w:tab/>
@@ -4203,7 +4212,7 @@
       <w:r>
         <w:rPr>
           <w:rStyle w:val="md-ignore"/>
-          <w:rFonts w:ascii="Calibri" w:hAnsi="Calibri" w:eastAsia="Arial" w:cs="Calibri"/>
+          <w:rFonts w:ascii="Calibri" w:eastAsia="Arial" w:hAnsi="Calibri" w:cs="Calibri"/>
           <w:color w:val="1F1F1F"/>
         </w:rPr>
         <w:tab/>
@@ -4211,7 +4220,7 @@
       <w:r>
         <w:rPr>
           <w:rStyle w:val="md-ignore"/>
-          <w:rFonts w:ascii="Calibri" w:hAnsi="Calibri" w:eastAsia="Arial" w:cs="Calibri"/>
+          <w:rFonts w:ascii="Calibri" w:eastAsia="Arial" w:hAnsi="Calibri" w:cs="Calibri"/>
           <w:color w:val="1F1F1F"/>
         </w:rPr>
         <w:tab/>
@@ -4219,7 +4228,7 @@
       <w:r>
         <w:rPr>
           <w:rStyle w:val="md-ignore"/>
-          <w:rFonts w:ascii="Calibri" w:hAnsi="Calibri" w:eastAsia="Arial" w:cs="Calibri"/>
+          <w:rFonts w:ascii="Calibri" w:eastAsia="Arial" w:hAnsi="Calibri" w:cs="Calibri"/>
           <w:color w:val="1F1F1F"/>
         </w:rPr>
         <w:tab/>
@@ -4227,7 +4236,7 @@
       <w:r>
         <w:rPr>
           <w:rStyle w:val="md-ignore"/>
-          <w:rFonts w:ascii="Calibri" w:hAnsi="Calibri" w:eastAsia="Arial" w:cs="Calibri"/>
+          <w:rFonts w:ascii="Calibri" w:eastAsia="Arial" w:hAnsi="Calibri" w:cs="Calibri"/>
           <w:color w:val="1F1F1F"/>
         </w:rPr>
         <w:t>(1st-order Integrated Rate Law)</w:t>
@@ -4252,7 +4261,7 @@
             <m:ctrlPr>
               <w:rPr>
                 <w:rStyle w:val="md-ignore"/>
-                <w:rFonts w:ascii="Cambria Math" w:hAnsi="Cambria Math" w:eastAsia="Arial" w:cs="Calibri"/>
+                <w:rFonts w:ascii="Cambria Math" w:eastAsia="Arial" w:hAnsi="Cambria Math" w:cs="Calibri"/>
                 <w:i/>
                 <w:color w:val="1F1F1F"/>
               </w:rPr>
@@ -4262,7 +4271,7 @@
             <m:r>
               <w:rPr>
                 <w:rStyle w:val="md-ignore"/>
-                <w:rFonts w:ascii="Cambria Math" w:hAnsi="Cambria Math" w:eastAsia="Arial" w:cs="Calibri"/>
+                <w:rFonts w:ascii="Cambria Math" w:eastAsia="Arial" w:hAnsi="Cambria Math" w:cs="Calibri"/>
                 <w:color w:val="1F1F1F"/>
               </w:rPr>
               <m:t>A</m:t>
@@ -4272,7 +4281,7 @@
         <m:r>
           <w:rPr>
             <w:rStyle w:val="md-ignore"/>
-            <w:rFonts w:ascii="Cambria Math" w:hAnsi="Cambria Math" w:eastAsia="Arial" w:cs="Calibri"/>
+            <w:rFonts w:ascii="Cambria Math" w:eastAsia="Arial" w:hAnsi="Cambria Math" w:cs="Calibri"/>
             <w:color w:val="1F1F1F"/>
           </w:rPr>
           <m:t xml:space="preserve">= </m:t>
@@ -4282,7 +4291,7 @@
             <m:ctrlPr>
               <w:rPr>
                 <w:rStyle w:val="md-ignore"/>
-                <w:rFonts w:ascii="Cambria Math" w:hAnsi="Cambria Math" w:eastAsia="Arial" w:cs="Calibri"/>
+                <w:rFonts w:ascii="Cambria Math" w:eastAsia="Arial" w:hAnsi="Cambria Math" w:cs="Calibri"/>
                 <w:i/>
                 <w:color w:val="1F1F1F"/>
               </w:rPr>
@@ -4294,7 +4303,7 @@
                 <m:ctrlPr>
                   <w:rPr>
                     <w:rStyle w:val="md-ignore"/>
-                    <w:rFonts w:ascii="Cambria Math" w:hAnsi="Cambria Math" w:eastAsia="Arial" w:cs="Calibri"/>
+                    <w:rFonts w:ascii="Cambria Math" w:eastAsia="Arial" w:hAnsi="Cambria Math" w:cs="Calibri"/>
                     <w:i/>
                     <w:color w:val="1F1F1F"/>
                   </w:rPr>
@@ -4306,7 +4315,7 @@
                     <m:ctrlPr>
                       <w:rPr>
                         <w:rStyle w:val="md-ignore"/>
-                        <w:rFonts w:ascii="Cambria Math" w:hAnsi="Cambria Math" w:eastAsia="Arial" w:cs="Calibri"/>
+                        <w:rFonts w:ascii="Cambria Math" w:eastAsia="Arial" w:hAnsi="Cambria Math" w:cs="Calibri"/>
                         <w:i/>
                         <w:color w:val="1F1F1F"/>
                       </w:rPr>
@@ -4316,7 +4325,7 @@
                     <m:r>
                       <w:rPr>
                         <w:rStyle w:val="md-ignore"/>
-                        <w:rFonts w:ascii="Cambria Math" w:hAnsi="Cambria Math" w:eastAsia="Arial" w:cs="Calibri"/>
+                        <w:rFonts w:ascii="Cambria Math" w:eastAsia="Arial" w:hAnsi="Cambria Math" w:cs="Calibri"/>
                         <w:color w:val="1F1F1F"/>
                       </w:rPr>
                       <m:t>1</m:t>
@@ -4328,7 +4337,7 @@
                         <m:ctrlPr>
                           <w:rPr>
                             <w:rStyle w:val="md-ignore"/>
-                            <w:rFonts w:ascii="Cambria Math" w:hAnsi="Cambria Math" w:eastAsia="Arial" w:cs="Calibri"/>
+                            <w:rFonts w:ascii="Cambria Math" w:eastAsia="Arial" w:hAnsi="Cambria Math" w:cs="Calibri"/>
                             <w:i/>
                             <w:color w:val="1F1F1F"/>
                           </w:rPr>
@@ -4342,7 +4351,7 @@
                             <m:ctrlPr>
                               <w:rPr>
                                 <w:rStyle w:val="md-ignore"/>
-                                <w:rFonts w:ascii="Cambria Math" w:hAnsi="Cambria Math" w:eastAsia="Arial" w:cs="Calibri"/>
+                                <w:rFonts w:ascii="Cambria Math" w:eastAsia="Arial" w:hAnsi="Cambria Math" w:cs="Calibri"/>
                                 <w:i/>
                                 <w:color w:val="1F1F1F"/>
                               </w:rPr>
@@ -4352,7 +4361,7 @@
                             <m:r>
                               <w:rPr>
                                 <w:rStyle w:val="md-ignore"/>
-                                <w:rFonts w:ascii="Cambria Math" w:hAnsi="Cambria Math" w:eastAsia="Arial" w:cs="Calibri"/>
+                                <w:rFonts w:ascii="Cambria Math" w:eastAsia="Arial" w:hAnsi="Cambria Math" w:cs="Calibri"/>
                                 <w:color w:val="1F1F1F"/>
                               </w:rPr>
                               <m:t>A</m:t>
@@ -4364,7 +4373,7 @@
                         <m:r>
                           <w:rPr>
                             <w:rStyle w:val="md-ignore"/>
-                            <w:rFonts w:ascii="Cambria Math" w:hAnsi="Cambria Math" w:eastAsia="Arial" w:cs="Calibri"/>
+                            <w:rFonts w:ascii="Cambria Math" w:eastAsia="Arial" w:hAnsi="Cambria Math" w:cs="Calibri"/>
                             <w:color w:val="1F1F1F"/>
                           </w:rPr>
                           <m:t>0</m:t>
@@ -4376,7 +4385,7 @@
                 <m:r>
                   <w:rPr>
                     <w:rStyle w:val="md-ignore"/>
-                    <w:rFonts w:ascii="Cambria Math" w:hAnsi="Cambria Math" w:eastAsia="Arial" w:cs="Calibri"/>
+                    <w:rFonts w:ascii="Cambria Math" w:eastAsia="Arial" w:hAnsi="Cambria Math" w:cs="Calibri"/>
                     <w:color w:val="1F1F1F"/>
                   </w:rPr>
                   <m:t>+</m:t>
@@ -4386,7 +4395,7 @@
                     <m:ctrlPr>
                       <w:rPr>
                         <w:rStyle w:val="md-ignore"/>
-                        <w:rFonts w:ascii="Cambria Math" w:hAnsi="Cambria Math" w:eastAsia="Arial" w:cs="Calibri"/>
+                        <w:rFonts w:ascii="Cambria Math" w:eastAsia="Arial" w:hAnsi="Cambria Math" w:cs="Calibri"/>
                         <w:i/>
                         <w:color w:val="1F1F1F"/>
                       </w:rPr>
@@ -4396,7 +4405,7 @@
                     <m:r>
                       <w:rPr>
                         <w:rStyle w:val="md-ignore"/>
-                        <w:rFonts w:ascii="Cambria Math" w:hAnsi="Cambria Math" w:eastAsia="Arial" w:cs="Calibri"/>
+                        <w:rFonts w:ascii="Cambria Math" w:eastAsia="Arial" w:hAnsi="Cambria Math" w:cs="Calibri"/>
                         <w:color w:val="1F1F1F"/>
                       </w:rPr>
                       <m:t>k</m:t>
@@ -4406,7 +4415,7 @@
                     <m:r>
                       <w:rPr>
                         <w:rStyle w:val="md-ignore"/>
-                        <w:rFonts w:ascii="Cambria Math" w:hAnsi="Cambria Math" w:eastAsia="Arial" w:cs="Calibri"/>
+                        <w:rFonts w:ascii="Cambria Math" w:eastAsia="Arial" w:hAnsi="Cambria Math" w:cs="Calibri"/>
                         <w:color w:val="1F1F1F"/>
                       </w:rPr>
                       <m:t>2</m:t>
@@ -4416,7 +4425,7 @@
                 <m:r>
                   <w:rPr>
                     <w:rStyle w:val="md-ignore"/>
-                    <w:rFonts w:ascii="Cambria Math" w:hAnsi="Cambria Math" w:eastAsia="Arial" w:cs="Calibri"/>
+                    <w:rFonts w:ascii="Cambria Math" w:eastAsia="Arial" w:hAnsi="Cambria Math" w:cs="Calibri"/>
                     <w:color w:val="1F1F1F"/>
                   </w:rPr>
                   <m:t>t</m:t>
@@ -4428,18 +4437,10 @@
             <m:r>
               <w:rPr>
                 <w:rStyle w:val="md-ignore"/>
-                <w:rFonts w:ascii="Cambria Math" w:hAnsi="Cambria Math" w:eastAsia="Arial" w:cs="Calibri"/>
+                <w:rFonts w:ascii="Cambria Math" w:eastAsia="Arial" w:hAnsi="Cambria Math" w:cs="Calibri"/>
                 <w:color w:val="1F1F1F"/>
               </w:rPr>
-              <m:t>-</m:t>
-            </m:r>
-            <m:r>
-              <w:rPr>
-                <w:rStyle w:val="md-ignore"/>
-                <w:rFonts w:ascii="Cambria Math" w:hAnsi="Cambria Math" w:eastAsia="Arial" w:cs="Calibri"/>
-                <w:color w:val="1F1F1F"/>
-              </w:rPr>
-              <m:t>1</m:t>
+              <m:t>-1</m:t>
             </m:r>
           </m:sup>
         </m:sSup>
@@ -4447,7 +4448,7 @@
       <w:r>
         <w:rPr>
           <w:rStyle w:val="md-ignore"/>
-          <w:rFonts w:ascii="Calibri" w:hAnsi="Calibri" w:eastAsia="Arial" w:cs="Calibri"/>
+          <w:rFonts w:ascii="Calibri" w:eastAsia="Arial" w:hAnsi="Calibri" w:cs="Calibri"/>
           <w:color w:val="1F1F1F"/>
         </w:rPr>
         <w:tab/>
@@ -4455,7 +4456,7 @@
       <w:r>
         <w:rPr>
           <w:rStyle w:val="md-ignore"/>
-          <w:rFonts w:ascii="Calibri" w:hAnsi="Calibri" w:eastAsia="Arial" w:cs="Calibri"/>
+          <w:rFonts w:ascii="Calibri" w:eastAsia="Arial" w:hAnsi="Calibri" w:cs="Calibri"/>
           <w:color w:val="1F1F1F"/>
         </w:rPr>
         <w:tab/>
@@ -4463,7 +4464,7 @@
       <w:r>
         <w:rPr>
           <w:rStyle w:val="md-ignore"/>
-          <w:rFonts w:ascii="Calibri" w:hAnsi="Calibri" w:eastAsia="Arial" w:cs="Calibri"/>
+          <w:rFonts w:ascii="Calibri" w:eastAsia="Arial" w:hAnsi="Calibri" w:cs="Calibri"/>
           <w:color w:val="1F1F1F"/>
         </w:rPr>
         <w:tab/>
@@ -4471,7 +4472,7 @@
       <w:r>
         <w:rPr>
           <w:rStyle w:val="md-ignore"/>
-          <w:rFonts w:ascii="Calibri" w:hAnsi="Calibri" w:eastAsia="Arial" w:cs="Calibri"/>
+          <w:rFonts w:ascii="Calibri" w:eastAsia="Arial" w:hAnsi="Calibri" w:cs="Calibri"/>
           <w:color w:val="1F1F1F"/>
         </w:rPr>
         <w:t>(2nd-order Integrated Rate Law)</w:t>
@@ -4935,18 +4936,19 @@
       <w:r>
         <w:rPr>
           <w:rFonts w:ascii="Calibri" w:hAnsi="Calibri" w:cs="Calibri"/>
-          <w:b w:val="1"/>
-          <w:bCs w:val="1"/>
+          <w:b/>
+          <w:bCs/>
           <w:color w:val="1F1F1F"/>
           <w:shd w:val="clear" w:color="auto" w:fill="FFFFFF"/>
         </w:rPr>
+        <w:lastRenderedPageBreak/>
         <w:t>Q</w:t>
       </w:r>
       <w:r>
         <w:rPr>
           <w:rFonts w:ascii="Calibri" w:hAnsi="Calibri" w:cs="Calibri"/>
-          <w:b w:val="1"/>
-          <w:bCs w:val="1"/>
+          <w:b/>
+          <w:bCs/>
           <w:color w:val="1F1F1F"/>
           <w:shd w:val="clear" w:color="auto" w:fill="FFFFFF"/>
         </w:rPr>
@@ -4955,8 +4957,8 @@
       <w:r>
         <w:rPr>
           <w:rFonts w:ascii="Calibri" w:hAnsi="Calibri" w:cs="Calibri"/>
-          <w:b w:val="1"/>
-          <w:bCs w:val="1"/>
+          <w:b/>
+          <w:bCs/>
           <w:color w:val="1F1F1F"/>
           <w:shd w:val="clear" w:color="auto" w:fill="FFFFFF"/>
         </w:rPr>
@@ -4965,8 +4967,8 @@
       <w:r>
         <w:rPr>
           <w:rFonts w:ascii="Calibri" w:hAnsi="Calibri" w:cs="Calibri"/>
-          <w:b w:val="1"/>
-          <w:bCs w:val="1"/>
+          <w:b/>
+          <w:bCs/>
           <w:color w:val="1F1F1F"/>
           <w:shd w:val="clear" w:color="auto" w:fill="FFFFFF"/>
         </w:rPr>
@@ -4975,8 +4977,8 @@
       <w:r>
         <w:rPr>
           <w:rFonts w:ascii="Calibri" w:hAnsi="Calibri" w:cs="Calibri"/>
-          <w:b w:val="1"/>
-          <w:bCs w:val="1"/>
+          <w:b/>
+          <w:bCs/>
           <w:color w:val="1F1F1F"/>
           <w:shd w:val="clear" w:color="auto" w:fill="FFFFFF"/>
         </w:rPr>
@@ -5211,7 +5213,7 @@
             <m:ctrlPr>
               <w:rPr>
                 <w:rStyle w:val="md-ignore"/>
-                <w:rFonts w:ascii="Cambria Math" w:hAnsi="Cambria Math" w:eastAsia="Arial" w:cs="Calibri"/>
+                <w:rFonts w:ascii="Cambria Math" w:eastAsia="Arial" w:hAnsi="Cambria Math" w:cs="Calibri"/>
                 <w:i/>
                 <w:color w:val="1F1F1F"/>
               </w:rPr>
@@ -5224,7 +5226,7 @@
               </m:rPr>
               <w:rPr>
                 <w:rStyle w:val="md-ignore"/>
-                <w:rFonts w:ascii="Cambria Math" w:hAnsi="Cambria Math" w:eastAsia="Arial" w:cs="Calibri"/>
+                <w:rFonts w:ascii="Cambria Math" w:eastAsia="Arial" w:hAnsi="Cambria Math" w:cs="Calibri"/>
                 <w:color w:val="1F1F1F"/>
               </w:rPr>
               <m:t>ln</m:t>
@@ -5238,7 +5240,7 @@
                 <m:ctrlPr>
                   <w:rPr>
                     <w:rStyle w:val="md-ignore"/>
-                    <w:rFonts w:ascii="Cambria Math" w:hAnsi="Cambria Math" w:eastAsia="Arial" w:cs="Calibri"/>
+                    <w:rFonts w:ascii="Cambria Math" w:eastAsia="Arial" w:hAnsi="Cambria Math" w:cs="Calibri"/>
                     <w:i/>
                     <w:color w:val="1F1F1F"/>
                   </w:rPr>
@@ -5248,7 +5250,7 @@
                 <m:r>
                   <w:rPr>
                     <w:rStyle w:val="md-ignore"/>
-                    <w:rFonts w:ascii="Cambria Math" w:hAnsi="Cambria Math" w:eastAsia="Arial" w:cs="Calibri"/>
+                    <w:rFonts w:ascii="Cambria Math" w:eastAsia="Arial" w:hAnsi="Cambria Math" w:cs="Calibri"/>
                     <w:color w:val="1F1F1F"/>
                   </w:rPr>
                   <m:t>A</m:t>
@@ -5258,33 +5260,17 @@
             <m:r>
               <w:rPr>
                 <w:rStyle w:val="md-ignore"/>
-                <w:rFonts w:ascii="Cambria Math" w:hAnsi="Cambria Math" w:eastAsia="Arial" w:cs="Calibri"/>
+                <w:rFonts w:ascii="Cambria Math" w:eastAsia="Arial" w:hAnsi="Cambria Math" w:cs="Calibri"/>
                 <w:color w:val="1F1F1F"/>
               </w:rPr>
-              <m:t>=-</m:t>
-            </m:r>
-            <m:r>
-              <w:rPr>
-                <w:rStyle w:val="md-ignore"/>
-                <w:rFonts w:ascii="Cambria Math" w:hAnsi="Cambria Math" w:eastAsia="Arial" w:cs="Calibri"/>
-                <w:color w:val="1F1F1F"/>
-              </w:rPr>
-              <m:t>kt</m:t>
-            </m:r>
-            <m:r>
-              <w:rPr>
-                <w:rStyle w:val="md-ignore"/>
-                <w:rFonts w:ascii="Cambria Math" w:hAnsi="Cambria Math" w:eastAsia="Arial" w:cs="Calibri"/>
-                <w:color w:val="1F1F1F"/>
-              </w:rPr>
-              <m:t>+</m:t>
+              <m:t>=-kt+</m:t>
             </m:r>
             <m:func>
               <m:funcPr>
                 <m:ctrlPr>
                   <w:rPr>
                     <w:rStyle w:val="md-ignore"/>
-                    <w:rFonts w:ascii="Cambria Math" w:hAnsi="Cambria Math" w:eastAsia="Arial" w:cs="Calibri"/>
+                    <w:rFonts w:ascii="Cambria Math" w:eastAsia="Arial" w:hAnsi="Cambria Math" w:cs="Calibri"/>
                     <w:i/>
                     <w:color w:val="1F1F1F"/>
                   </w:rPr>
@@ -5297,7 +5283,7 @@
                   </m:rPr>
                   <w:rPr>
                     <w:rStyle w:val="md-ignore"/>
-                    <w:rFonts w:ascii="Cambria Math" w:hAnsi="Cambria Math" w:eastAsia="Arial" w:cs="Calibri"/>
+                    <w:rFonts w:ascii="Cambria Math" w:eastAsia="Arial" w:hAnsi="Cambria Math" w:cs="Calibri"/>
                     <w:color w:val="1F1F1F"/>
                   </w:rPr>
                   <m:t>ln</m:t>
@@ -5309,7 +5295,7 @@
                     <m:ctrlPr>
                       <w:rPr>
                         <w:rStyle w:val="md-ignore"/>
-                        <w:rFonts w:ascii="Cambria Math" w:hAnsi="Cambria Math" w:eastAsia="Arial" w:cs="Calibri"/>
+                        <w:rFonts w:ascii="Cambria Math" w:eastAsia="Arial" w:hAnsi="Cambria Math" w:cs="Calibri"/>
                         <w:i/>
                         <w:color w:val="1F1F1F"/>
                       </w:rPr>
@@ -5323,7 +5309,7 @@
                         <m:ctrlPr>
                           <w:rPr>
                             <w:rStyle w:val="md-ignore"/>
-                            <w:rFonts w:ascii="Cambria Math" w:hAnsi="Cambria Math" w:eastAsia="Arial" w:cs="Calibri"/>
+                            <w:rFonts w:ascii="Cambria Math" w:eastAsia="Arial" w:hAnsi="Cambria Math" w:cs="Calibri"/>
                             <w:i/>
                             <w:color w:val="1F1F1F"/>
                           </w:rPr>
@@ -5333,7 +5319,7 @@
                         <m:r>
                           <w:rPr>
                             <w:rStyle w:val="md-ignore"/>
-                            <w:rFonts w:ascii="Cambria Math" w:hAnsi="Cambria Math" w:eastAsia="Arial" w:cs="Calibri"/>
+                            <w:rFonts w:ascii="Cambria Math" w:eastAsia="Arial" w:hAnsi="Cambria Math" w:cs="Calibri"/>
                             <w:color w:val="1F1F1F"/>
                           </w:rPr>
                           <m:t>A</m:t>
@@ -5345,7 +5331,7 @@
                     <m:r>
                       <w:rPr>
                         <w:rStyle w:val="md-ignore"/>
-                        <w:rFonts w:ascii="Cambria Math" w:hAnsi="Cambria Math" w:eastAsia="Arial" w:cs="Calibri"/>
+                        <w:rFonts w:ascii="Cambria Math" w:eastAsia="Arial" w:hAnsi="Cambria Math" w:cs="Calibri"/>
                         <w:color w:val="1F1F1F"/>
                       </w:rPr>
                       <m:t>0</m:t>
@@ -5360,7 +5346,7 @@
       <w:r>
         <w:rPr>
           <w:rStyle w:val="md-ignore"/>
-          <w:rFonts w:ascii="Calibri" w:hAnsi="Calibri" w:eastAsia="Arial" w:cs="Calibri"/>
+          <w:rFonts w:ascii="Calibri" w:eastAsia="Arial" w:hAnsi="Calibri" w:cs="Calibri"/>
           <w:color w:val="1F1F1F"/>
         </w:rPr>
         <w:tab/>
@@ -5368,7 +5354,7 @@
       <w:r>
         <w:rPr>
           <w:rStyle w:val="md-ignore"/>
-          <w:rFonts w:ascii="Calibri" w:hAnsi="Calibri" w:eastAsia="Arial" w:cs="Calibri"/>
+          <w:rFonts w:ascii="Calibri" w:eastAsia="Arial" w:hAnsi="Calibri" w:cs="Calibri"/>
           <w:color w:val="1F1F1F"/>
         </w:rPr>
         <w:tab/>
@@ -5376,7 +5362,7 @@
       <w:r>
         <w:rPr>
           <w:rStyle w:val="md-ignore"/>
-          <w:rFonts w:ascii="Calibri" w:hAnsi="Calibri" w:eastAsia="Arial" w:cs="Calibri"/>
+          <w:rFonts w:ascii="Calibri" w:eastAsia="Arial" w:hAnsi="Calibri" w:cs="Calibri"/>
           <w:color w:val="1F1F1F"/>
         </w:rPr>
         <w:tab/>
@@ -5384,7 +5370,7 @@
       <w:r>
         <w:rPr>
           <w:rStyle w:val="md-ignore"/>
-          <w:rFonts w:ascii="Calibri" w:hAnsi="Calibri" w:eastAsia="Arial" w:cs="Calibri"/>
+          <w:rFonts w:ascii="Calibri" w:eastAsia="Arial" w:hAnsi="Calibri" w:cs="Calibri"/>
           <w:color w:val="1F1F1F"/>
         </w:rPr>
         <w:t>(1st-order Integrated Rate Law)</w:t>
@@ -5406,7 +5392,7 @@
             <m:ctrlPr>
               <w:rPr>
                 <w:rStyle w:val="md-ignore"/>
-                <w:rFonts w:ascii="Cambria Math" w:hAnsi="Cambria Math" w:eastAsia="Arial" w:cs="Calibri"/>
+                <w:rFonts w:ascii="Cambria Math" w:eastAsia="Arial" w:hAnsi="Cambria Math" w:cs="Calibri"/>
                 <w:i/>
                 <w:color w:val="1F1F1F"/>
               </w:rPr>
@@ -5416,7 +5402,7 @@
             <m:r>
               <w:rPr>
                 <w:rStyle w:val="md-ignore"/>
-                <w:rFonts w:ascii="Cambria Math" w:hAnsi="Cambria Math" w:eastAsia="Arial" w:cs="Calibri"/>
+                <w:rFonts w:ascii="Cambria Math" w:eastAsia="Arial" w:hAnsi="Cambria Math" w:cs="Calibri"/>
                 <w:color w:val="1F1F1F"/>
               </w:rPr>
               <m:t>1</m:t>
@@ -5430,7 +5416,7 @@
                 <m:ctrlPr>
                   <w:rPr>
                     <w:rStyle w:val="md-ignore"/>
-                    <w:rFonts w:ascii="Cambria Math" w:hAnsi="Cambria Math" w:eastAsia="Arial" w:cs="Calibri"/>
+                    <w:rFonts w:ascii="Cambria Math" w:eastAsia="Arial" w:hAnsi="Cambria Math" w:cs="Calibri"/>
                     <w:i/>
                     <w:color w:val="1F1F1F"/>
                   </w:rPr>
@@ -5440,7 +5426,7 @@
                 <m:r>
                   <w:rPr>
                     <w:rStyle w:val="md-ignore"/>
-                    <w:rFonts w:ascii="Cambria Math" w:hAnsi="Cambria Math" w:eastAsia="Arial" w:cs="Calibri"/>
+                    <w:rFonts w:ascii="Cambria Math" w:eastAsia="Arial" w:hAnsi="Cambria Math" w:cs="Calibri"/>
                     <w:color w:val="1F1F1F"/>
                   </w:rPr>
                   <m:t>A</m:t>
@@ -5452,33 +5438,17 @@
         <m:r>
           <w:rPr>
             <w:rStyle w:val="md-ignore"/>
-            <w:rFonts w:ascii="Cambria Math" w:hAnsi="Cambria Math" w:eastAsia="Arial" w:cs="Calibri"/>
+            <w:rFonts w:ascii="Cambria Math" w:eastAsia="Arial" w:hAnsi="Cambria Math" w:cs="Calibri"/>
             <w:color w:val="1F1F1F"/>
           </w:rPr>
-          <m:t>=</m:t>
-        </m:r>
-        <m:r>
-          <w:rPr>
-            <w:rStyle w:val="md-ignore"/>
-            <w:rFonts w:ascii="Cambria Math" w:hAnsi="Cambria Math" w:eastAsia="Arial" w:cs="Calibri"/>
-            <w:color w:val="1F1F1F"/>
-          </w:rPr>
-          <m:t>kt</m:t>
-        </m:r>
-        <m:r>
-          <w:rPr>
-            <w:rStyle w:val="md-ignore"/>
-            <w:rFonts w:ascii="Cambria Math" w:hAnsi="Cambria Math" w:eastAsia="Arial" w:cs="Calibri"/>
-            <w:color w:val="1F1F1F"/>
-          </w:rPr>
-          <m:t>+</m:t>
+          <m:t>=kt+</m:t>
         </m:r>
         <m:f>
           <m:fPr>
             <m:ctrlPr>
               <w:rPr>
                 <w:rStyle w:val="md-ignore"/>
-                <w:rFonts w:ascii="Cambria Math" w:hAnsi="Cambria Math" w:eastAsia="Arial" w:cs="Calibri"/>
+                <w:rFonts w:ascii="Cambria Math" w:eastAsia="Arial" w:hAnsi="Cambria Math" w:cs="Calibri"/>
                 <w:i/>
                 <w:color w:val="1F1F1F"/>
               </w:rPr>
@@ -5488,7 +5458,7 @@
             <m:r>
               <w:rPr>
                 <w:rStyle w:val="md-ignore"/>
-                <w:rFonts w:ascii="Cambria Math" w:hAnsi="Cambria Math" w:eastAsia="Arial" w:cs="Calibri"/>
+                <w:rFonts w:ascii="Cambria Math" w:eastAsia="Arial" w:hAnsi="Cambria Math" w:cs="Calibri"/>
                 <w:color w:val="1F1F1F"/>
               </w:rPr>
               <m:t>1</m:t>
@@ -5500,7 +5470,7 @@
                 <m:ctrlPr>
                   <w:rPr>
                     <w:rStyle w:val="md-ignore"/>
-                    <w:rFonts w:ascii="Cambria Math" w:hAnsi="Cambria Math" w:eastAsia="Arial" w:cs="Calibri"/>
+                    <w:rFonts w:ascii="Cambria Math" w:eastAsia="Arial" w:hAnsi="Cambria Math" w:cs="Calibri"/>
                     <w:i/>
                     <w:color w:val="1F1F1F"/>
                   </w:rPr>
@@ -5514,7 +5484,7 @@
                     <m:ctrlPr>
                       <w:rPr>
                         <w:rStyle w:val="md-ignore"/>
-                        <w:rFonts w:ascii="Cambria Math" w:hAnsi="Cambria Math" w:eastAsia="Arial" w:cs="Calibri"/>
+                        <w:rFonts w:ascii="Cambria Math" w:eastAsia="Arial" w:hAnsi="Cambria Math" w:cs="Calibri"/>
                         <w:i/>
                         <w:color w:val="1F1F1F"/>
                       </w:rPr>
@@ -5524,7 +5494,7 @@
                     <m:r>
                       <w:rPr>
                         <w:rStyle w:val="md-ignore"/>
-                        <w:rFonts w:ascii="Cambria Math" w:hAnsi="Cambria Math" w:eastAsia="Arial" w:cs="Calibri"/>
+                        <w:rFonts w:ascii="Cambria Math" w:eastAsia="Arial" w:hAnsi="Cambria Math" w:cs="Calibri"/>
                         <w:color w:val="1F1F1F"/>
                       </w:rPr>
                       <m:t>A</m:t>
@@ -5536,7 +5506,7 @@
                 <m:r>
                   <w:rPr>
                     <w:rStyle w:val="md-ignore"/>
-                    <w:rFonts w:ascii="Cambria Math" w:hAnsi="Cambria Math" w:eastAsia="Arial" w:cs="Calibri"/>
+                    <w:rFonts w:ascii="Cambria Math" w:eastAsia="Arial" w:hAnsi="Cambria Math" w:cs="Calibri"/>
                     <w:color w:val="1F1F1F"/>
                   </w:rPr>
                   <m:t>0</m:t>
@@ -5549,7 +5519,7 @@
       <w:r>
         <w:rPr>
           <w:rStyle w:val="md-ignore"/>
-          <w:rFonts w:ascii="Calibri" w:hAnsi="Calibri" w:eastAsia="Arial" w:cs="Calibri"/>
+          <w:rFonts w:ascii="Calibri" w:eastAsia="Arial" w:hAnsi="Calibri" w:cs="Calibri"/>
           <w:color w:val="1F1F1F"/>
         </w:rPr>
         <w:tab/>
@@ -5557,7 +5527,7 @@
       <w:r>
         <w:rPr>
           <w:rStyle w:val="md-ignore"/>
-          <w:rFonts w:ascii="Calibri" w:hAnsi="Calibri" w:eastAsia="Arial" w:cs="Calibri"/>
+          <w:rFonts w:ascii="Calibri" w:eastAsia="Arial" w:hAnsi="Calibri" w:cs="Calibri"/>
           <w:color w:val="1F1F1F"/>
         </w:rPr>
         <w:tab/>
@@ -5565,7 +5535,7 @@
       <w:r>
         <w:rPr>
           <w:rStyle w:val="md-ignore"/>
-          <w:rFonts w:ascii="Calibri" w:hAnsi="Calibri" w:eastAsia="Arial" w:cs="Calibri"/>
+          <w:rFonts w:ascii="Calibri" w:eastAsia="Arial" w:hAnsi="Calibri" w:cs="Calibri"/>
           <w:color w:val="1F1F1F"/>
         </w:rPr>
         <w:tab/>
@@ -5573,7 +5543,7 @@
       <w:r>
         <w:rPr>
           <w:rStyle w:val="md-ignore"/>
-          <w:rFonts w:ascii="Calibri" w:hAnsi="Calibri" w:eastAsia="Arial" w:cs="Calibri"/>
+          <w:rFonts w:ascii="Calibri" w:eastAsia="Arial" w:hAnsi="Calibri" w:cs="Calibri"/>
           <w:color w:val="1F1F1F"/>
         </w:rPr>
         <w:tab/>
@@ -5581,7 +5551,7 @@
       <w:r>
         <w:rPr>
           <w:rStyle w:val="md-ignore"/>
-          <w:rFonts w:ascii="Calibri" w:hAnsi="Calibri" w:eastAsia="Arial" w:cs="Calibri"/>
+          <w:rFonts w:ascii="Calibri" w:eastAsia="Arial" w:hAnsi="Calibri" w:cs="Calibri"/>
           <w:color w:val="1F1F1F"/>
         </w:rPr>
         <w:t>(2nd-order Integrated Rate Law)</w:t>
@@ -6335,21 +6305,7 @@
                 <w:rFonts w:ascii="Calibri" w:hAnsi="Calibri" w:cs="Calibri"/>
                 <w:color w:val="0432FF"/>
               </w:rPr>
-              <w:t xml:space="preserve">- </w:t>
-            </w:r>
-            <w:r>
-              <w:rPr>
-                <w:rFonts w:ascii="Calibri" w:hAnsi="Calibri" w:cs="Calibri"/>
-                <w:color w:val="0432FF"/>
-              </w:rPr>
-              <w:t>4.45</w:t>
-            </w:r>
-            <w:r>
-              <w:rPr>
-                <w:rFonts w:ascii="Calibri" w:hAnsi="Calibri" w:cs="Calibri"/>
-                <w:color w:val="0432FF"/>
-              </w:rPr>
-              <w:t xml:space="preserve"> x 10</w:t>
+              <w:t>- 4.45 x 10</w:t>
             </w:r>
             <w:r>
               <w:rPr>
@@ -6357,15 +6313,7 @@
                 <w:color w:val="0432FF"/>
                 <w:vertAlign w:val="superscript"/>
               </w:rPr>
-              <w:t>–</w:t>
-            </w:r>
-            <w:r>
-              <w:rPr>
-                <w:rFonts w:ascii="Calibri" w:hAnsi="Calibri" w:cs="Calibri"/>
-                <w:color w:val="0432FF"/>
-                <w:vertAlign w:val="superscript"/>
-              </w:rPr>
-              <w:t>7</w:t>
+              <w:t>–7</w:t>
             </w:r>
             <w:r>
               <w:rPr>
@@ -6582,14 +6530,7 @@
                 <w:rFonts w:ascii="Calibri" w:hAnsi="Calibri" w:cs="Calibri"/>
                 <w:color w:val="0432FF"/>
               </w:rPr>
-              <w:t>2.11</w:t>
-            </w:r>
-            <w:r>
-              <w:rPr>
-                <w:rFonts w:ascii="Calibri" w:hAnsi="Calibri" w:cs="Calibri"/>
-                <w:color w:val="0432FF"/>
-              </w:rPr>
-              <w:t xml:space="preserve"> x 10</w:t>
+              <w:t>2.11 x 10</w:t>
             </w:r>
             <w:r>
               <w:rPr>
@@ -6597,15 +6538,7 @@
                 <w:color w:val="0432FF"/>
                 <w:vertAlign w:val="superscript"/>
               </w:rPr>
-              <w:t>–</w:t>
-            </w:r>
-            <w:r>
-              <w:rPr>
-                <w:rFonts w:ascii="Calibri" w:hAnsi="Calibri" w:cs="Calibri"/>
-                <w:color w:val="0432FF"/>
-                <w:vertAlign w:val="superscript"/>
-              </w:rPr>
-              <w:t>3</w:t>
+              <w:t>–3</w:t>
             </w:r>
             <w:r>
               <w:rPr>
@@ -6635,21 +6568,7 @@
                 <w:rFonts w:ascii="Calibri" w:hAnsi="Calibri" w:cs="Calibri"/>
                 <w:color w:val="0432FF"/>
               </w:rPr>
-              <w:t>-</w:t>
-            </w:r>
-            <w:r>
-              <w:rPr>
-                <w:rFonts w:ascii="Calibri" w:hAnsi="Calibri" w:cs="Calibri"/>
-                <w:color w:val="0432FF"/>
-              </w:rPr>
-              <w:t>6.20</w:t>
-            </w:r>
-            <w:r>
-              <w:rPr>
-                <w:rFonts w:ascii="Calibri" w:hAnsi="Calibri" w:cs="Calibri"/>
-                <w:color w:val="0432FF"/>
-              </w:rPr>
-              <w:t xml:space="preserve"> M</w:t>
+              <w:t>-6.20 M</w:t>
             </w:r>
           </w:p>
         </w:tc>
@@ -6805,14 +6724,7 @@
                 <w:rFonts w:ascii="Calibri" w:hAnsi="Calibri" w:cs="Calibri"/>
                 <w:color w:val="0432FF"/>
               </w:rPr>
-              <w:t>0.6</w:t>
-            </w:r>
-            <w:r>
-              <w:rPr>
-                <w:rFonts w:ascii="Calibri" w:hAnsi="Calibri" w:cs="Calibri"/>
-                <w:color w:val="0432FF"/>
-              </w:rPr>
-              <w:t>490</w:t>
+              <w:t>0.6490</w:t>
             </w:r>
           </w:p>
         </w:tc>
@@ -6835,14 +6747,7 @@
                 <w:rFonts w:ascii="Calibri" w:hAnsi="Calibri" w:cs="Calibri"/>
                 <w:color w:val="0432FF"/>
               </w:rPr>
-              <w:t>0.</w:t>
-            </w:r>
-            <w:r>
-              <w:rPr>
-                <w:rFonts w:ascii="Calibri" w:hAnsi="Calibri" w:cs="Calibri"/>
-                <w:color w:val="0432FF"/>
-              </w:rPr>
-              <w:t>893</w:t>
+              <w:t>0.893</w:t>
             </w:r>
           </w:p>
         </w:tc>
@@ -6894,64 +6799,58 @@
     </w:p>
     <w:p>
       <w:pPr>
-        <w:pStyle w:val="Heading1"/>
-        <w:spacing w:before="0" w:beforeAutospacing="0" w:after="0" w:afterAutospacing="0"/>
-        <w:rPr>
-          <w:rFonts w:ascii="Calibri" w:hAnsi="Calibri" w:cs="Calibri"/>
-          <w:b w:val="0"/>
-          <w:bCs w:val="0"/>
-          <w:color w:val="1F1F1F"/>
-          <w:sz w:val="24"/>
-          <w:szCs w:val="24"/>
-        </w:rPr>
-      </w:pPr>
-    </w:p>
-    <w:p>
-      <w:pPr>
         <w:pStyle w:val="NormalWeb"/>
         <w:spacing w:before="0" w:beforeAutospacing="0" w:after="120" w:afterAutospacing="0"/>
         <w:rPr>
+          <w:rFonts w:ascii="Calibri" w:hAnsi="Calibri" w:cs="Calibri"/>
+          <w:color w:val="1F1F1F"/>
+        </w:rPr>
+      </w:pPr>
+      <w:r>
+        <w:rPr>
           <w:rStyle w:val="md-ignore"/>
-          <w:rFonts w:ascii="Calibri" w:hAnsi="Calibri" w:eastAsia="Arial" w:cs="Calibri"/>
-          <w:b/>
-          <w:bCs/>
-          <w:color w:val="1F1F1F"/>
-        </w:rPr>
-      </w:pPr>
-    </w:p>
-    <w:p>
-      <w:pPr>
-        <w:pStyle w:val="NormalWeb"/>
-        <w:spacing w:before="0" w:beforeAutospacing="0" w:after="120" w:afterAutospacing="0"/>
-        <w:rPr>
-          <w:rFonts w:ascii="Calibri" w:hAnsi="Calibri" w:cs="Calibri"/>
-          <w:color w:val="1F1F1F"/>
-        </w:rPr>
-      </w:pPr>
+          <w:rFonts w:ascii="Calibri" w:eastAsia="Arial" w:hAnsi="Calibri" w:cs="Calibri"/>
+          <w:b/>
+          <w:bCs/>
+          <w:color w:val="1F1F1F"/>
+        </w:rPr>
+        <w:lastRenderedPageBreak/>
+        <w:t>Q</w:t>
+      </w:r>
       <w:r>
         <w:rPr>
           <w:rStyle w:val="md-ignore"/>
-          <w:rFonts w:ascii="Calibri" w:hAnsi="Calibri" w:eastAsia="Arial" w:cs="Calibri"/>
-          <w:b/>
-          <w:bCs/>
-          <w:color w:val="1F1F1F"/>
-        </w:rPr>
-        <w:t>Q</w:t>
+          <w:rFonts w:ascii="Calibri" w:eastAsia="Arial" w:hAnsi="Calibri" w:cs="Calibri"/>
+          <w:b/>
+          <w:bCs/>
+          <w:color w:val="1F1F1F"/>
+        </w:rPr>
+        <w:t>3</w:t>
       </w:r>
       <w:r>
         <w:rPr>
           <w:rStyle w:val="md-ignore"/>
-          <w:rFonts w:ascii="Calibri" w:hAnsi="Calibri" w:eastAsia="Arial" w:cs="Calibri"/>
-          <w:b/>
-          <w:bCs/>
-          <w:color w:val="1F1F1F"/>
-        </w:rPr>
-        <w:t>3</w:t>
+          <w:rFonts w:ascii="Calibri" w:eastAsia="Arial" w:hAnsi="Calibri" w:cs="Calibri"/>
+          <w:b/>
+          <w:bCs/>
+          <w:color w:val="1F1F1F"/>
+        </w:rPr>
+        <w:t>.</w:t>
       </w:r>
       <w:r>
         <w:rPr>
           <w:rStyle w:val="md-ignore"/>
-          <w:rFonts w:ascii="Calibri" w:hAnsi="Calibri" w:eastAsia="Arial" w:cs="Calibri"/>
+          <w:rFonts w:ascii="Calibri" w:eastAsia="Arial" w:hAnsi="Calibri" w:cs="Calibri"/>
+          <w:b/>
+          <w:bCs/>
+          <w:color w:val="1F1F1F"/>
+        </w:rPr>
+        <w:t>4</w:t>
+      </w:r>
+      <w:r>
+        <w:rPr>
+          <w:rStyle w:val="md-ignore"/>
+          <w:rFonts w:ascii="Calibri" w:eastAsia="Arial" w:hAnsi="Calibri" w:cs="Calibri"/>
           <w:b/>
           <w:bCs/>
           <w:color w:val="1F1F1F"/>
@@ -6961,43 +6860,23 @@
       <w:r>
         <w:rPr>
           <w:rStyle w:val="md-ignore"/>
-          <w:rFonts w:ascii="Calibri" w:hAnsi="Calibri" w:eastAsia="Arial" w:cs="Calibri"/>
-          <w:b/>
-          <w:bCs/>
-          <w:color w:val="1F1F1F"/>
-        </w:rPr>
-        <w:t>4</w:t>
+          <w:rFonts w:ascii="Calibri" w:eastAsia="Arial" w:hAnsi="Calibri" w:cs="Calibri"/>
+          <w:color w:val="1F1F1F"/>
+        </w:rPr>
+        <w:t xml:space="preserve"> Consider the subplot with the </w:t>
       </w:r>
       <w:r>
         <w:rPr>
           <w:rStyle w:val="md-ignore"/>
-          <w:rFonts w:ascii="Calibri" w:hAnsi="Calibri" w:eastAsia="Arial" w:cs="Calibri"/>
-          <w:b/>
-          <w:bCs/>
-          <w:color w:val="1F1F1F"/>
-        </w:rPr>
-        <w:t>.</w:t>
+          <w:rFonts w:ascii="Calibri" w:eastAsia="Arial" w:hAnsi="Calibri" w:cs="Calibri"/>
+          <w:color w:val="1F1F1F"/>
+        </w:rPr>
+        <w:t>best linear fit (</w:t>
       </w:r>
       <w:r>
         <w:rPr>
           <w:rStyle w:val="md-ignore"/>
-          <w:rFonts w:ascii="Calibri" w:hAnsi="Calibri" w:eastAsia="Arial" w:cs="Calibri"/>
-          <w:color w:val="1F1F1F"/>
-        </w:rPr>
-        <w:t xml:space="preserve"> Consider the subplot with the </w:t>
-      </w:r>
-      <w:r>
-        <w:rPr>
-          <w:rStyle w:val="md-ignore"/>
-          <w:rFonts w:ascii="Calibri" w:hAnsi="Calibri" w:eastAsia="Arial" w:cs="Calibri"/>
-          <w:color w:val="1F1F1F"/>
-        </w:rPr>
-        <w:t>best linear fit (</w:t>
-      </w:r>
-      <w:r>
-        <w:rPr>
-          <w:rStyle w:val="md-ignore"/>
-          <w:rFonts w:ascii="Calibri" w:hAnsi="Calibri" w:eastAsia="Arial" w:cs="Calibri"/>
+          <w:rFonts w:ascii="Calibri" w:eastAsia="Arial" w:hAnsi="Calibri" w:cs="Calibri"/>
           <w:color w:val="1F1F1F"/>
         </w:rPr>
         <w:t>highest</w:t>
@@ -7055,7 +6934,7 @@
       <w:r>
         <w:rPr>
           <w:rStyle w:val="md-ignore"/>
-          <w:rFonts w:ascii="Calibri" w:hAnsi="Calibri" w:eastAsia="Arial" w:cs="Calibri"/>
+          <w:rFonts w:ascii="Calibri" w:eastAsia="Arial" w:hAnsi="Calibri" w:cs="Calibri"/>
           <w:color w:val="1F1F1F"/>
         </w:rPr>
         <w:t>value</w:t>
@@ -7063,7 +6942,7 @@
       <w:r>
         <w:rPr>
           <w:rStyle w:val="md-ignore"/>
-          <w:rFonts w:ascii="Calibri" w:hAnsi="Calibri" w:eastAsia="Arial" w:cs="Calibri"/>
+          <w:rFonts w:ascii="Calibri" w:eastAsia="Arial" w:hAnsi="Calibri" w:cs="Calibri"/>
           <w:color w:val="1F1F1F"/>
         </w:rPr>
         <w:t>)</w:t>
@@ -7071,7 +6950,7 @@
       <w:r>
         <w:rPr>
           <w:rStyle w:val="md-ignore"/>
-          <w:rFonts w:ascii="Calibri" w:hAnsi="Calibri" w:eastAsia="Arial" w:cs="Calibri"/>
+          <w:rFonts w:ascii="Calibri" w:eastAsia="Arial" w:hAnsi="Calibri" w:cs="Calibri"/>
           <w:color w:val="1F1F1F"/>
         </w:rPr>
         <w:t>:</w:t>
@@ -7185,16 +7064,7 @@
           <w:bCs/>
           <w:color w:val="0432FF"/>
         </w:rPr>
-        <w:t xml:space="preserve">k = slope = </w:t>
-      </w:r>
-      <w:r>
-        <w:rPr>
-          <w:rFonts w:ascii="Calibri" w:hAnsi="Calibri" w:cs="Calibri"/>
-          <w:b/>
-          <w:bCs/>
-          <w:color w:val="0432FF"/>
-        </w:rPr>
-        <w:t>1.06</w:t>
+        <w:t>k = slope = 1.06</w:t>
       </w:r>
       <w:r>
         <w:rPr>
@@ -8026,7 +7896,7 @@
         <w:spacing w:before="0" w:beforeAutospacing="0" w:after="0" w:afterAutospacing="0"/>
         <w:rPr>
           <w:rStyle w:val="Strong"/>
-          <w:rFonts w:ascii="Calibri" w:hAnsi="Calibri" w:eastAsia="Arial" w:cs="Calibri"/>
+          <w:rFonts w:ascii="Calibri" w:eastAsia="Arial" w:hAnsi="Calibri" w:cs="Calibri"/>
           <w:b w:val="0"/>
           <w:bCs w:val="0"/>
         </w:rPr>
@@ -8039,7 +7909,7 @@
         <w:spacing w:before="0" w:beforeAutospacing="0" w:after="0" w:afterAutospacing="0"/>
         <w:rPr>
           <w:rStyle w:val="Strong"/>
-          <w:rFonts w:ascii="Calibri" w:hAnsi="Calibri" w:eastAsia="Arial" w:cs="Calibri"/>
+          <w:rFonts w:ascii="Calibri" w:eastAsia="Arial" w:hAnsi="Calibri" w:cs="Calibri"/>
           <w:b w:val="0"/>
           <w:bCs w:val="0"/>
         </w:rPr>
@@ -8246,7 +8116,7 @@
       <w:r>
         <w:rPr>
           <w:rStyle w:val="apple-converted-space"/>
-          <w:rFonts w:ascii="Calibri" w:hAnsi="Calibri" w:eastAsia="Arial" w:cs="Calibri"/>
+          <w:rFonts w:ascii="Calibri" w:eastAsia="Arial" w:hAnsi="Calibri" w:cs="Calibri"/>
           <w:color w:val="1F1F1F"/>
         </w:rPr>
         <w:t> </w:t>
@@ -8283,7 +8153,7 @@
       <w:r>
         <w:rPr>
           <w:rStyle w:val="apple-converted-space"/>
-          <w:rFonts w:ascii="Calibri" w:hAnsi="Calibri" w:eastAsia="Arial" w:cs="Calibri"/>
+          <w:rFonts w:ascii="Calibri" w:eastAsia="Arial" w:hAnsi="Calibri" w:cs="Calibri"/>
           <w:color w:val="1F1F1F"/>
         </w:rPr>
         <w:t> </w:t>
@@ -8326,7 +8196,7 @@
         <w:snapToGrid w:val="0"/>
         <w:spacing w:before="120" w:beforeAutospacing="0" w:after="120" w:afterAutospacing="0"/>
         <w:rPr>
-          <w:rFonts w:ascii="Calibri" w:hAnsi="Calibri" w:cs="Calibri" w:eastAsiaTheme="minorHAnsi"/>
+          <w:rFonts w:ascii="Calibri" w:eastAsiaTheme="minorHAnsi" w:hAnsi="Calibri" w:cs="Calibri"/>
         </w:rPr>
       </w:pPr>
       <w:r>
@@ -8356,7 +8226,7 @@
       <w:r>
         <w:rPr>
           <w:rStyle w:val="apple-converted-space"/>
-          <w:rFonts w:ascii="Calibri" w:hAnsi="Calibri" w:eastAsia="Arial" w:cs="Calibri"/>
+          <w:rFonts w:ascii="Calibri" w:eastAsia="Arial" w:hAnsi="Calibri" w:cs="Calibri"/>
           <w:color w:val="1F1F1F"/>
         </w:rPr>
         <w:t>.</w:t>
@@ -8366,7 +8236,7 @@
       <w:headerReference w:type="even" r:id="rId10"/>
       <w:footerReference w:type="even" r:id="rId11"/>
       <w:footerReference w:type="default" r:id="rId12"/>
-      <w:pgSz w:w="12240" w:h="15840" w:orient="portrait"/>
+      <w:pgSz w:w="12240" w:h="15840"/>
       <w:pgMar w:top="1440" w:right="1440" w:bottom="1440" w:left="1440" w:header="720" w:footer="720" w:gutter="0"/>
       <w:cols w:space="720"/>
       <w:docGrid w:linePitch="360"/>
@@ -8376,7 +8246,7 @@
 </file>
 
 <file path=word/endnotes.xml><?xml version="1.0" encoding="utf-8"?>
-<w:endnotes xmlns:wpc="http://schemas.microsoft.com/office/word/2010/wordprocessingCanvas" xmlns:cx="http://schemas.microsoft.com/office/drawing/2014/chartex" xmlns:cx1="http://schemas.microsoft.com/office/drawing/2015/9/8/chartex" xmlns:cx2="http://schemas.microsoft.com/office/drawing/2015/10/21/chartex" xmlns:cx3="http://schemas.microsoft.com/office/drawing/2016/5/9/chartex" xmlns:cx4="http://schemas.microsoft.com/office/drawing/2016/5/10/chartex" xmlns:cx5="http://schemas.microsoft.com/office/drawing/2016/5/11/chartex" xmlns:cx6="http://schemas.microsoft.com/office/drawing/2016/5/12/chartex" xmlns:cx7="http://schemas.microsoft.com/office/drawing/2016/5/13/chartex" xmlns:cx8="http://schemas.microsoft.com/office/drawing/2016/5/14/chartex" xmlns:mc="http://schemas.openxmlformats.org/markup-compatibility/2006" xmlns:aink="http://schemas.microsoft.com/office/drawing/2016/ink" xmlns:am3d="http://schemas.microsoft.com/office/drawing/2017/model3d" xmlns:o="urn:schemas-microsoft-com:office:office" xmlns:oel="http://schemas.microsoft.com/office/2019/extlst" xmlns:r="http://schemas.openxmlformats.org/officeDocument/2006/relationships" xmlns:m="http://schemas.openxmlformats.org/officeDocument/2006/math" xmlns:v="urn:schemas-microsoft-com:vml" xmlns:wp14="http://schemas.microsoft.com/office/word/2010/wordprocessingDrawing" xmlns:wp="http://schemas.openxmlformats.org/drawingml/2006/wordprocessingDrawing" xmlns:w10="urn:schemas-microsoft-com:office:word" xmlns:w="http://schemas.openxmlformats.org/wordprocessingml/2006/main" xmlns:w14="http://schemas.microsoft.com/office/word/2010/wordml" xmlns:w15="http://schemas.microsoft.com/office/word/2012/wordml" xmlns:w16cex="http://schemas.microsoft.com/office/word/2018/wordml/cex" xmlns:w16cid="http://schemas.microsoft.com/office/word/2016/wordml/cid" xmlns:w16="http://schemas.microsoft.com/office/word/2018/wordml" xmlns:w16du="http://schemas.microsoft.com/office/word/2023/wordml/word16du" xmlns:w16sdtdh="http://schemas.microsoft.com/office/word/2020/wordml/sdtdatahash" xmlns:w16sdtfl="http://schemas.microsoft.com/office/word/2024/wordml/sdtformatlock" xmlns:w16se="http://schemas.microsoft.com/office/word/2015/wordml/symex" xmlns:wpg="http://schemas.microsoft.com/office/word/2010/wordprocessingGroup" xmlns:wpi="http://schemas.microsoft.com/office/word/2010/wordprocessingInk" xmlns:wne="http://schemas.microsoft.com/office/word/2006/wordml" xmlns:wps="http://schemas.microsoft.com/office/word/2010/wordprocessingShape" mc:Ignorable="w14 w15 w16se w16cid w16 w16cex w16sdtdh w16sdtfl w16du wp14">
+<w:endnotes xmlns:wpc="http://schemas.microsoft.com/office/word/2010/wordprocessingCanvas" xmlns:cx="http://schemas.microsoft.com/office/drawing/2014/chartex" xmlns:cx1="http://schemas.microsoft.com/office/drawing/2015/9/8/chartex" xmlns:cx2="http://schemas.microsoft.com/office/drawing/2015/10/21/chartex" xmlns:cx3="http://schemas.microsoft.com/office/drawing/2016/5/9/chartex" xmlns:cx4="http://schemas.microsoft.com/office/drawing/2016/5/10/chartex" xmlns:cx5="http://schemas.microsoft.com/office/drawing/2016/5/11/chartex" xmlns:cx6="http://schemas.microsoft.com/office/drawing/2016/5/12/chartex" xmlns:cx7="http://schemas.microsoft.com/office/drawing/2016/5/13/chartex" xmlns:cx8="http://schemas.microsoft.com/office/drawing/2016/5/14/chartex" xmlns:mc="http://schemas.openxmlformats.org/markup-compatibility/2006" xmlns:m="http://schemas.openxmlformats.org/officeDocument/2006/math" xmlns:aink="http://schemas.microsoft.com/office/drawing/2016/ink" xmlns:am3d="http://schemas.microsoft.com/office/drawing/2017/model3d" xmlns:oel="http://schemas.microsoft.com/office/2019/extlst" xmlns:r="http://schemas.openxmlformats.org/officeDocument/2006/relationships" xmlns:wp14="http://schemas.microsoft.com/office/word/2010/wordprocessingDrawing" xmlns:wp="http://schemas.openxmlformats.org/drawingml/2006/wordprocessingDrawing" xmlns:wpg="http://schemas.microsoft.com/office/word/2010/wordprocessingGroup" xmlns:wpi="http://schemas.microsoft.com/office/word/2010/wordprocessingInk" xmlns:wps="http://schemas.microsoft.com/office/word/2010/wordprocessingShape" xmlns:o="urn:schemas-microsoft-com:office:office" xmlns:v="urn:schemas-microsoft-com:vml" xmlns:w10="urn:schemas-microsoft-com:office:word" xmlns:w="http://schemas.openxmlformats.org/wordprocessingml/2006/main" xmlns:w14="http://schemas.microsoft.com/office/word/2010/wordml" xmlns:w15="http://schemas.microsoft.com/office/word/2012/wordml" xmlns:w16cex="http://schemas.microsoft.com/office/word/2018/wordml/cex" xmlns:w16cid="http://schemas.microsoft.com/office/word/2016/wordml/cid" xmlns:w16="http://schemas.microsoft.com/office/word/2018/wordml" xmlns:w16sdtdh="http://schemas.microsoft.com/office/word/2020/wordml/sdtdatahash" xmlns:w16sdtfl="http://schemas.microsoft.com/office/word/2024/wordml/sdtformatlock" xmlns:w16se="http://schemas.microsoft.com/office/word/2015/wordml/symex" xmlns:w16du="http://schemas.microsoft.com/office/word/2023/wordml/word16du" xmlns:wne="http://schemas.microsoft.com/office/word/2006/wordml" mc:Ignorable="w14 w15 w16se w16cid w16 w16cex w16sdtdh w16sdtfl w16du wp14">
   <w:endnote w:type="separator" w:id="-1">
     <w:p>
       <w:r>
@@ -8395,11 +8265,11 @@
 </file>
 
 <file path=word/footer1.xml><?xml version="1.0" encoding="utf-8"?>
-<w:ftr xmlns:wpc="http://schemas.microsoft.com/office/word/2010/wordprocessingCanvas" xmlns:cx="http://schemas.microsoft.com/office/drawing/2014/chartex" xmlns:cx1="http://schemas.microsoft.com/office/drawing/2015/9/8/chartex" xmlns:cx2="http://schemas.microsoft.com/office/drawing/2015/10/21/chartex" xmlns:cx3="http://schemas.microsoft.com/office/drawing/2016/5/9/chartex" xmlns:cx4="http://schemas.microsoft.com/office/drawing/2016/5/10/chartex" xmlns:cx5="http://schemas.microsoft.com/office/drawing/2016/5/11/chartex" xmlns:cx6="http://schemas.microsoft.com/office/drawing/2016/5/12/chartex" xmlns:cx7="http://schemas.microsoft.com/office/drawing/2016/5/13/chartex" xmlns:cx8="http://schemas.microsoft.com/office/drawing/2016/5/14/chartex" xmlns:mc="http://schemas.openxmlformats.org/markup-compatibility/2006" xmlns:aink="http://schemas.microsoft.com/office/drawing/2016/ink" xmlns:am3d="http://schemas.microsoft.com/office/drawing/2017/model3d" xmlns:o="urn:schemas-microsoft-com:office:office" xmlns:oel="http://schemas.microsoft.com/office/2019/extlst" xmlns:r="http://schemas.openxmlformats.org/officeDocument/2006/relationships" xmlns:m="http://schemas.openxmlformats.org/officeDocument/2006/math" xmlns:v="urn:schemas-microsoft-com:vml" xmlns:wp14="http://schemas.microsoft.com/office/word/2010/wordprocessingDrawing" xmlns:wp="http://schemas.openxmlformats.org/drawingml/2006/wordprocessingDrawing" xmlns:w10="urn:schemas-microsoft-com:office:word" xmlns:w="http://schemas.openxmlformats.org/wordprocessingml/2006/main" xmlns:w14="http://schemas.microsoft.com/office/word/2010/wordml" xmlns:w15="http://schemas.microsoft.com/office/word/2012/wordml" xmlns:w16cex="http://schemas.microsoft.com/office/word/2018/wordml/cex" xmlns:w16cid="http://schemas.microsoft.com/office/word/2016/wordml/cid" xmlns:w16="http://schemas.microsoft.com/office/word/2018/wordml" xmlns:w16du="http://schemas.microsoft.com/office/word/2023/wordml/word16du" xmlns:w16sdtdh="http://schemas.microsoft.com/office/word/2020/wordml/sdtdatahash" xmlns:w16sdtfl="http://schemas.microsoft.com/office/word/2024/wordml/sdtformatlock" xmlns:w16se="http://schemas.microsoft.com/office/word/2015/wordml/symex" xmlns:wpg="http://schemas.microsoft.com/office/word/2010/wordprocessingGroup" xmlns:wpi="http://schemas.microsoft.com/office/word/2010/wordprocessingInk" xmlns:wne="http://schemas.microsoft.com/office/word/2006/wordml" xmlns:wps="http://schemas.microsoft.com/office/word/2010/wordprocessingShape" mc:Ignorable="w14 w15 w16se w16cid w16 w16cex w16sdtdh w16sdtfl w16du wp14">
+<w:ftr xmlns:wpc="http://schemas.microsoft.com/office/word/2010/wordprocessingCanvas" xmlns:cx="http://schemas.microsoft.com/office/drawing/2014/chartex" xmlns:cx1="http://schemas.microsoft.com/office/drawing/2015/9/8/chartex" xmlns:cx2="http://schemas.microsoft.com/office/drawing/2015/10/21/chartex" xmlns:cx3="http://schemas.microsoft.com/office/drawing/2016/5/9/chartex" xmlns:cx4="http://schemas.microsoft.com/office/drawing/2016/5/10/chartex" xmlns:cx5="http://schemas.microsoft.com/office/drawing/2016/5/11/chartex" xmlns:cx6="http://schemas.microsoft.com/office/drawing/2016/5/12/chartex" xmlns:cx7="http://schemas.microsoft.com/office/drawing/2016/5/13/chartex" xmlns:cx8="http://schemas.microsoft.com/office/drawing/2016/5/14/chartex" xmlns:mc="http://schemas.openxmlformats.org/markup-compatibility/2006" xmlns:m="http://schemas.openxmlformats.org/officeDocument/2006/math" xmlns:aink="http://schemas.microsoft.com/office/drawing/2016/ink" xmlns:am3d="http://schemas.microsoft.com/office/drawing/2017/model3d" xmlns:oel="http://schemas.microsoft.com/office/2019/extlst" xmlns:r="http://schemas.openxmlformats.org/officeDocument/2006/relationships" xmlns:wp14="http://schemas.microsoft.com/office/word/2010/wordprocessingDrawing" xmlns:wp="http://schemas.openxmlformats.org/drawingml/2006/wordprocessingDrawing" xmlns:wpg="http://schemas.microsoft.com/office/word/2010/wordprocessingGroup" xmlns:wpi="http://schemas.microsoft.com/office/word/2010/wordprocessingInk" xmlns:wps="http://schemas.microsoft.com/office/word/2010/wordprocessingShape" xmlns:o="urn:schemas-microsoft-com:office:office" xmlns:v="urn:schemas-microsoft-com:vml" xmlns:w10="urn:schemas-microsoft-com:office:word" xmlns:w="http://schemas.openxmlformats.org/wordprocessingml/2006/main" xmlns:w14="http://schemas.microsoft.com/office/word/2010/wordml" xmlns:w15="http://schemas.microsoft.com/office/word/2012/wordml" xmlns:w16cex="http://schemas.microsoft.com/office/word/2018/wordml/cex" xmlns:w16cid="http://schemas.microsoft.com/office/word/2016/wordml/cid" xmlns:w16="http://schemas.microsoft.com/office/word/2018/wordml" xmlns:w16sdtdh="http://schemas.microsoft.com/office/word/2020/wordml/sdtdatahash" xmlns:w16sdtfl="http://schemas.microsoft.com/office/word/2024/wordml/sdtformatlock" xmlns:w16se="http://schemas.microsoft.com/office/word/2015/wordml/symex" xmlns:w16du="http://schemas.microsoft.com/office/word/2023/wordml/word16du" xmlns:wne="http://schemas.microsoft.com/office/word/2006/wordml" mc:Ignorable="w14 w15 w16se w16cid w16 w16cex w16sdtdh w16sdtfl w16du wp14">
   <w:p>
     <w:pPr>
       <w:pStyle w:val="Footer"/>
-      <w:framePr w:wrap="none" w:hAnchor="margin" w:vAnchor="text" w:xAlign="right" w:y="1"/>
+      <w:framePr w:wrap="none" w:vAnchor="text" w:hAnchor="margin" w:xAlign="right" w:y="1"/>
       <w:rPr>
         <w:rStyle w:val="PageNumber"/>
       </w:rPr>
@@ -8433,11 +8303,11 @@
 </file>
 
 <file path=word/footer2.xml><?xml version="1.0" encoding="utf-8"?>
-<w:ftr xmlns:wpc="http://schemas.microsoft.com/office/word/2010/wordprocessingCanvas" xmlns:cx="http://schemas.microsoft.com/office/drawing/2014/chartex" xmlns:cx1="http://schemas.microsoft.com/office/drawing/2015/9/8/chartex" xmlns:cx2="http://schemas.microsoft.com/office/drawing/2015/10/21/chartex" xmlns:cx3="http://schemas.microsoft.com/office/drawing/2016/5/9/chartex" xmlns:cx4="http://schemas.microsoft.com/office/drawing/2016/5/10/chartex" xmlns:cx5="http://schemas.microsoft.com/office/drawing/2016/5/11/chartex" xmlns:cx6="http://schemas.microsoft.com/office/drawing/2016/5/12/chartex" xmlns:cx7="http://schemas.microsoft.com/office/drawing/2016/5/13/chartex" xmlns:cx8="http://schemas.microsoft.com/office/drawing/2016/5/14/chartex" xmlns:mc="http://schemas.openxmlformats.org/markup-compatibility/2006" xmlns:aink="http://schemas.microsoft.com/office/drawing/2016/ink" xmlns:am3d="http://schemas.microsoft.com/office/drawing/2017/model3d" xmlns:o="urn:schemas-microsoft-com:office:office" xmlns:oel="http://schemas.microsoft.com/office/2019/extlst" xmlns:r="http://schemas.openxmlformats.org/officeDocument/2006/relationships" xmlns:m="http://schemas.openxmlformats.org/officeDocument/2006/math" xmlns:v="urn:schemas-microsoft-com:vml" xmlns:wp14="http://schemas.microsoft.com/office/word/2010/wordprocessingDrawing" xmlns:wp="http://schemas.openxmlformats.org/drawingml/2006/wordprocessingDrawing" xmlns:w10="urn:schemas-microsoft-com:office:word" xmlns:w="http://schemas.openxmlformats.org/wordprocessingml/2006/main" xmlns:w14="http://schemas.microsoft.com/office/word/2010/wordml" xmlns:w15="http://schemas.microsoft.com/office/word/2012/wordml" xmlns:w16cex="http://schemas.microsoft.com/office/word/2018/wordml/cex" xmlns:w16cid="http://schemas.microsoft.com/office/word/2016/wordml/cid" xmlns:w16="http://schemas.microsoft.com/office/word/2018/wordml" xmlns:w16du="http://schemas.microsoft.com/office/word/2023/wordml/word16du" xmlns:w16sdtdh="http://schemas.microsoft.com/office/word/2020/wordml/sdtdatahash" xmlns:w16sdtfl="http://schemas.microsoft.com/office/word/2024/wordml/sdtformatlock" xmlns:w16se="http://schemas.microsoft.com/office/word/2015/wordml/symex" xmlns:wpg="http://schemas.microsoft.com/office/word/2010/wordprocessingGroup" xmlns:wpi="http://schemas.microsoft.com/office/word/2010/wordprocessingInk" xmlns:wne="http://schemas.microsoft.com/office/word/2006/wordml" xmlns:wps="http://schemas.microsoft.com/office/word/2010/wordprocessingShape" mc:Ignorable="w14 w15 w16se w16cid w16 w16cex w16sdtdh w16sdtfl w16du wp14">
+<w:ftr xmlns:wpc="http://schemas.microsoft.com/office/word/2010/wordprocessingCanvas" xmlns:cx="http://schemas.microsoft.com/office/drawing/2014/chartex" xmlns:cx1="http://schemas.microsoft.com/office/drawing/2015/9/8/chartex" xmlns:cx2="http://schemas.microsoft.com/office/drawing/2015/10/21/chartex" xmlns:cx3="http://schemas.microsoft.com/office/drawing/2016/5/9/chartex" xmlns:cx4="http://schemas.microsoft.com/office/drawing/2016/5/10/chartex" xmlns:cx5="http://schemas.microsoft.com/office/drawing/2016/5/11/chartex" xmlns:cx6="http://schemas.microsoft.com/office/drawing/2016/5/12/chartex" xmlns:cx7="http://schemas.microsoft.com/office/drawing/2016/5/13/chartex" xmlns:cx8="http://schemas.microsoft.com/office/drawing/2016/5/14/chartex" xmlns:mc="http://schemas.openxmlformats.org/markup-compatibility/2006" xmlns:m="http://schemas.openxmlformats.org/officeDocument/2006/math" xmlns:aink="http://schemas.microsoft.com/office/drawing/2016/ink" xmlns:am3d="http://schemas.microsoft.com/office/drawing/2017/model3d" xmlns:oel="http://schemas.microsoft.com/office/2019/extlst" xmlns:r="http://schemas.openxmlformats.org/officeDocument/2006/relationships" xmlns:wp14="http://schemas.microsoft.com/office/word/2010/wordprocessingDrawing" xmlns:wp="http://schemas.openxmlformats.org/drawingml/2006/wordprocessingDrawing" xmlns:wpg="http://schemas.microsoft.com/office/word/2010/wordprocessingGroup" xmlns:wpi="http://schemas.microsoft.com/office/word/2010/wordprocessingInk" xmlns:wps="http://schemas.microsoft.com/office/word/2010/wordprocessingShape" xmlns:o="urn:schemas-microsoft-com:office:office" xmlns:v="urn:schemas-microsoft-com:vml" xmlns:w10="urn:schemas-microsoft-com:office:word" xmlns:w="http://schemas.openxmlformats.org/wordprocessingml/2006/main" xmlns:w14="http://schemas.microsoft.com/office/word/2010/wordml" xmlns:w15="http://schemas.microsoft.com/office/word/2012/wordml" xmlns:w16cex="http://schemas.microsoft.com/office/word/2018/wordml/cex" xmlns:w16cid="http://schemas.microsoft.com/office/word/2016/wordml/cid" xmlns:w16="http://schemas.microsoft.com/office/word/2018/wordml" xmlns:w16sdtdh="http://schemas.microsoft.com/office/word/2020/wordml/sdtdatahash" xmlns:w16sdtfl="http://schemas.microsoft.com/office/word/2024/wordml/sdtformatlock" xmlns:w16se="http://schemas.microsoft.com/office/word/2015/wordml/symex" xmlns:w16du="http://schemas.microsoft.com/office/word/2023/wordml/word16du" xmlns:wne="http://schemas.microsoft.com/office/word/2006/wordml" mc:Ignorable="w14 w15 w16se w16cid w16 w16cex w16sdtdh w16sdtfl w16du wp14">
   <w:p>
     <w:pPr>
       <w:pStyle w:val="Footer"/>
-      <w:framePr w:wrap="none" w:hAnchor="page" w:vAnchor="text" w:x="10621" w:y="95"/>
+      <w:framePr w:wrap="none" w:vAnchor="text" w:hAnchor="page" w:x="10621" w:y="95"/>
       <w:rPr>
         <w:rStyle w:val="PageNumber"/>
         <w:rFonts w:ascii="Calibri" w:hAnsi="Calibri"/>
@@ -8488,114 +8358,12 @@
         <w:rFonts w:ascii="Calibri" w:hAnsi="Calibri"/>
       </w:rPr>
     </w:pPr>
-    <w:r>
-      <w:rPr>
-        <w:rFonts w:ascii="Calibri" w:hAnsi="Calibri"/>
-      </w:rPr>
-      <w:t xml:space="preserve">CHEM112 </w:t>
-    </w:r>
-    <w:r>
-      <w:rPr>
-        <w:rFonts w:ascii="Calibri" w:hAnsi="Calibri"/>
-      </w:rPr>
-      <w:t>SP</w:t>
-    </w:r>
-    <w:r>
-      <w:rPr>
-        <w:rFonts w:ascii="Calibri" w:hAnsi="Calibri"/>
-      </w:rPr>
-      <w:t>2</w:t>
-    </w:r>
-    <w:r>
-      <w:rPr>
-        <w:rFonts w:ascii="Calibri" w:hAnsi="Calibri"/>
-      </w:rPr>
-      <w:t>6</w:t>
-    </w:r>
-    <w:r>
-      <w:rPr>
-        <w:rFonts w:ascii="Calibri" w:hAnsi="Calibri"/>
-      </w:rPr>
-      <w:t xml:space="preserve"> Sec</w:t>
-    </w:r>
-    <w:r>
-      <w:rPr>
-        <w:rFonts w:ascii="Calibri" w:hAnsi="Calibri"/>
-      </w:rPr>
-      <w:t>tion</w:t>
-    </w:r>
-    <w:r>
-      <w:rPr>
-        <w:rFonts w:ascii="Calibri" w:hAnsi="Calibri"/>
-      </w:rPr>
-      <w:t xml:space="preserve"> 00</w:t>
-    </w:r>
-    <w:r>
-      <w:rPr>
-        <w:rFonts w:ascii="Calibri" w:hAnsi="Calibri"/>
-      </w:rPr>
-      <w:t>4</w:t>
-    </w:r>
-    <w:r>
-      <w:rPr>
-        <w:rFonts w:ascii="Calibri" w:hAnsi="Calibri"/>
-      </w:rPr>
-      <w:t xml:space="preserve"> </w:t>
-    </w:r>
-    <w:r>
-      <w:rPr>
-        <w:rFonts w:ascii="Calibri" w:hAnsi="Calibri"/>
-      </w:rPr>
-      <w:t>Recitation 015R</w:t>
-    </w:r>
-    <w:r>
-      <w:rPr>
-        <w:rFonts w:ascii="Calibri" w:hAnsi="Calibri"/>
-      </w:rPr>
-      <w:tab/>
-    </w:r>
-    <w:r>
-      <w:rPr>
-        <w:rFonts w:ascii="Calibri" w:hAnsi="Calibri"/>
-      </w:rPr>
-      <w:t xml:space="preserve">                           </w:t>
-    </w:r>
-    <w:r>
-      <w:rPr>
-        <w:rFonts w:ascii="Calibri" w:hAnsi="Calibri"/>
-      </w:rPr>
-      <w:t>Week</w:t>
-    </w:r>
-    <w:r>
-      <w:rPr>
-        <w:rFonts w:ascii="Calibri" w:hAnsi="Calibri"/>
-      </w:rPr>
-      <w:t xml:space="preserve"> </w:t>
-    </w:r>
-    <w:r>
-      <w:rPr>
-        <w:rFonts w:ascii="Calibri" w:hAnsi="Calibri"/>
-      </w:rPr>
-      <w:t>1</w:t>
-    </w:r>
-    <w:r>
-      <w:rPr>
-        <w:rFonts w:ascii="Calibri" w:hAnsi="Calibri"/>
-      </w:rPr>
-      <w:t xml:space="preserve"> Recitation</w:t>
-    </w:r>
-    <w:r>
-      <w:rPr>
-        <w:rFonts w:ascii="Calibri" w:hAnsi="Calibri"/>
-      </w:rPr>
-      <w:tab/>
-    </w:r>
   </w:p>
 </w:ftr>
 </file>
 
 <file path=word/footnotes.xml><?xml version="1.0" encoding="utf-8"?>
-<w:footnotes xmlns:wpc="http://schemas.microsoft.com/office/word/2010/wordprocessingCanvas" xmlns:cx="http://schemas.microsoft.com/office/drawing/2014/chartex" xmlns:cx1="http://schemas.microsoft.com/office/drawing/2015/9/8/chartex" xmlns:cx2="http://schemas.microsoft.com/office/drawing/2015/10/21/chartex" xmlns:cx3="http://schemas.microsoft.com/office/drawing/2016/5/9/chartex" xmlns:cx4="http://schemas.microsoft.com/office/drawing/2016/5/10/chartex" xmlns:cx5="http://schemas.microsoft.com/office/drawing/2016/5/11/chartex" xmlns:cx6="http://schemas.microsoft.com/office/drawing/2016/5/12/chartex" xmlns:cx7="http://schemas.microsoft.com/office/drawing/2016/5/13/chartex" xmlns:cx8="http://schemas.microsoft.com/office/drawing/2016/5/14/chartex" xmlns:mc="http://schemas.openxmlformats.org/markup-compatibility/2006" xmlns:aink="http://schemas.microsoft.com/office/drawing/2016/ink" xmlns:am3d="http://schemas.microsoft.com/office/drawing/2017/model3d" xmlns:o="urn:schemas-microsoft-com:office:office" xmlns:oel="http://schemas.microsoft.com/office/2019/extlst" xmlns:r="http://schemas.openxmlformats.org/officeDocument/2006/relationships" xmlns:m="http://schemas.openxmlformats.org/officeDocument/2006/math" xmlns:v="urn:schemas-microsoft-com:vml" xmlns:wp14="http://schemas.microsoft.com/office/word/2010/wordprocessingDrawing" xmlns:wp="http://schemas.openxmlformats.org/drawingml/2006/wordprocessingDrawing" xmlns:w10="urn:schemas-microsoft-com:office:word" xmlns:w="http://schemas.openxmlformats.org/wordprocessingml/2006/main" xmlns:w14="http://schemas.microsoft.com/office/word/2010/wordml" xmlns:w15="http://schemas.microsoft.com/office/word/2012/wordml" xmlns:w16cex="http://schemas.microsoft.com/office/word/2018/wordml/cex" xmlns:w16cid="http://schemas.microsoft.com/office/word/2016/wordml/cid" xmlns:w16="http://schemas.microsoft.com/office/word/2018/wordml" xmlns:w16du="http://schemas.microsoft.com/office/word/2023/wordml/word16du" xmlns:w16sdtdh="http://schemas.microsoft.com/office/word/2020/wordml/sdtdatahash" xmlns:w16sdtfl="http://schemas.microsoft.com/office/word/2024/wordml/sdtformatlock" xmlns:w16se="http://schemas.microsoft.com/office/word/2015/wordml/symex" xmlns:wpg="http://schemas.microsoft.com/office/word/2010/wordprocessingGroup" xmlns:wpi="http://schemas.microsoft.com/office/word/2010/wordprocessingInk" xmlns:wne="http://schemas.microsoft.com/office/word/2006/wordml" xmlns:wps="http://schemas.microsoft.com/office/word/2010/wordprocessingShape" mc:Ignorable="w14 w15 w16se w16cid w16 w16cex w16sdtdh w16sdtfl w16du wp14">
+<w:footnotes xmlns:wpc="http://schemas.microsoft.com/office/word/2010/wordprocessingCanvas" xmlns:cx="http://schemas.microsoft.com/office/drawing/2014/chartex" xmlns:cx1="http://schemas.microsoft.com/office/drawing/2015/9/8/chartex" xmlns:cx2="http://schemas.microsoft.com/office/drawing/2015/10/21/chartex" xmlns:cx3="http://schemas.microsoft.com/office/drawing/2016/5/9/chartex" xmlns:cx4="http://schemas.microsoft.com/office/drawing/2016/5/10/chartex" xmlns:cx5="http://schemas.microsoft.com/office/drawing/2016/5/11/chartex" xmlns:cx6="http://schemas.microsoft.com/office/drawing/2016/5/12/chartex" xmlns:cx7="http://schemas.microsoft.com/office/drawing/2016/5/13/chartex" xmlns:cx8="http://schemas.microsoft.com/office/drawing/2016/5/14/chartex" xmlns:mc="http://schemas.openxmlformats.org/markup-compatibility/2006" xmlns:m="http://schemas.openxmlformats.org/officeDocument/2006/math" xmlns:aink="http://schemas.microsoft.com/office/drawing/2016/ink" xmlns:am3d="http://schemas.microsoft.com/office/drawing/2017/model3d" xmlns:oel="http://schemas.microsoft.com/office/2019/extlst" xmlns:r="http://schemas.openxmlformats.org/officeDocument/2006/relationships" xmlns:wp14="http://schemas.microsoft.com/office/word/2010/wordprocessingDrawing" xmlns:wp="http://schemas.openxmlformats.org/drawingml/2006/wordprocessingDrawing" xmlns:wpg="http://schemas.microsoft.com/office/word/2010/wordprocessingGroup" xmlns:wpi="http://schemas.microsoft.com/office/word/2010/wordprocessingInk" xmlns:wps="http://schemas.microsoft.com/office/word/2010/wordprocessingShape" xmlns:o="urn:schemas-microsoft-com:office:office" xmlns:v="urn:schemas-microsoft-com:vml" xmlns:w10="urn:schemas-microsoft-com:office:word" xmlns:w="http://schemas.openxmlformats.org/wordprocessingml/2006/main" xmlns:w14="http://schemas.microsoft.com/office/word/2010/wordml" xmlns:w15="http://schemas.microsoft.com/office/word/2012/wordml" xmlns:w16cex="http://schemas.microsoft.com/office/word/2018/wordml/cex" xmlns:w16cid="http://schemas.microsoft.com/office/word/2016/wordml/cid" xmlns:w16="http://schemas.microsoft.com/office/word/2018/wordml" xmlns:w16sdtdh="http://schemas.microsoft.com/office/word/2020/wordml/sdtdatahash" xmlns:w16sdtfl="http://schemas.microsoft.com/office/word/2024/wordml/sdtformatlock" xmlns:w16se="http://schemas.microsoft.com/office/word/2015/wordml/symex" xmlns:w16du="http://schemas.microsoft.com/office/word/2023/wordml/word16du" xmlns:wne="http://schemas.microsoft.com/office/word/2006/wordml" mc:Ignorable="w14 w15 w16se w16cid w16 w16cex w16sdtdh w16sdtfl w16du wp14">
   <w:footnote w:type="separator" w:id="-1">
     <w:p>
       <w:r>
@@ -8614,11 +8382,11 @@
 </file>
 
 <file path=word/header1.xml><?xml version="1.0" encoding="utf-8"?>
-<w:hdr xmlns:wpc="http://schemas.microsoft.com/office/word/2010/wordprocessingCanvas" xmlns:cx="http://schemas.microsoft.com/office/drawing/2014/chartex" xmlns:cx1="http://schemas.microsoft.com/office/drawing/2015/9/8/chartex" xmlns:cx2="http://schemas.microsoft.com/office/drawing/2015/10/21/chartex" xmlns:cx3="http://schemas.microsoft.com/office/drawing/2016/5/9/chartex" xmlns:cx4="http://schemas.microsoft.com/office/drawing/2016/5/10/chartex" xmlns:cx5="http://schemas.microsoft.com/office/drawing/2016/5/11/chartex" xmlns:cx6="http://schemas.microsoft.com/office/drawing/2016/5/12/chartex" xmlns:cx7="http://schemas.microsoft.com/office/drawing/2016/5/13/chartex" xmlns:cx8="http://schemas.microsoft.com/office/drawing/2016/5/14/chartex" xmlns:mc="http://schemas.openxmlformats.org/markup-compatibility/2006" xmlns:aink="http://schemas.microsoft.com/office/drawing/2016/ink" xmlns:am3d="http://schemas.microsoft.com/office/drawing/2017/model3d" xmlns:o="urn:schemas-microsoft-com:office:office" xmlns:oel="http://schemas.microsoft.com/office/2019/extlst" xmlns:r="http://schemas.openxmlformats.org/officeDocument/2006/relationships" xmlns:m="http://schemas.openxmlformats.org/officeDocument/2006/math" xmlns:v="urn:schemas-microsoft-com:vml" xmlns:wp14="http://schemas.microsoft.com/office/word/2010/wordprocessingDrawing" xmlns:wp="http://schemas.openxmlformats.org/drawingml/2006/wordprocessingDrawing" xmlns:w10="urn:schemas-microsoft-com:office:word" xmlns:w="http://schemas.openxmlformats.org/wordprocessingml/2006/main" xmlns:w14="http://schemas.microsoft.com/office/word/2010/wordml" xmlns:w15="http://schemas.microsoft.com/office/word/2012/wordml" xmlns:w16cex="http://schemas.microsoft.com/office/word/2018/wordml/cex" xmlns:w16cid="http://schemas.microsoft.com/office/word/2016/wordml/cid" xmlns:w16="http://schemas.microsoft.com/office/word/2018/wordml" xmlns:w16du="http://schemas.microsoft.com/office/word/2023/wordml/word16du" xmlns:w16sdtdh="http://schemas.microsoft.com/office/word/2020/wordml/sdtdatahash" xmlns:w16sdtfl="http://schemas.microsoft.com/office/word/2024/wordml/sdtformatlock" xmlns:w16se="http://schemas.microsoft.com/office/word/2015/wordml/symex" xmlns:wpg="http://schemas.microsoft.com/office/word/2010/wordprocessingGroup" xmlns:wpi="http://schemas.microsoft.com/office/word/2010/wordprocessingInk" xmlns:wne="http://schemas.microsoft.com/office/word/2006/wordml" xmlns:wps="http://schemas.microsoft.com/office/word/2010/wordprocessingShape" mc:Ignorable="w14 w15 w16se w16cid w16 w16cex w16sdtdh w16sdtfl w16du wp14">
+<w:hdr xmlns:wpc="http://schemas.microsoft.com/office/word/2010/wordprocessingCanvas" xmlns:cx="http://schemas.microsoft.com/office/drawing/2014/chartex" xmlns:cx1="http://schemas.microsoft.com/office/drawing/2015/9/8/chartex" xmlns:cx2="http://schemas.microsoft.com/office/drawing/2015/10/21/chartex" xmlns:cx3="http://schemas.microsoft.com/office/drawing/2016/5/9/chartex" xmlns:cx4="http://schemas.microsoft.com/office/drawing/2016/5/10/chartex" xmlns:cx5="http://schemas.microsoft.com/office/drawing/2016/5/11/chartex" xmlns:cx6="http://schemas.microsoft.com/office/drawing/2016/5/12/chartex" xmlns:cx7="http://schemas.microsoft.com/office/drawing/2016/5/13/chartex" xmlns:cx8="http://schemas.microsoft.com/office/drawing/2016/5/14/chartex" xmlns:mc="http://schemas.openxmlformats.org/markup-compatibility/2006" xmlns:m="http://schemas.openxmlformats.org/officeDocument/2006/math" xmlns:aink="http://schemas.microsoft.com/office/drawing/2016/ink" xmlns:am3d="http://schemas.microsoft.com/office/drawing/2017/model3d" xmlns:oel="http://schemas.microsoft.com/office/2019/extlst" xmlns:r="http://schemas.openxmlformats.org/officeDocument/2006/relationships" xmlns:wp14="http://schemas.microsoft.com/office/word/2010/wordprocessingDrawing" xmlns:wp="http://schemas.openxmlformats.org/drawingml/2006/wordprocessingDrawing" xmlns:wpg="http://schemas.microsoft.com/office/word/2010/wordprocessingGroup" xmlns:wpi="http://schemas.microsoft.com/office/word/2010/wordprocessingInk" xmlns:wps="http://schemas.microsoft.com/office/word/2010/wordprocessingShape" xmlns:o="urn:schemas-microsoft-com:office:office" xmlns:v="urn:schemas-microsoft-com:vml" xmlns:w10="urn:schemas-microsoft-com:office:word" xmlns:w="http://schemas.openxmlformats.org/wordprocessingml/2006/main" xmlns:w14="http://schemas.microsoft.com/office/word/2010/wordml" xmlns:w15="http://schemas.microsoft.com/office/word/2012/wordml" xmlns:w16cex="http://schemas.microsoft.com/office/word/2018/wordml/cex" xmlns:w16cid="http://schemas.microsoft.com/office/word/2016/wordml/cid" xmlns:w16="http://schemas.microsoft.com/office/word/2018/wordml" xmlns:w16sdtdh="http://schemas.microsoft.com/office/word/2020/wordml/sdtdatahash" xmlns:w16sdtfl="http://schemas.microsoft.com/office/word/2024/wordml/sdtformatlock" xmlns:w16se="http://schemas.microsoft.com/office/word/2015/wordml/symex" xmlns:w16du="http://schemas.microsoft.com/office/word/2023/wordml/word16du" xmlns:wne="http://schemas.microsoft.com/office/word/2006/wordml" mc:Ignorable="w14 w15 w16se w16cid w16 w16cex w16sdtdh w16sdtfl w16du wp14">
   <w:p>
     <w:pPr>
       <w:pStyle w:val="Header"/>
-      <w:framePr w:wrap="none" w:hAnchor="margin" w:vAnchor="text" w:xAlign="right" w:y="1"/>
+      <w:framePr w:wrap="none" w:vAnchor="text" w:hAnchor="margin" w:xAlign="right" w:y="1"/>
       <w:rPr>
         <w:rStyle w:val="PageNumber"/>
       </w:rPr>
@@ -8652,7 +8420,7 @@
 </file>
 
 <file path=word/numbering.xml><?xml version="1.0" encoding="utf-8"?>
-<w:numbering xmlns:wpc="http://schemas.microsoft.com/office/word/2010/wordprocessingCanvas" xmlns:cx="http://schemas.microsoft.com/office/drawing/2014/chartex" xmlns:cx1="http://schemas.microsoft.com/office/drawing/2015/9/8/chartex" xmlns:cx2="http://schemas.microsoft.com/office/drawing/2015/10/21/chartex" xmlns:cx3="http://schemas.microsoft.com/office/drawing/2016/5/9/chartex" xmlns:cx4="http://schemas.microsoft.com/office/drawing/2016/5/10/chartex" xmlns:cx5="http://schemas.microsoft.com/office/drawing/2016/5/11/chartex" xmlns:cx6="http://schemas.microsoft.com/office/drawing/2016/5/12/chartex" xmlns:cx7="http://schemas.microsoft.com/office/drawing/2016/5/13/chartex" xmlns:cx8="http://schemas.microsoft.com/office/drawing/2016/5/14/chartex" xmlns:mc="http://schemas.openxmlformats.org/markup-compatibility/2006" xmlns:aink="http://schemas.microsoft.com/office/drawing/2016/ink" xmlns:am3d="http://schemas.microsoft.com/office/drawing/2017/model3d" xmlns:o="urn:schemas-microsoft-com:office:office" xmlns:oel="http://schemas.microsoft.com/office/2019/extlst" xmlns:r="http://schemas.openxmlformats.org/officeDocument/2006/relationships" xmlns:m="http://schemas.openxmlformats.org/officeDocument/2006/math" xmlns:v="urn:schemas-microsoft-com:vml" xmlns:wp14="http://schemas.microsoft.com/office/word/2010/wordprocessingDrawing" xmlns:wp="http://schemas.openxmlformats.org/drawingml/2006/wordprocessingDrawing" xmlns:w10="urn:schemas-microsoft-com:office:word" xmlns:w="http://schemas.openxmlformats.org/wordprocessingml/2006/main" xmlns:w14="http://schemas.microsoft.com/office/word/2010/wordml" xmlns:w15="http://schemas.microsoft.com/office/word/2012/wordml" xmlns:w16cex="http://schemas.microsoft.com/office/word/2018/wordml/cex" xmlns:w16cid="http://schemas.microsoft.com/office/word/2016/wordml/cid" xmlns:w16="http://schemas.microsoft.com/office/word/2018/wordml" xmlns:w16du="http://schemas.microsoft.com/office/word/2023/wordml/word16du" xmlns:w16sdtdh="http://schemas.microsoft.com/office/word/2020/wordml/sdtdatahash" xmlns:w16sdtfl="http://schemas.microsoft.com/office/word/2024/wordml/sdtformatlock" xmlns:w16se="http://schemas.microsoft.com/office/word/2015/wordml/symex" xmlns:wpg="http://schemas.microsoft.com/office/word/2010/wordprocessingGroup" xmlns:wpi="http://schemas.microsoft.com/office/word/2010/wordprocessingInk" xmlns:wne="http://schemas.microsoft.com/office/word/2006/wordml" xmlns:wps="http://schemas.microsoft.com/office/word/2010/wordprocessingShape" mc:Ignorable="w14 w15 w16se w16cid w16 w16cex w16sdtdh w16sdtfl w16du wp14">
+<w:numbering xmlns:wpc="http://schemas.microsoft.com/office/word/2010/wordprocessingCanvas" xmlns:cx="http://schemas.microsoft.com/office/drawing/2014/chartex" xmlns:cx1="http://schemas.microsoft.com/office/drawing/2015/9/8/chartex" xmlns:cx2="http://schemas.microsoft.com/office/drawing/2015/10/21/chartex" xmlns:cx3="http://schemas.microsoft.com/office/drawing/2016/5/9/chartex" xmlns:cx4="http://schemas.microsoft.com/office/drawing/2016/5/10/chartex" xmlns:cx5="http://schemas.microsoft.com/office/drawing/2016/5/11/chartex" xmlns:cx6="http://schemas.microsoft.com/office/drawing/2016/5/12/chartex" xmlns:cx7="http://schemas.microsoft.com/office/drawing/2016/5/13/chartex" xmlns:cx8="http://schemas.microsoft.com/office/drawing/2016/5/14/chartex" xmlns:mc="http://schemas.openxmlformats.org/markup-compatibility/2006" xmlns:m="http://schemas.openxmlformats.org/officeDocument/2006/math" xmlns:aink="http://schemas.microsoft.com/office/drawing/2016/ink" xmlns:am3d="http://schemas.microsoft.com/office/drawing/2017/model3d" xmlns:oel="http://schemas.microsoft.com/office/2019/extlst" xmlns:r="http://schemas.openxmlformats.org/officeDocument/2006/relationships" xmlns:wp14="http://schemas.microsoft.com/office/word/2010/wordprocessingDrawing" xmlns:wp="http://schemas.openxmlformats.org/drawingml/2006/wordprocessingDrawing" xmlns:wpg="http://schemas.microsoft.com/office/word/2010/wordprocessingGroup" xmlns:wpi="http://schemas.microsoft.com/office/word/2010/wordprocessingInk" xmlns:wps="http://schemas.microsoft.com/office/word/2010/wordprocessingShape" xmlns:o="urn:schemas-microsoft-com:office:office" xmlns:v="urn:schemas-microsoft-com:vml" xmlns:w10="urn:schemas-microsoft-com:office:word" xmlns:w="http://schemas.openxmlformats.org/wordprocessingml/2006/main" xmlns:w14="http://schemas.microsoft.com/office/word/2010/wordml" xmlns:w15="http://schemas.microsoft.com/office/word/2012/wordml" xmlns:w16cex="http://schemas.microsoft.com/office/word/2018/wordml/cex" xmlns:w16cid="http://schemas.microsoft.com/office/word/2016/wordml/cid" xmlns:w16="http://schemas.microsoft.com/office/word/2018/wordml" xmlns:w16sdtdh="http://schemas.microsoft.com/office/word/2020/wordml/sdtdatahash" xmlns:w16sdtfl="http://schemas.microsoft.com/office/word/2024/wordml/sdtformatlock" xmlns:w16se="http://schemas.microsoft.com/office/word/2015/wordml/symex" xmlns:w16du="http://schemas.microsoft.com/office/word/2023/wordml/word16du" xmlns:wne="http://schemas.microsoft.com/office/word/2006/wordml" mc:Ignorable="w14 w15 w16se w16cid w16 w16cex w16sdtdh w16sdtfl w16du wp14">
   <w:abstractNum w:abstractNumId="0" w15:restartNumberingAfterBreak="0">
     <w:nsid w:val="00000001"/>
     <w:multiLevelType w:val="hybridMultilevel"/>
@@ -8666,7 +8434,7 @@
         <w:ind w:left="720" w:hanging="360"/>
       </w:pPr>
       <w:rPr>
-        <w:rFonts w:ascii="Arial" w:hAnsi="Arial" w:cs="Arial" w:eastAsiaTheme="minorHAnsi"/>
+        <w:rFonts w:ascii="Arial" w:eastAsiaTheme="minorHAnsi" w:hAnsi="Arial" w:cs="Arial"/>
       </w:rPr>
     </w:lvl>
     <w:lvl w:ilvl="1" w:tplc="FFFFFFFF">
@@ -9099,7 +8867,7 @@
         <w:ind w:left="720" w:hanging="360"/>
       </w:pPr>
       <w:rPr>
-        <w:rFonts w:hint="default" w:ascii="Symbol" w:hAnsi="Symbol"/>
+        <w:rFonts w:ascii="Symbol" w:hAnsi="Symbol" w:hint="default"/>
         <w:sz w:val="20"/>
       </w:rPr>
     </w:lvl>
@@ -9115,7 +8883,7 @@
         <w:ind w:left="1440" w:hanging="360"/>
       </w:pPr>
       <w:rPr>
-        <w:rFonts w:hint="default" w:ascii="Courier New" w:hAnsi="Courier New"/>
+        <w:rFonts w:ascii="Courier New" w:hAnsi="Courier New" w:hint="default"/>
         <w:sz w:val="20"/>
       </w:rPr>
     </w:lvl>
@@ -9131,7 +8899,7 @@
         <w:ind w:left="2160" w:hanging="360"/>
       </w:pPr>
       <w:rPr>
-        <w:rFonts w:hint="default" w:ascii="Wingdings" w:hAnsi="Wingdings"/>
+        <w:rFonts w:ascii="Wingdings" w:hAnsi="Wingdings" w:hint="default"/>
         <w:sz w:val="20"/>
       </w:rPr>
     </w:lvl>
@@ -9147,7 +8915,7 @@
         <w:ind w:left="2880" w:hanging="360"/>
       </w:pPr>
       <w:rPr>
-        <w:rFonts w:hint="default" w:ascii="Wingdings" w:hAnsi="Wingdings"/>
+        <w:rFonts w:ascii="Wingdings" w:hAnsi="Wingdings" w:hint="default"/>
         <w:sz w:val="20"/>
       </w:rPr>
     </w:lvl>
@@ -9163,7 +8931,7 @@
         <w:ind w:left="3600" w:hanging="360"/>
       </w:pPr>
       <w:rPr>
-        <w:rFonts w:hint="default" w:ascii="Wingdings" w:hAnsi="Wingdings"/>
+        <w:rFonts w:ascii="Wingdings" w:hAnsi="Wingdings" w:hint="default"/>
         <w:sz w:val="20"/>
       </w:rPr>
     </w:lvl>
@@ -9179,7 +8947,7 @@
         <w:ind w:left="4320" w:hanging="360"/>
       </w:pPr>
       <w:rPr>
-        <w:rFonts w:hint="default" w:ascii="Wingdings" w:hAnsi="Wingdings"/>
+        <w:rFonts w:ascii="Wingdings" w:hAnsi="Wingdings" w:hint="default"/>
         <w:sz w:val="20"/>
       </w:rPr>
     </w:lvl>
@@ -9195,7 +8963,7 @@
         <w:ind w:left="5040" w:hanging="360"/>
       </w:pPr>
       <w:rPr>
-        <w:rFonts w:hint="default" w:ascii="Wingdings" w:hAnsi="Wingdings"/>
+        <w:rFonts w:ascii="Wingdings" w:hAnsi="Wingdings" w:hint="default"/>
         <w:sz w:val="20"/>
       </w:rPr>
     </w:lvl>
@@ -9211,7 +8979,7 @@
         <w:ind w:left="5760" w:hanging="360"/>
       </w:pPr>
       <w:rPr>
-        <w:rFonts w:hint="default" w:ascii="Wingdings" w:hAnsi="Wingdings"/>
+        <w:rFonts w:ascii="Wingdings" w:hAnsi="Wingdings" w:hint="default"/>
         <w:sz w:val="20"/>
       </w:rPr>
     </w:lvl>
@@ -9227,7 +8995,7 @@
         <w:ind w:left="6480" w:hanging="360"/>
       </w:pPr>
       <w:rPr>
-        <w:rFonts w:hint="default" w:ascii="Wingdings" w:hAnsi="Wingdings"/>
+        <w:rFonts w:ascii="Wingdings" w:hAnsi="Wingdings" w:hint="default"/>
         <w:sz w:val="20"/>
       </w:rPr>
     </w:lvl>
@@ -9362,7 +9130,7 @@
         <w:ind w:left="360" w:hanging="360"/>
       </w:pPr>
       <w:rPr>
-        <w:rFonts w:hint="default" w:ascii="Symbol" w:hAnsi="Symbol"/>
+        <w:rFonts w:ascii="Symbol" w:hAnsi="Symbol" w:hint="default"/>
       </w:rPr>
     </w:lvl>
     <w:lvl w:ilvl="1" w:tplc="04090003" w:tentative="1">
@@ -9374,7 +9142,7 @@
         <w:ind w:left="1080" w:hanging="360"/>
       </w:pPr>
       <w:rPr>
-        <w:rFonts w:hint="default" w:ascii="Courier New" w:hAnsi="Courier New" w:cs="Courier New"/>
+        <w:rFonts w:ascii="Courier New" w:hAnsi="Courier New" w:cs="Courier New" w:hint="default"/>
       </w:rPr>
     </w:lvl>
     <w:lvl w:ilvl="2" w:tplc="04090005" w:tentative="1">
@@ -9386,7 +9154,7 @@
         <w:ind w:left="1800" w:hanging="360"/>
       </w:pPr>
       <w:rPr>
-        <w:rFonts w:hint="default" w:ascii="Wingdings" w:hAnsi="Wingdings"/>
+        <w:rFonts w:ascii="Wingdings" w:hAnsi="Wingdings" w:hint="default"/>
       </w:rPr>
     </w:lvl>
     <w:lvl w:ilvl="3" w:tplc="04090001" w:tentative="1">
@@ -9398,7 +9166,7 @@
         <w:ind w:left="2520" w:hanging="360"/>
       </w:pPr>
       <w:rPr>
-        <w:rFonts w:hint="default" w:ascii="Symbol" w:hAnsi="Symbol"/>
+        <w:rFonts w:ascii="Symbol" w:hAnsi="Symbol" w:hint="default"/>
       </w:rPr>
     </w:lvl>
     <w:lvl w:ilvl="4" w:tplc="04090003" w:tentative="1">
@@ -9410,7 +9178,7 @@
         <w:ind w:left="3240" w:hanging="360"/>
       </w:pPr>
       <w:rPr>
-        <w:rFonts w:hint="default" w:ascii="Courier New" w:hAnsi="Courier New" w:cs="Courier New"/>
+        <w:rFonts w:ascii="Courier New" w:hAnsi="Courier New" w:cs="Courier New" w:hint="default"/>
       </w:rPr>
     </w:lvl>
     <w:lvl w:ilvl="5" w:tplc="04090005" w:tentative="1">
@@ -9422,7 +9190,7 @@
         <w:ind w:left="3960" w:hanging="360"/>
       </w:pPr>
       <w:rPr>
-        <w:rFonts w:hint="default" w:ascii="Wingdings" w:hAnsi="Wingdings"/>
+        <w:rFonts w:ascii="Wingdings" w:hAnsi="Wingdings" w:hint="default"/>
       </w:rPr>
     </w:lvl>
     <w:lvl w:ilvl="6" w:tplc="04090001" w:tentative="1">
@@ -9434,7 +9202,7 @@
         <w:ind w:left="4680" w:hanging="360"/>
       </w:pPr>
       <w:rPr>
-        <w:rFonts w:hint="default" w:ascii="Symbol" w:hAnsi="Symbol"/>
+        <w:rFonts w:ascii="Symbol" w:hAnsi="Symbol" w:hint="default"/>
       </w:rPr>
     </w:lvl>
     <w:lvl w:ilvl="7" w:tplc="04090003" w:tentative="1">
@@ -9446,7 +9214,7 @@
         <w:ind w:left="5400" w:hanging="360"/>
       </w:pPr>
       <w:rPr>
-        <w:rFonts w:hint="default" w:ascii="Courier New" w:hAnsi="Courier New" w:cs="Courier New"/>
+        <w:rFonts w:ascii="Courier New" w:hAnsi="Courier New" w:cs="Courier New" w:hint="default"/>
       </w:rPr>
     </w:lvl>
     <w:lvl w:ilvl="8" w:tplc="04090005" w:tentative="1">
@@ -9458,7 +9226,7 @@
         <w:ind w:left="6120" w:hanging="360"/>
       </w:pPr>
       <w:rPr>
-        <w:rFonts w:hint="default" w:ascii="Wingdings" w:hAnsi="Wingdings"/>
+        <w:rFonts w:ascii="Wingdings" w:hAnsi="Wingdings" w:hint="default"/>
       </w:rPr>
     </w:lvl>
   </w:abstractNum>
@@ -9475,7 +9243,7 @@
         <w:ind w:left="360" w:hanging="360"/>
       </w:pPr>
       <w:rPr>
-        <w:rFonts w:hint="default" w:ascii="Symbol" w:hAnsi="Symbol"/>
+        <w:rFonts w:ascii="Symbol" w:hAnsi="Symbol" w:hint="default"/>
         <w:sz w:val="20"/>
       </w:rPr>
     </w:lvl>
@@ -9504,7 +9272,7 @@
         <w:ind w:left="1800" w:hanging="360"/>
       </w:pPr>
       <w:rPr>
-        <w:rFonts w:hint="default" w:ascii="Wingdings" w:hAnsi="Wingdings"/>
+        <w:rFonts w:ascii="Wingdings" w:hAnsi="Wingdings" w:hint="default"/>
         <w:sz w:val="20"/>
       </w:rPr>
     </w:lvl>
@@ -9520,7 +9288,7 @@
         <w:ind w:left="2520" w:hanging="360"/>
       </w:pPr>
       <w:rPr>
-        <w:rFonts w:hint="default" w:ascii="Wingdings" w:hAnsi="Wingdings"/>
+        <w:rFonts w:ascii="Wingdings" w:hAnsi="Wingdings" w:hint="default"/>
         <w:sz w:val="20"/>
       </w:rPr>
     </w:lvl>
@@ -9536,7 +9304,7 @@
         <w:ind w:left="3240" w:hanging="360"/>
       </w:pPr>
       <w:rPr>
-        <w:rFonts w:hint="default" w:ascii="Wingdings" w:hAnsi="Wingdings"/>
+        <w:rFonts w:ascii="Wingdings" w:hAnsi="Wingdings" w:hint="default"/>
         <w:sz w:val="20"/>
       </w:rPr>
     </w:lvl>
@@ -9552,7 +9320,7 @@
         <w:ind w:left="3960" w:hanging="360"/>
       </w:pPr>
       <w:rPr>
-        <w:rFonts w:hint="default" w:ascii="Wingdings" w:hAnsi="Wingdings"/>
+        <w:rFonts w:ascii="Wingdings" w:hAnsi="Wingdings" w:hint="default"/>
         <w:sz w:val="20"/>
       </w:rPr>
     </w:lvl>
@@ -9568,7 +9336,7 @@
         <w:ind w:left="4680" w:hanging="360"/>
       </w:pPr>
       <w:rPr>
-        <w:rFonts w:hint="default" w:ascii="Wingdings" w:hAnsi="Wingdings"/>
+        <w:rFonts w:ascii="Wingdings" w:hAnsi="Wingdings" w:hint="default"/>
         <w:sz w:val="20"/>
       </w:rPr>
     </w:lvl>
@@ -9584,7 +9352,7 @@
         <w:ind w:left="5400" w:hanging="360"/>
       </w:pPr>
       <w:rPr>
-        <w:rFonts w:hint="default" w:ascii="Wingdings" w:hAnsi="Wingdings"/>
+        <w:rFonts w:ascii="Wingdings" w:hAnsi="Wingdings" w:hint="default"/>
         <w:sz w:val="20"/>
       </w:rPr>
     </w:lvl>
@@ -9600,7 +9368,7 @@
         <w:ind w:left="6120" w:hanging="360"/>
       </w:pPr>
       <w:rPr>
-        <w:rFonts w:hint="default" w:ascii="Wingdings" w:hAnsi="Wingdings"/>
+        <w:rFonts w:ascii="Wingdings" w:hAnsi="Wingdings" w:hint="default"/>
         <w:sz w:val="20"/>
       </w:rPr>
     </w:lvl>
@@ -9621,7 +9389,7 @@
         <w:ind w:left="720" w:hanging="360"/>
       </w:pPr>
       <w:rPr>
-        <w:rFonts w:hint="default" w:ascii="Symbol" w:hAnsi="Symbol"/>
+        <w:rFonts w:ascii="Symbol" w:hAnsi="Symbol" w:hint="default"/>
         <w:sz w:val="20"/>
       </w:rPr>
     </w:lvl>
@@ -9637,7 +9405,7 @@
         <w:ind w:left="1440" w:hanging="360"/>
       </w:pPr>
       <w:rPr>
-        <w:rFonts w:hint="default" w:ascii="Courier New" w:hAnsi="Courier New"/>
+        <w:rFonts w:ascii="Courier New" w:hAnsi="Courier New" w:hint="default"/>
         <w:sz w:val="20"/>
       </w:rPr>
     </w:lvl>
@@ -9653,7 +9421,7 @@
         <w:ind w:left="2160" w:hanging="360"/>
       </w:pPr>
       <w:rPr>
-        <w:rFonts w:hint="default" w:ascii="Wingdings" w:hAnsi="Wingdings"/>
+        <w:rFonts w:ascii="Wingdings" w:hAnsi="Wingdings" w:hint="default"/>
         <w:sz w:val="20"/>
       </w:rPr>
     </w:lvl>
@@ -9669,7 +9437,7 @@
         <w:ind w:left="2880" w:hanging="360"/>
       </w:pPr>
       <w:rPr>
-        <w:rFonts w:hint="default" w:ascii="Wingdings" w:hAnsi="Wingdings"/>
+        <w:rFonts w:ascii="Wingdings" w:hAnsi="Wingdings" w:hint="default"/>
         <w:sz w:val="20"/>
       </w:rPr>
     </w:lvl>
@@ -9685,7 +9453,7 @@
         <w:ind w:left="3600" w:hanging="360"/>
       </w:pPr>
       <w:rPr>
-        <w:rFonts w:hint="default" w:ascii="Wingdings" w:hAnsi="Wingdings"/>
+        <w:rFonts w:ascii="Wingdings" w:hAnsi="Wingdings" w:hint="default"/>
         <w:sz w:val="20"/>
       </w:rPr>
     </w:lvl>
@@ -9701,7 +9469,7 @@
         <w:ind w:left="4320" w:hanging="360"/>
       </w:pPr>
       <w:rPr>
-        <w:rFonts w:hint="default" w:ascii="Wingdings" w:hAnsi="Wingdings"/>
+        <w:rFonts w:ascii="Wingdings" w:hAnsi="Wingdings" w:hint="default"/>
         <w:sz w:val="20"/>
       </w:rPr>
     </w:lvl>
@@ -9717,7 +9485,7 @@
         <w:ind w:left="5040" w:hanging="360"/>
       </w:pPr>
       <w:rPr>
-        <w:rFonts w:hint="default" w:ascii="Wingdings" w:hAnsi="Wingdings"/>
+        <w:rFonts w:ascii="Wingdings" w:hAnsi="Wingdings" w:hint="default"/>
         <w:sz w:val="20"/>
       </w:rPr>
     </w:lvl>
@@ -9733,7 +9501,7 @@
         <w:ind w:left="5760" w:hanging="360"/>
       </w:pPr>
       <w:rPr>
-        <w:rFonts w:hint="default" w:ascii="Wingdings" w:hAnsi="Wingdings"/>
+        <w:rFonts w:ascii="Wingdings" w:hAnsi="Wingdings" w:hint="default"/>
         <w:sz w:val="20"/>
       </w:rPr>
     </w:lvl>
@@ -9749,7 +9517,7 @@
         <w:ind w:left="6480" w:hanging="360"/>
       </w:pPr>
       <w:rPr>
-        <w:rFonts w:hint="default" w:ascii="Wingdings" w:hAnsi="Wingdings"/>
+        <w:rFonts w:ascii="Wingdings" w:hAnsi="Wingdings" w:hint="default"/>
         <w:sz w:val="20"/>
       </w:rPr>
     </w:lvl>
@@ -9770,7 +9538,7 @@
         <w:ind w:left="720" w:hanging="360"/>
       </w:pPr>
       <w:rPr>
-        <w:rFonts w:hint="default" w:ascii="Symbol" w:hAnsi="Symbol"/>
+        <w:rFonts w:ascii="Symbol" w:hAnsi="Symbol" w:hint="default"/>
         <w:sz w:val="20"/>
       </w:rPr>
     </w:lvl>
@@ -9786,7 +9554,7 @@
         <w:ind w:left="1440" w:hanging="360"/>
       </w:pPr>
       <w:rPr>
-        <w:rFonts w:hint="default" w:ascii="Courier New" w:hAnsi="Courier New"/>
+        <w:rFonts w:ascii="Courier New" w:hAnsi="Courier New" w:hint="default"/>
         <w:sz w:val="20"/>
       </w:rPr>
     </w:lvl>
@@ -9802,7 +9570,7 @@
         <w:ind w:left="2160" w:hanging="360"/>
       </w:pPr>
       <w:rPr>
-        <w:rFonts w:hint="default" w:ascii="Wingdings" w:hAnsi="Wingdings"/>
+        <w:rFonts w:ascii="Wingdings" w:hAnsi="Wingdings" w:hint="default"/>
         <w:sz w:val="20"/>
       </w:rPr>
     </w:lvl>
@@ -9818,7 +9586,7 @@
         <w:ind w:left="2880" w:hanging="360"/>
       </w:pPr>
       <w:rPr>
-        <w:rFonts w:hint="default" w:ascii="Wingdings" w:hAnsi="Wingdings"/>
+        <w:rFonts w:ascii="Wingdings" w:hAnsi="Wingdings" w:hint="default"/>
         <w:sz w:val="20"/>
       </w:rPr>
     </w:lvl>
@@ -9834,7 +9602,7 @@
         <w:ind w:left="3600" w:hanging="360"/>
       </w:pPr>
       <w:rPr>
-        <w:rFonts w:hint="default" w:ascii="Wingdings" w:hAnsi="Wingdings"/>
+        <w:rFonts w:ascii="Wingdings" w:hAnsi="Wingdings" w:hint="default"/>
         <w:sz w:val="20"/>
       </w:rPr>
     </w:lvl>
@@ -9850,7 +9618,7 @@
         <w:ind w:left="4320" w:hanging="360"/>
       </w:pPr>
       <w:rPr>
-        <w:rFonts w:hint="default" w:ascii="Wingdings" w:hAnsi="Wingdings"/>
+        <w:rFonts w:ascii="Wingdings" w:hAnsi="Wingdings" w:hint="default"/>
         <w:sz w:val="20"/>
       </w:rPr>
     </w:lvl>
@@ -9866,7 +9634,7 @@
         <w:ind w:left="5040" w:hanging="360"/>
       </w:pPr>
       <w:rPr>
-        <w:rFonts w:hint="default" w:ascii="Wingdings" w:hAnsi="Wingdings"/>
+        <w:rFonts w:ascii="Wingdings" w:hAnsi="Wingdings" w:hint="default"/>
         <w:sz w:val="20"/>
       </w:rPr>
     </w:lvl>
@@ -9882,7 +9650,7 @@
         <w:ind w:left="5760" w:hanging="360"/>
       </w:pPr>
       <w:rPr>
-        <w:rFonts w:hint="default" w:ascii="Wingdings" w:hAnsi="Wingdings"/>
+        <w:rFonts w:ascii="Wingdings" w:hAnsi="Wingdings" w:hint="default"/>
         <w:sz w:val="20"/>
       </w:rPr>
     </w:lvl>
@@ -9898,7 +9666,7 @@
         <w:ind w:left="6480" w:hanging="360"/>
       </w:pPr>
       <w:rPr>
-        <w:rFonts w:hint="default" w:ascii="Wingdings" w:hAnsi="Wingdings"/>
+        <w:rFonts w:ascii="Wingdings" w:hAnsi="Wingdings" w:hint="default"/>
         <w:sz w:val="20"/>
       </w:rPr>
     </w:lvl>
@@ -9932,7 +9700,7 @@
         <w:ind w:left="1080" w:hanging="360"/>
       </w:pPr>
       <w:rPr>
-        <w:rFonts w:hint="default" w:ascii="Courier New" w:hAnsi="Courier New"/>
+        <w:rFonts w:ascii="Courier New" w:hAnsi="Courier New" w:hint="default"/>
         <w:sz w:val="20"/>
       </w:rPr>
     </w:lvl>
@@ -9948,7 +9716,7 @@
         <w:ind w:left="1800" w:hanging="360"/>
       </w:pPr>
       <w:rPr>
-        <w:rFonts w:hint="default" w:ascii="Wingdings" w:hAnsi="Wingdings"/>
+        <w:rFonts w:ascii="Wingdings" w:hAnsi="Wingdings" w:hint="default"/>
         <w:sz w:val="20"/>
       </w:rPr>
     </w:lvl>
@@ -9964,7 +9732,7 @@
         <w:ind w:left="2520" w:hanging="360"/>
       </w:pPr>
       <w:rPr>
-        <w:rFonts w:hint="default" w:ascii="Wingdings" w:hAnsi="Wingdings"/>
+        <w:rFonts w:ascii="Wingdings" w:hAnsi="Wingdings" w:hint="default"/>
         <w:sz w:val="20"/>
       </w:rPr>
     </w:lvl>
@@ -9980,7 +9748,7 @@
         <w:ind w:left="3240" w:hanging="360"/>
       </w:pPr>
       <w:rPr>
-        <w:rFonts w:hint="default" w:ascii="Wingdings" w:hAnsi="Wingdings"/>
+        <w:rFonts w:ascii="Wingdings" w:hAnsi="Wingdings" w:hint="default"/>
         <w:sz w:val="20"/>
       </w:rPr>
     </w:lvl>
@@ -9996,7 +9764,7 @@
         <w:ind w:left="3960" w:hanging="360"/>
       </w:pPr>
       <w:rPr>
-        <w:rFonts w:hint="default" w:ascii="Wingdings" w:hAnsi="Wingdings"/>
+        <w:rFonts w:ascii="Wingdings" w:hAnsi="Wingdings" w:hint="default"/>
         <w:sz w:val="20"/>
       </w:rPr>
     </w:lvl>
@@ -10012,7 +9780,7 @@
         <w:ind w:left="4680" w:hanging="360"/>
       </w:pPr>
       <w:rPr>
-        <w:rFonts w:hint="default" w:ascii="Wingdings" w:hAnsi="Wingdings"/>
+        <w:rFonts w:ascii="Wingdings" w:hAnsi="Wingdings" w:hint="default"/>
         <w:sz w:val="20"/>
       </w:rPr>
     </w:lvl>
@@ -10028,7 +9796,7 @@
         <w:ind w:left="5400" w:hanging="360"/>
       </w:pPr>
       <w:rPr>
-        <w:rFonts w:hint="default" w:ascii="Wingdings" w:hAnsi="Wingdings"/>
+        <w:rFonts w:ascii="Wingdings" w:hAnsi="Wingdings" w:hint="default"/>
         <w:sz w:val="20"/>
       </w:rPr>
     </w:lvl>
@@ -10044,7 +9812,7 @@
         <w:ind w:left="6120" w:hanging="360"/>
       </w:pPr>
       <w:rPr>
-        <w:rFonts w:hint="default" w:ascii="Wingdings" w:hAnsi="Wingdings"/>
+        <w:rFonts w:ascii="Wingdings" w:hAnsi="Wingdings" w:hint="default"/>
         <w:sz w:val="20"/>
       </w:rPr>
     </w:lvl>
@@ -10062,7 +9830,7 @@
         <w:ind w:left="360" w:hanging="360"/>
       </w:pPr>
       <w:rPr>
-        <w:rFonts w:hint="default" w:ascii="Symbol" w:hAnsi="Symbol"/>
+        <w:rFonts w:ascii="Symbol" w:hAnsi="Symbol" w:hint="default"/>
       </w:rPr>
     </w:lvl>
     <w:lvl w:ilvl="1" w:tplc="04090003" w:tentative="1">
@@ -10074,7 +9842,7 @@
         <w:ind w:left="1080" w:hanging="360"/>
       </w:pPr>
       <w:rPr>
-        <w:rFonts w:hint="default" w:ascii="Courier New" w:hAnsi="Courier New" w:cs="Courier New"/>
+        <w:rFonts w:ascii="Courier New" w:hAnsi="Courier New" w:cs="Courier New" w:hint="default"/>
       </w:rPr>
     </w:lvl>
     <w:lvl w:ilvl="2" w:tplc="04090005" w:tentative="1">
@@ -10086,7 +9854,7 @@
         <w:ind w:left="1800" w:hanging="360"/>
       </w:pPr>
       <w:rPr>
-        <w:rFonts w:hint="default" w:ascii="Wingdings" w:hAnsi="Wingdings"/>
+        <w:rFonts w:ascii="Wingdings" w:hAnsi="Wingdings" w:hint="default"/>
       </w:rPr>
     </w:lvl>
     <w:lvl w:ilvl="3" w:tplc="04090001" w:tentative="1">
@@ -10098,7 +9866,7 @@
         <w:ind w:left="2520" w:hanging="360"/>
       </w:pPr>
       <w:rPr>
-        <w:rFonts w:hint="default" w:ascii="Symbol" w:hAnsi="Symbol"/>
+        <w:rFonts w:ascii="Symbol" w:hAnsi="Symbol" w:hint="default"/>
       </w:rPr>
     </w:lvl>
     <w:lvl w:ilvl="4" w:tplc="04090003" w:tentative="1">
@@ -10110,7 +9878,7 @@
         <w:ind w:left="3240" w:hanging="360"/>
       </w:pPr>
       <w:rPr>
-        <w:rFonts w:hint="default" w:ascii="Courier New" w:hAnsi="Courier New" w:cs="Courier New"/>
+        <w:rFonts w:ascii="Courier New" w:hAnsi="Courier New" w:cs="Courier New" w:hint="default"/>
       </w:rPr>
     </w:lvl>
     <w:lvl w:ilvl="5" w:tplc="04090005" w:tentative="1">
@@ -10122,7 +9890,7 @@
         <w:ind w:left="3960" w:hanging="360"/>
       </w:pPr>
       <w:rPr>
-        <w:rFonts w:hint="default" w:ascii="Wingdings" w:hAnsi="Wingdings"/>
+        <w:rFonts w:ascii="Wingdings" w:hAnsi="Wingdings" w:hint="default"/>
       </w:rPr>
     </w:lvl>
     <w:lvl w:ilvl="6" w:tplc="04090001" w:tentative="1">
@@ -10134,7 +9902,7 @@
         <w:ind w:left="4680" w:hanging="360"/>
       </w:pPr>
       <w:rPr>
-        <w:rFonts w:hint="default" w:ascii="Symbol" w:hAnsi="Symbol"/>
+        <w:rFonts w:ascii="Symbol" w:hAnsi="Symbol" w:hint="default"/>
       </w:rPr>
     </w:lvl>
     <w:lvl w:ilvl="7" w:tplc="04090003" w:tentative="1">
@@ -10146,7 +9914,7 @@
         <w:ind w:left="5400" w:hanging="360"/>
       </w:pPr>
       <w:rPr>
-        <w:rFonts w:hint="default" w:ascii="Courier New" w:hAnsi="Courier New" w:cs="Courier New"/>
+        <w:rFonts w:ascii="Courier New" w:hAnsi="Courier New" w:cs="Courier New" w:hint="default"/>
       </w:rPr>
     </w:lvl>
     <w:lvl w:ilvl="8" w:tplc="04090005" w:tentative="1">
@@ -10158,7 +9926,7 @@
         <w:ind w:left="6120" w:hanging="360"/>
       </w:pPr>
       <w:rPr>
-        <w:rFonts w:hint="default" w:ascii="Wingdings" w:hAnsi="Wingdings"/>
+        <w:rFonts w:ascii="Wingdings" w:hAnsi="Wingdings" w:hint="default"/>
       </w:rPr>
     </w:lvl>
   </w:abstractNum>
@@ -10369,7 +10137,7 @@
         <w:ind w:left="1080" w:hanging="360"/>
       </w:pPr>
       <w:rPr>
-        <w:rFonts w:hint="default" w:ascii="Courier New" w:hAnsi="Courier New"/>
+        <w:rFonts w:ascii="Courier New" w:hAnsi="Courier New" w:hint="default"/>
         <w:sz w:val="20"/>
       </w:rPr>
     </w:lvl>
@@ -10385,7 +10153,7 @@
         <w:ind w:left="1800" w:hanging="360"/>
       </w:pPr>
       <w:rPr>
-        <w:rFonts w:hint="default" w:ascii="Wingdings" w:hAnsi="Wingdings"/>
+        <w:rFonts w:ascii="Wingdings" w:hAnsi="Wingdings" w:hint="default"/>
         <w:sz w:val="20"/>
       </w:rPr>
     </w:lvl>
@@ -10401,7 +10169,7 @@
         <w:ind w:left="2520" w:hanging="360"/>
       </w:pPr>
       <w:rPr>
-        <w:rFonts w:hint="default" w:ascii="Wingdings" w:hAnsi="Wingdings"/>
+        <w:rFonts w:ascii="Wingdings" w:hAnsi="Wingdings" w:hint="default"/>
         <w:sz w:val="20"/>
       </w:rPr>
     </w:lvl>
@@ -10417,7 +10185,7 @@
         <w:ind w:left="3240" w:hanging="360"/>
       </w:pPr>
       <w:rPr>
-        <w:rFonts w:hint="default" w:ascii="Wingdings" w:hAnsi="Wingdings"/>
+        <w:rFonts w:ascii="Wingdings" w:hAnsi="Wingdings" w:hint="default"/>
         <w:sz w:val="20"/>
       </w:rPr>
     </w:lvl>
@@ -10433,7 +10201,7 @@
         <w:ind w:left="3960" w:hanging="360"/>
       </w:pPr>
       <w:rPr>
-        <w:rFonts w:hint="default" w:ascii="Wingdings" w:hAnsi="Wingdings"/>
+        <w:rFonts w:ascii="Wingdings" w:hAnsi="Wingdings" w:hint="default"/>
         <w:sz w:val="20"/>
       </w:rPr>
     </w:lvl>
@@ -10449,7 +10217,7 @@
         <w:ind w:left="4680" w:hanging="360"/>
       </w:pPr>
       <w:rPr>
-        <w:rFonts w:hint="default" w:ascii="Wingdings" w:hAnsi="Wingdings"/>
+        <w:rFonts w:ascii="Wingdings" w:hAnsi="Wingdings" w:hint="default"/>
         <w:sz w:val="20"/>
       </w:rPr>
     </w:lvl>
@@ -10465,7 +10233,7 @@
         <w:ind w:left="5400" w:hanging="360"/>
       </w:pPr>
       <w:rPr>
-        <w:rFonts w:hint="default" w:ascii="Wingdings" w:hAnsi="Wingdings"/>
+        <w:rFonts w:ascii="Wingdings" w:hAnsi="Wingdings" w:hint="default"/>
         <w:sz w:val="20"/>
       </w:rPr>
     </w:lvl>
@@ -10481,7 +10249,7 @@
         <w:ind w:left="6120" w:hanging="360"/>
       </w:pPr>
       <w:rPr>
-        <w:rFonts w:hint="default" w:ascii="Wingdings" w:hAnsi="Wingdings"/>
+        <w:rFonts w:ascii="Wingdings" w:hAnsi="Wingdings" w:hint="default"/>
         <w:sz w:val="20"/>
       </w:rPr>
     </w:lvl>
@@ -10588,7 +10356,7 @@
         <w:ind w:left="360" w:hanging="360"/>
       </w:pPr>
       <w:rPr>
-        <w:rFonts w:hint="default" w:ascii="Symbol" w:hAnsi="Symbol"/>
+        <w:rFonts w:ascii="Symbol" w:hAnsi="Symbol" w:hint="default"/>
         <w:sz w:val="20"/>
       </w:rPr>
     </w:lvl>
@@ -10604,7 +10372,7 @@
         <w:ind w:left="1080" w:hanging="360"/>
       </w:pPr>
       <w:rPr>
-        <w:rFonts w:hint="default" w:ascii="Courier New" w:hAnsi="Courier New"/>
+        <w:rFonts w:ascii="Courier New" w:hAnsi="Courier New" w:hint="default"/>
         <w:sz w:val="20"/>
       </w:rPr>
     </w:lvl>
@@ -10620,7 +10388,7 @@
         <w:ind w:left="1800" w:hanging="360"/>
       </w:pPr>
       <w:rPr>
-        <w:rFonts w:hint="default" w:ascii="Wingdings" w:hAnsi="Wingdings"/>
+        <w:rFonts w:ascii="Wingdings" w:hAnsi="Wingdings" w:hint="default"/>
         <w:sz w:val="20"/>
       </w:rPr>
     </w:lvl>
@@ -10636,7 +10404,7 @@
         <w:ind w:left="2520" w:hanging="360"/>
       </w:pPr>
       <w:rPr>
-        <w:rFonts w:hint="default" w:ascii="Wingdings" w:hAnsi="Wingdings"/>
+        <w:rFonts w:ascii="Wingdings" w:hAnsi="Wingdings" w:hint="default"/>
         <w:sz w:val="20"/>
       </w:rPr>
     </w:lvl>
@@ -10652,7 +10420,7 @@
         <w:ind w:left="3240" w:hanging="360"/>
       </w:pPr>
       <w:rPr>
-        <w:rFonts w:hint="default" w:ascii="Wingdings" w:hAnsi="Wingdings"/>
+        <w:rFonts w:ascii="Wingdings" w:hAnsi="Wingdings" w:hint="default"/>
         <w:sz w:val="20"/>
       </w:rPr>
     </w:lvl>
@@ -10668,7 +10436,7 @@
         <w:ind w:left="3960" w:hanging="360"/>
       </w:pPr>
       <w:rPr>
-        <w:rFonts w:hint="default" w:ascii="Wingdings" w:hAnsi="Wingdings"/>
+        <w:rFonts w:ascii="Wingdings" w:hAnsi="Wingdings" w:hint="default"/>
         <w:sz w:val="20"/>
       </w:rPr>
     </w:lvl>
@@ -10684,7 +10452,7 @@
         <w:ind w:left="4680" w:hanging="360"/>
       </w:pPr>
       <w:rPr>
-        <w:rFonts w:hint="default" w:ascii="Wingdings" w:hAnsi="Wingdings"/>
+        <w:rFonts w:ascii="Wingdings" w:hAnsi="Wingdings" w:hint="default"/>
         <w:sz w:val="20"/>
       </w:rPr>
     </w:lvl>
@@ -10700,7 +10468,7 @@
         <w:ind w:left="5400" w:hanging="360"/>
       </w:pPr>
       <w:rPr>
-        <w:rFonts w:hint="default" w:ascii="Wingdings" w:hAnsi="Wingdings"/>
+        <w:rFonts w:ascii="Wingdings" w:hAnsi="Wingdings" w:hint="default"/>
         <w:sz w:val="20"/>
       </w:rPr>
     </w:lvl>
@@ -10716,7 +10484,7 @@
         <w:ind w:left="6120" w:hanging="360"/>
       </w:pPr>
       <w:rPr>
-        <w:rFonts w:hint="default" w:ascii="Wingdings" w:hAnsi="Wingdings"/>
+        <w:rFonts w:ascii="Wingdings" w:hAnsi="Wingdings" w:hint="default"/>
         <w:sz w:val="20"/>
       </w:rPr>
     </w:lvl>
@@ -10734,7 +10502,7 @@
         <w:ind w:left="720" w:hanging="360"/>
       </w:pPr>
       <w:rPr>
-        <w:rFonts w:hint="default" w:ascii="Symbol" w:hAnsi="Symbol"/>
+        <w:rFonts w:ascii="Symbol" w:hAnsi="Symbol" w:hint="default"/>
       </w:rPr>
     </w:lvl>
     <w:lvl w:ilvl="1" w:tplc="04090003" w:tentative="1">
@@ -10746,7 +10514,7 @@
         <w:ind w:left="1440" w:hanging="360"/>
       </w:pPr>
       <w:rPr>
-        <w:rFonts w:hint="default" w:ascii="Courier New" w:hAnsi="Courier New" w:cs="Courier New"/>
+        <w:rFonts w:ascii="Courier New" w:hAnsi="Courier New" w:cs="Courier New" w:hint="default"/>
       </w:rPr>
     </w:lvl>
     <w:lvl w:ilvl="2" w:tplc="04090005" w:tentative="1">
@@ -10758,7 +10526,7 @@
         <w:ind w:left="2160" w:hanging="360"/>
       </w:pPr>
       <w:rPr>
-        <w:rFonts w:hint="default" w:ascii="Wingdings" w:hAnsi="Wingdings"/>
+        <w:rFonts w:ascii="Wingdings" w:hAnsi="Wingdings" w:hint="default"/>
       </w:rPr>
     </w:lvl>
     <w:lvl w:ilvl="3" w:tplc="04090001" w:tentative="1">
@@ -10770,7 +10538,7 @@
         <w:ind w:left="2880" w:hanging="360"/>
       </w:pPr>
       <w:rPr>
-        <w:rFonts w:hint="default" w:ascii="Symbol" w:hAnsi="Symbol"/>
+        <w:rFonts w:ascii="Symbol" w:hAnsi="Symbol" w:hint="default"/>
       </w:rPr>
     </w:lvl>
     <w:lvl w:ilvl="4" w:tplc="04090003" w:tentative="1">
@@ -10782,7 +10550,7 @@
         <w:ind w:left="3600" w:hanging="360"/>
       </w:pPr>
       <w:rPr>
-        <w:rFonts w:hint="default" w:ascii="Courier New" w:hAnsi="Courier New" w:cs="Courier New"/>
+        <w:rFonts w:ascii="Courier New" w:hAnsi="Courier New" w:cs="Courier New" w:hint="default"/>
       </w:rPr>
     </w:lvl>
     <w:lvl w:ilvl="5" w:tplc="04090005" w:tentative="1">
@@ -10794,7 +10562,7 @@
         <w:ind w:left="4320" w:hanging="360"/>
       </w:pPr>
       <w:rPr>
-        <w:rFonts w:hint="default" w:ascii="Wingdings" w:hAnsi="Wingdings"/>
+        <w:rFonts w:ascii="Wingdings" w:hAnsi="Wingdings" w:hint="default"/>
       </w:rPr>
     </w:lvl>
     <w:lvl w:ilvl="6" w:tplc="04090001" w:tentative="1">
@@ -10806,7 +10574,7 @@
         <w:ind w:left="5040" w:hanging="360"/>
       </w:pPr>
       <w:rPr>
-        <w:rFonts w:hint="default" w:ascii="Symbol" w:hAnsi="Symbol"/>
+        <w:rFonts w:ascii="Symbol" w:hAnsi="Symbol" w:hint="default"/>
       </w:rPr>
     </w:lvl>
     <w:lvl w:ilvl="7" w:tplc="04090003" w:tentative="1">
@@ -10818,7 +10586,7 @@
         <w:ind w:left="5760" w:hanging="360"/>
       </w:pPr>
       <w:rPr>
-        <w:rFonts w:hint="default" w:ascii="Courier New" w:hAnsi="Courier New" w:cs="Courier New"/>
+        <w:rFonts w:ascii="Courier New" w:hAnsi="Courier New" w:cs="Courier New" w:hint="default"/>
       </w:rPr>
     </w:lvl>
     <w:lvl w:ilvl="8" w:tplc="04090005" w:tentative="1">
@@ -10830,7 +10598,7 @@
         <w:ind w:left="6480" w:hanging="360"/>
       </w:pPr>
       <w:rPr>
-        <w:rFonts w:hint="default" w:ascii="Wingdings" w:hAnsi="Wingdings"/>
+        <w:rFonts w:ascii="Wingdings" w:hAnsi="Wingdings" w:hint="default"/>
       </w:rPr>
     </w:lvl>
   </w:abstractNum>
@@ -10847,7 +10615,7 @@
         <w:ind w:left="720" w:hanging="360"/>
       </w:pPr>
       <w:rPr>
-        <w:rFonts w:hint="default" w:ascii="Courier New" w:hAnsi="Courier New" w:cs="Courier New"/>
+        <w:rFonts w:ascii="Courier New" w:hAnsi="Courier New" w:cs="Courier New" w:hint="default"/>
         <w:sz w:val="20"/>
       </w:rPr>
     </w:lvl>
@@ -10863,7 +10631,7 @@
         <w:ind w:left="1440" w:hanging="360"/>
       </w:pPr>
       <w:rPr>
-        <w:rFonts w:hint="default" w:ascii="Courier New" w:hAnsi="Courier New"/>
+        <w:rFonts w:ascii="Courier New" w:hAnsi="Courier New" w:hint="default"/>
         <w:sz w:val="20"/>
       </w:rPr>
     </w:lvl>
@@ -10879,7 +10647,7 @@
         <w:ind w:left="2160" w:hanging="360"/>
       </w:pPr>
       <w:rPr>
-        <w:rFonts w:hint="default" w:ascii="Wingdings" w:hAnsi="Wingdings"/>
+        <w:rFonts w:ascii="Wingdings" w:hAnsi="Wingdings" w:hint="default"/>
         <w:sz w:val="20"/>
       </w:rPr>
     </w:lvl>
@@ -10895,7 +10663,7 @@
         <w:ind w:left="2880" w:hanging="360"/>
       </w:pPr>
       <w:rPr>
-        <w:rFonts w:hint="default" w:ascii="Wingdings" w:hAnsi="Wingdings"/>
+        <w:rFonts w:ascii="Wingdings" w:hAnsi="Wingdings" w:hint="default"/>
         <w:sz w:val="20"/>
       </w:rPr>
     </w:lvl>
@@ -10911,7 +10679,7 @@
         <w:ind w:left="3600" w:hanging="360"/>
       </w:pPr>
       <w:rPr>
-        <w:rFonts w:hint="default" w:ascii="Wingdings" w:hAnsi="Wingdings"/>
+        <w:rFonts w:ascii="Wingdings" w:hAnsi="Wingdings" w:hint="default"/>
         <w:sz w:val="20"/>
       </w:rPr>
     </w:lvl>
@@ -10927,7 +10695,7 @@
         <w:ind w:left="4320" w:hanging="360"/>
       </w:pPr>
       <w:rPr>
-        <w:rFonts w:hint="default" w:ascii="Wingdings" w:hAnsi="Wingdings"/>
+        <w:rFonts w:ascii="Wingdings" w:hAnsi="Wingdings" w:hint="default"/>
         <w:sz w:val="20"/>
       </w:rPr>
     </w:lvl>
@@ -10943,7 +10711,7 @@
         <w:ind w:left="5040" w:hanging="360"/>
       </w:pPr>
       <w:rPr>
-        <w:rFonts w:hint="default" w:ascii="Wingdings" w:hAnsi="Wingdings"/>
+        <w:rFonts w:ascii="Wingdings" w:hAnsi="Wingdings" w:hint="default"/>
         <w:sz w:val="20"/>
       </w:rPr>
     </w:lvl>
@@ -10959,7 +10727,7 @@
         <w:ind w:left="5760" w:hanging="360"/>
       </w:pPr>
       <w:rPr>
-        <w:rFonts w:hint="default" w:ascii="Wingdings" w:hAnsi="Wingdings"/>
+        <w:rFonts w:ascii="Wingdings" w:hAnsi="Wingdings" w:hint="default"/>
         <w:sz w:val="20"/>
       </w:rPr>
     </w:lvl>
@@ -10975,7 +10743,7 @@
         <w:ind w:left="6480" w:hanging="360"/>
       </w:pPr>
       <w:rPr>
-        <w:rFonts w:hint="default" w:ascii="Wingdings" w:hAnsi="Wingdings"/>
+        <w:rFonts w:ascii="Wingdings" w:hAnsi="Wingdings" w:hint="default"/>
         <w:sz w:val="20"/>
       </w:rPr>
     </w:lvl>
@@ -11405,7 +11173,7 @@
         <w:ind w:left="720" w:hanging="360"/>
       </w:pPr>
       <w:rPr>
-        <w:rFonts w:hint="default" w:ascii="Courier New" w:hAnsi="Courier New" w:cs="Courier New"/>
+        <w:rFonts w:ascii="Courier New" w:hAnsi="Courier New" w:cs="Courier New" w:hint="default"/>
         <w:sz w:val="20"/>
       </w:rPr>
     </w:lvl>
@@ -11421,7 +11189,7 @@
         <w:ind w:left="1440" w:hanging="360"/>
       </w:pPr>
       <w:rPr>
-        <w:rFonts w:hint="default" w:ascii="Courier New" w:hAnsi="Courier New"/>
+        <w:rFonts w:ascii="Courier New" w:hAnsi="Courier New" w:hint="default"/>
         <w:sz w:val="20"/>
       </w:rPr>
     </w:lvl>
@@ -11437,7 +11205,7 @@
         <w:ind w:left="2160" w:hanging="360"/>
       </w:pPr>
       <w:rPr>
-        <w:rFonts w:hint="default" w:ascii="Wingdings" w:hAnsi="Wingdings"/>
+        <w:rFonts w:ascii="Wingdings" w:hAnsi="Wingdings" w:hint="default"/>
         <w:sz w:val="20"/>
       </w:rPr>
     </w:lvl>
@@ -11453,7 +11221,7 @@
         <w:ind w:left="2880" w:hanging="360"/>
       </w:pPr>
       <w:rPr>
-        <w:rFonts w:hint="default" w:ascii="Wingdings" w:hAnsi="Wingdings"/>
+        <w:rFonts w:ascii="Wingdings" w:hAnsi="Wingdings" w:hint="default"/>
         <w:sz w:val="20"/>
       </w:rPr>
     </w:lvl>
@@ -11469,7 +11237,7 @@
         <w:ind w:left="3600" w:hanging="360"/>
       </w:pPr>
       <w:rPr>
-        <w:rFonts w:hint="default" w:ascii="Wingdings" w:hAnsi="Wingdings"/>
+        <w:rFonts w:ascii="Wingdings" w:hAnsi="Wingdings" w:hint="default"/>
         <w:sz w:val="20"/>
       </w:rPr>
     </w:lvl>
@@ -11485,7 +11253,7 @@
         <w:ind w:left="4320" w:hanging="360"/>
       </w:pPr>
       <w:rPr>
-        <w:rFonts w:hint="default" w:ascii="Wingdings" w:hAnsi="Wingdings"/>
+        <w:rFonts w:ascii="Wingdings" w:hAnsi="Wingdings" w:hint="default"/>
         <w:sz w:val="20"/>
       </w:rPr>
     </w:lvl>
@@ -11501,7 +11269,7 @@
         <w:ind w:left="5040" w:hanging="360"/>
       </w:pPr>
       <w:rPr>
-        <w:rFonts w:hint="default" w:ascii="Wingdings" w:hAnsi="Wingdings"/>
+        <w:rFonts w:ascii="Wingdings" w:hAnsi="Wingdings" w:hint="default"/>
         <w:sz w:val="20"/>
       </w:rPr>
     </w:lvl>
@@ -11517,7 +11285,7 @@
         <w:ind w:left="5760" w:hanging="360"/>
       </w:pPr>
       <w:rPr>
-        <w:rFonts w:hint="default" w:ascii="Wingdings" w:hAnsi="Wingdings"/>
+        <w:rFonts w:ascii="Wingdings" w:hAnsi="Wingdings" w:hint="default"/>
         <w:sz w:val="20"/>
       </w:rPr>
     </w:lvl>
@@ -11533,7 +11301,7 @@
         <w:ind w:left="6480" w:hanging="360"/>
       </w:pPr>
       <w:rPr>
-        <w:rFonts w:hint="default" w:ascii="Wingdings" w:hAnsi="Wingdings"/>
+        <w:rFonts w:ascii="Wingdings" w:hAnsi="Wingdings" w:hint="default"/>
         <w:sz w:val="20"/>
       </w:rPr>
     </w:lvl>
@@ -11554,7 +11322,7 @@
         <w:ind w:left="720" w:hanging="360"/>
       </w:pPr>
       <w:rPr>
-        <w:rFonts w:hint="default" w:ascii="Symbol" w:hAnsi="Symbol"/>
+        <w:rFonts w:ascii="Symbol" w:hAnsi="Symbol" w:hint="default"/>
         <w:sz w:val="20"/>
       </w:rPr>
     </w:lvl>
@@ -11570,7 +11338,7 @@
         <w:ind w:left="1440" w:hanging="360"/>
       </w:pPr>
       <w:rPr>
-        <w:rFonts w:hint="default" w:ascii="Courier New" w:hAnsi="Courier New"/>
+        <w:rFonts w:ascii="Courier New" w:hAnsi="Courier New" w:hint="default"/>
         <w:sz w:val="20"/>
       </w:rPr>
     </w:lvl>
@@ -11586,7 +11354,7 @@
         <w:ind w:left="2160" w:hanging="360"/>
       </w:pPr>
       <w:rPr>
-        <w:rFonts w:hint="default" w:ascii="Wingdings" w:hAnsi="Wingdings"/>
+        <w:rFonts w:ascii="Wingdings" w:hAnsi="Wingdings" w:hint="default"/>
         <w:sz w:val="20"/>
       </w:rPr>
     </w:lvl>
@@ -11602,7 +11370,7 @@
         <w:ind w:left="2880" w:hanging="360"/>
       </w:pPr>
       <w:rPr>
-        <w:rFonts w:hint="default" w:ascii="Wingdings" w:hAnsi="Wingdings"/>
+        <w:rFonts w:ascii="Wingdings" w:hAnsi="Wingdings" w:hint="default"/>
         <w:sz w:val="20"/>
       </w:rPr>
     </w:lvl>
@@ -11618,7 +11386,7 @@
         <w:ind w:left="3600" w:hanging="360"/>
       </w:pPr>
       <w:rPr>
-        <w:rFonts w:hint="default" w:ascii="Wingdings" w:hAnsi="Wingdings"/>
+        <w:rFonts w:ascii="Wingdings" w:hAnsi="Wingdings" w:hint="default"/>
         <w:sz w:val="20"/>
       </w:rPr>
     </w:lvl>
@@ -11634,7 +11402,7 @@
         <w:ind w:left="4320" w:hanging="360"/>
       </w:pPr>
       <w:rPr>
-        <w:rFonts w:hint="default" w:ascii="Wingdings" w:hAnsi="Wingdings"/>
+        <w:rFonts w:ascii="Wingdings" w:hAnsi="Wingdings" w:hint="default"/>
         <w:sz w:val="20"/>
       </w:rPr>
     </w:lvl>
@@ -11650,7 +11418,7 @@
         <w:ind w:left="5040" w:hanging="360"/>
       </w:pPr>
       <w:rPr>
-        <w:rFonts w:hint="default" w:ascii="Wingdings" w:hAnsi="Wingdings"/>
+        <w:rFonts w:ascii="Wingdings" w:hAnsi="Wingdings" w:hint="default"/>
         <w:sz w:val="20"/>
       </w:rPr>
     </w:lvl>
@@ -11666,7 +11434,7 @@
         <w:ind w:left="5760" w:hanging="360"/>
       </w:pPr>
       <w:rPr>
-        <w:rFonts w:hint="default" w:ascii="Wingdings" w:hAnsi="Wingdings"/>
+        <w:rFonts w:ascii="Wingdings" w:hAnsi="Wingdings" w:hint="default"/>
         <w:sz w:val="20"/>
       </w:rPr>
     </w:lvl>
@@ -11682,7 +11450,7 @@
         <w:ind w:left="6480" w:hanging="360"/>
       </w:pPr>
       <w:rPr>
-        <w:rFonts w:hint="default" w:ascii="Wingdings" w:hAnsi="Wingdings"/>
+        <w:rFonts w:ascii="Wingdings" w:hAnsi="Wingdings" w:hint="default"/>
         <w:sz w:val="20"/>
       </w:rPr>
     </w:lvl>
@@ -12235,7 +12003,7 @@
         <w:ind w:left="720" w:hanging="360"/>
       </w:pPr>
       <w:rPr>
-        <w:rFonts w:hint="default" w:ascii="Symbol" w:hAnsi="Symbol"/>
+        <w:rFonts w:ascii="Symbol" w:hAnsi="Symbol" w:hint="default"/>
       </w:rPr>
     </w:lvl>
     <w:lvl w:ilvl="1" w:tplc="04090003" w:tentative="1">
@@ -12247,7 +12015,7 @@
         <w:ind w:left="1440" w:hanging="360"/>
       </w:pPr>
       <w:rPr>
-        <w:rFonts w:hint="default" w:ascii="Courier New" w:hAnsi="Courier New" w:cs="Courier New"/>
+        <w:rFonts w:ascii="Courier New" w:hAnsi="Courier New" w:cs="Courier New" w:hint="default"/>
       </w:rPr>
     </w:lvl>
     <w:lvl w:ilvl="2" w:tplc="04090005" w:tentative="1">
@@ -12259,7 +12027,7 @@
         <w:ind w:left="2160" w:hanging="360"/>
       </w:pPr>
       <w:rPr>
-        <w:rFonts w:hint="default" w:ascii="Wingdings" w:hAnsi="Wingdings"/>
+        <w:rFonts w:ascii="Wingdings" w:hAnsi="Wingdings" w:hint="default"/>
       </w:rPr>
     </w:lvl>
     <w:lvl w:ilvl="3" w:tplc="04090001" w:tentative="1">
@@ -12271,7 +12039,7 @@
         <w:ind w:left="2880" w:hanging="360"/>
       </w:pPr>
       <w:rPr>
-        <w:rFonts w:hint="default" w:ascii="Symbol" w:hAnsi="Symbol"/>
+        <w:rFonts w:ascii="Symbol" w:hAnsi="Symbol" w:hint="default"/>
       </w:rPr>
     </w:lvl>
     <w:lvl w:ilvl="4" w:tplc="04090003" w:tentative="1">
@@ -12283,7 +12051,7 @@
         <w:ind w:left="3600" w:hanging="360"/>
       </w:pPr>
       <w:rPr>
-        <w:rFonts w:hint="default" w:ascii="Courier New" w:hAnsi="Courier New" w:cs="Courier New"/>
+        <w:rFonts w:ascii="Courier New" w:hAnsi="Courier New" w:cs="Courier New" w:hint="default"/>
       </w:rPr>
     </w:lvl>
     <w:lvl w:ilvl="5" w:tplc="04090005" w:tentative="1">
@@ -12295,7 +12063,7 @@
         <w:ind w:left="4320" w:hanging="360"/>
       </w:pPr>
       <w:rPr>
-        <w:rFonts w:hint="default" w:ascii="Wingdings" w:hAnsi="Wingdings"/>
+        <w:rFonts w:ascii="Wingdings" w:hAnsi="Wingdings" w:hint="default"/>
       </w:rPr>
     </w:lvl>
     <w:lvl w:ilvl="6" w:tplc="04090001" w:tentative="1">
@@ -12307,7 +12075,7 @@
         <w:ind w:left="5040" w:hanging="360"/>
       </w:pPr>
       <w:rPr>
-        <w:rFonts w:hint="default" w:ascii="Symbol" w:hAnsi="Symbol"/>
+        <w:rFonts w:ascii="Symbol" w:hAnsi="Symbol" w:hint="default"/>
       </w:rPr>
     </w:lvl>
     <w:lvl w:ilvl="7" w:tplc="04090003" w:tentative="1">
@@ -12319,7 +12087,7 @@
         <w:ind w:left="5760" w:hanging="360"/>
       </w:pPr>
       <w:rPr>
-        <w:rFonts w:hint="default" w:ascii="Courier New" w:hAnsi="Courier New" w:cs="Courier New"/>
+        <w:rFonts w:ascii="Courier New" w:hAnsi="Courier New" w:cs="Courier New" w:hint="default"/>
       </w:rPr>
     </w:lvl>
     <w:lvl w:ilvl="8" w:tplc="04090005" w:tentative="1">
@@ -12331,7 +12099,7 @@
         <w:ind w:left="6480" w:hanging="360"/>
       </w:pPr>
       <w:rPr>
-        <w:rFonts w:hint="default" w:ascii="Wingdings" w:hAnsi="Wingdings"/>
+        <w:rFonts w:ascii="Wingdings" w:hAnsi="Wingdings" w:hint="default"/>
       </w:rPr>
     </w:lvl>
   </w:abstractNum>
@@ -12439,7 +12207,7 @@
         <w:ind w:left="720" w:hanging="360"/>
       </w:pPr>
       <w:rPr>
-        <w:rFonts w:hint="default" w:ascii="Symbol" w:hAnsi="Symbol"/>
+        <w:rFonts w:ascii="Symbol" w:hAnsi="Symbol" w:hint="default"/>
       </w:rPr>
     </w:lvl>
     <w:lvl w:ilvl="1" w:tplc="04090003" w:tentative="1">
@@ -12451,7 +12219,7 @@
         <w:ind w:left="1440" w:hanging="360"/>
       </w:pPr>
       <w:rPr>
-        <w:rFonts w:hint="default" w:ascii="Courier New" w:hAnsi="Courier New" w:cs="Courier New"/>
+        <w:rFonts w:ascii="Courier New" w:hAnsi="Courier New" w:cs="Courier New" w:hint="default"/>
       </w:rPr>
     </w:lvl>
     <w:lvl w:ilvl="2" w:tplc="04090005" w:tentative="1">
@@ -12463,7 +12231,7 @@
         <w:ind w:left="2160" w:hanging="360"/>
       </w:pPr>
       <w:rPr>
-        <w:rFonts w:hint="default" w:ascii="Wingdings" w:hAnsi="Wingdings"/>
+        <w:rFonts w:ascii="Wingdings" w:hAnsi="Wingdings" w:hint="default"/>
       </w:rPr>
     </w:lvl>
     <w:lvl w:ilvl="3" w:tplc="04090001" w:tentative="1">
@@ -12475,7 +12243,7 @@
         <w:ind w:left="2880" w:hanging="360"/>
       </w:pPr>
       <w:rPr>
-        <w:rFonts w:hint="default" w:ascii="Symbol" w:hAnsi="Symbol"/>
+        <w:rFonts w:ascii="Symbol" w:hAnsi="Symbol" w:hint="default"/>
       </w:rPr>
     </w:lvl>
     <w:lvl w:ilvl="4" w:tplc="04090003" w:tentative="1">
@@ -12487,7 +12255,7 @@
         <w:ind w:left="3600" w:hanging="360"/>
       </w:pPr>
       <w:rPr>
-        <w:rFonts w:hint="default" w:ascii="Courier New" w:hAnsi="Courier New" w:cs="Courier New"/>
+        <w:rFonts w:ascii="Courier New" w:hAnsi="Courier New" w:cs="Courier New" w:hint="default"/>
       </w:rPr>
     </w:lvl>
     <w:lvl w:ilvl="5" w:tplc="04090005" w:tentative="1">
@@ -12499,7 +12267,7 @@
         <w:ind w:left="4320" w:hanging="360"/>
       </w:pPr>
       <w:rPr>
-        <w:rFonts w:hint="default" w:ascii="Wingdings" w:hAnsi="Wingdings"/>
+        <w:rFonts w:ascii="Wingdings" w:hAnsi="Wingdings" w:hint="default"/>
       </w:rPr>
     </w:lvl>
     <w:lvl w:ilvl="6" w:tplc="04090001" w:tentative="1">
@@ -12511,7 +12279,7 @@
         <w:ind w:left="5040" w:hanging="360"/>
       </w:pPr>
       <w:rPr>
-        <w:rFonts w:hint="default" w:ascii="Symbol" w:hAnsi="Symbol"/>
+        <w:rFonts w:ascii="Symbol" w:hAnsi="Symbol" w:hint="default"/>
       </w:rPr>
     </w:lvl>
     <w:lvl w:ilvl="7" w:tplc="04090003" w:tentative="1">
@@ -12523,7 +12291,7 @@
         <w:ind w:left="5760" w:hanging="360"/>
       </w:pPr>
       <w:rPr>
-        <w:rFonts w:hint="default" w:ascii="Courier New" w:hAnsi="Courier New" w:cs="Courier New"/>
+        <w:rFonts w:ascii="Courier New" w:hAnsi="Courier New" w:cs="Courier New" w:hint="default"/>
       </w:rPr>
     </w:lvl>
     <w:lvl w:ilvl="8" w:tplc="04090005" w:tentative="1">
@@ -12535,7 +12303,7 @@
         <w:ind w:left="6480" w:hanging="360"/>
       </w:pPr>
       <w:rPr>
-        <w:rFonts w:hint="default" w:ascii="Wingdings" w:hAnsi="Wingdings"/>
+        <w:rFonts w:ascii="Wingdings" w:hAnsi="Wingdings" w:hint="default"/>
       </w:rPr>
     </w:lvl>
   </w:abstractNum>
@@ -12840,7 +12608,7 @@
         <w:ind w:left="720" w:hanging="360"/>
       </w:pPr>
       <w:rPr>
-        <w:rFonts w:hint="default" w:ascii="Symbol" w:hAnsi="Symbol"/>
+        <w:rFonts w:ascii="Symbol" w:hAnsi="Symbol" w:hint="default"/>
       </w:rPr>
     </w:lvl>
     <w:lvl w:ilvl="1" w:tplc="04090003" w:tentative="1">
@@ -12852,7 +12620,7 @@
         <w:ind w:left="1440" w:hanging="360"/>
       </w:pPr>
       <w:rPr>
-        <w:rFonts w:hint="default" w:ascii="Courier New" w:hAnsi="Courier New" w:cs="Courier New"/>
+        <w:rFonts w:ascii="Courier New" w:hAnsi="Courier New" w:cs="Courier New" w:hint="default"/>
       </w:rPr>
     </w:lvl>
     <w:lvl w:ilvl="2" w:tplc="04090005" w:tentative="1">
@@ -12864,7 +12632,7 @@
         <w:ind w:left="2160" w:hanging="360"/>
       </w:pPr>
       <w:rPr>
-        <w:rFonts w:hint="default" w:ascii="Wingdings" w:hAnsi="Wingdings"/>
+        <w:rFonts w:ascii="Wingdings" w:hAnsi="Wingdings" w:hint="default"/>
       </w:rPr>
     </w:lvl>
     <w:lvl w:ilvl="3" w:tplc="04090001" w:tentative="1">
@@ -12876,7 +12644,7 @@
         <w:ind w:left="2880" w:hanging="360"/>
       </w:pPr>
       <w:rPr>
-        <w:rFonts w:hint="default" w:ascii="Symbol" w:hAnsi="Symbol"/>
+        <w:rFonts w:ascii="Symbol" w:hAnsi="Symbol" w:hint="default"/>
       </w:rPr>
     </w:lvl>
     <w:lvl w:ilvl="4" w:tplc="04090003" w:tentative="1">
@@ -12888,7 +12656,7 @@
         <w:ind w:left="3600" w:hanging="360"/>
       </w:pPr>
       <w:rPr>
-        <w:rFonts w:hint="default" w:ascii="Courier New" w:hAnsi="Courier New" w:cs="Courier New"/>
+        <w:rFonts w:ascii="Courier New" w:hAnsi="Courier New" w:cs="Courier New" w:hint="default"/>
       </w:rPr>
     </w:lvl>
     <w:lvl w:ilvl="5" w:tplc="04090005" w:tentative="1">
@@ -12900,7 +12668,7 @@
         <w:ind w:left="4320" w:hanging="360"/>
       </w:pPr>
       <w:rPr>
-        <w:rFonts w:hint="default" w:ascii="Wingdings" w:hAnsi="Wingdings"/>
+        <w:rFonts w:ascii="Wingdings" w:hAnsi="Wingdings" w:hint="default"/>
       </w:rPr>
     </w:lvl>
     <w:lvl w:ilvl="6" w:tplc="04090001" w:tentative="1">
@@ -12912,7 +12680,7 @@
         <w:ind w:left="5040" w:hanging="360"/>
       </w:pPr>
       <w:rPr>
-        <w:rFonts w:hint="default" w:ascii="Symbol" w:hAnsi="Symbol"/>
+        <w:rFonts w:ascii="Symbol" w:hAnsi="Symbol" w:hint="default"/>
       </w:rPr>
     </w:lvl>
     <w:lvl w:ilvl="7" w:tplc="04090003" w:tentative="1">
@@ -12924,7 +12692,7 @@
         <w:ind w:left="5760" w:hanging="360"/>
       </w:pPr>
       <w:rPr>
-        <w:rFonts w:hint="default" w:ascii="Courier New" w:hAnsi="Courier New" w:cs="Courier New"/>
+        <w:rFonts w:ascii="Courier New" w:hAnsi="Courier New" w:cs="Courier New" w:hint="default"/>
       </w:rPr>
     </w:lvl>
     <w:lvl w:ilvl="8" w:tplc="04090005" w:tentative="1">
@@ -12936,7 +12704,7 @@
         <w:ind w:left="6480" w:hanging="360"/>
       </w:pPr>
       <w:rPr>
-        <w:rFonts w:hint="default" w:ascii="Wingdings" w:hAnsi="Wingdings"/>
+        <w:rFonts w:ascii="Wingdings" w:hAnsi="Wingdings" w:hint="default"/>
       </w:rPr>
     </w:lvl>
   </w:abstractNum>
@@ -13150,11 +12918,11 @@
 </file>
 
 <file path=word/styles.xml><?xml version="1.0" encoding="utf-8"?>
-<w:styles xmlns:wp14="http://schemas.microsoft.com/office/word/2010/wordprocessingDrawing" xmlns:mc="http://schemas.openxmlformats.org/markup-compatibility/2006" xmlns:r="http://schemas.openxmlformats.org/officeDocument/2006/relationships" xmlns:w="http://schemas.openxmlformats.org/wordprocessingml/2006/main" xmlns:w14="http://schemas.microsoft.com/office/word/2010/wordml" xmlns:w15="http://schemas.microsoft.com/office/word/2012/wordml" xmlns:w16cex="http://schemas.microsoft.com/office/word/2018/wordml/cex" xmlns:w16cid="http://schemas.microsoft.com/office/word/2016/wordml/cid" xmlns:w16="http://schemas.microsoft.com/office/word/2018/wordml" xmlns:w16du="http://schemas.microsoft.com/office/word/2023/wordml/word16du" xmlns:w16sdtdh="http://schemas.microsoft.com/office/word/2020/wordml/sdtdatahash" xmlns:w16sdtfl="http://schemas.microsoft.com/office/word/2024/wordml/sdtformatlock" xmlns:w16se="http://schemas.microsoft.com/office/word/2015/wordml/symex" mc:Ignorable="w14 w15 w16se w16cid w16 w16cex w16sdtdh w16sdtfl w16du wp14">
+<w:styles xmlns:mc="http://schemas.openxmlformats.org/markup-compatibility/2006" xmlns:r="http://schemas.openxmlformats.org/officeDocument/2006/relationships" xmlns:w="http://schemas.openxmlformats.org/wordprocessingml/2006/main" xmlns:w14="http://schemas.microsoft.com/office/word/2010/wordml" xmlns:w15="http://schemas.microsoft.com/office/word/2012/wordml" xmlns:w16cex="http://schemas.microsoft.com/office/word/2018/wordml/cex" xmlns:w16cid="http://schemas.microsoft.com/office/word/2016/wordml/cid" xmlns:w16="http://schemas.microsoft.com/office/word/2018/wordml" xmlns:w16sdtdh="http://schemas.microsoft.com/office/word/2020/wordml/sdtdatahash" xmlns:w16sdtfl="http://schemas.microsoft.com/office/word/2024/wordml/sdtformatlock" xmlns:w16se="http://schemas.microsoft.com/office/word/2015/wordml/symex" xmlns:w16du="http://schemas.microsoft.com/office/word/2023/wordml/word16du" mc:Ignorable="w14 w15 w16se w16cid w16 w16cex w16sdtdh w16sdtfl w16du">
   <w:docDefaults>
     <w:rPrDefault>
       <w:rPr>
-        <w:rFonts w:asciiTheme="minorHAnsi" w:hAnsiTheme="minorHAnsi" w:eastAsiaTheme="minorHAnsi" w:cstheme="minorBidi"/>
+        <w:rFonts w:asciiTheme="minorHAnsi" w:eastAsiaTheme="minorHAnsi" w:hAnsiTheme="minorHAnsi" w:cstheme="minorBidi"/>
         <w:sz w:val="24"/>
         <w:szCs w:val="24"/>
         <w:lang w:val="en-US" w:eastAsia="en-US" w:bidi="ar-SA"/>
@@ -13165,14 +12933,14 @@
   <w:latentStyles w:defLockedState="0" w:defUIPriority="99" w:defSemiHidden="0" w:defUnhideWhenUsed="0" w:defQFormat="0" w:count="376">
     <w:lsdException w:name="Normal" w:uiPriority="0" w:qFormat="1"/>
     <w:lsdException w:name="heading 1" w:uiPriority="9" w:qFormat="1"/>
-    <w:lsdException w:name="heading 2" w:uiPriority="9" w:semiHidden="1" w:unhideWhenUsed="1" w:qFormat="1"/>
-    <w:lsdException w:name="heading 3" w:uiPriority="9" w:semiHidden="1" w:unhideWhenUsed="1" w:qFormat="1"/>
-    <w:lsdException w:name="heading 4" w:uiPriority="9" w:semiHidden="1" w:unhideWhenUsed="1" w:qFormat="1"/>
-    <w:lsdException w:name="heading 5" w:uiPriority="9" w:semiHidden="1" w:unhideWhenUsed="1" w:qFormat="1"/>
-    <w:lsdException w:name="heading 6" w:uiPriority="9" w:semiHidden="1" w:unhideWhenUsed="1" w:qFormat="1"/>
-    <w:lsdException w:name="heading 7" w:uiPriority="9" w:semiHidden="1" w:unhideWhenUsed="1" w:qFormat="1"/>
-    <w:lsdException w:name="heading 8" w:uiPriority="9" w:semiHidden="1" w:unhideWhenUsed="1" w:qFormat="1"/>
-    <w:lsdException w:name="heading 9" w:uiPriority="9" w:semiHidden="1" w:unhideWhenUsed="1" w:qFormat="1"/>
+    <w:lsdException w:name="heading 2" w:semiHidden="1" w:uiPriority="9" w:unhideWhenUsed="1" w:qFormat="1"/>
+    <w:lsdException w:name="heading 3" w:semiHidden="1" w:uiPriority="9" w:unhideWhenUsed="1" w:qFormat="1"/>
+    <w:lsdException w:name="heading 4" w:semiHidden="1" w:uiPriority="9" w:unhideWhenUsed="1" w:qFormat="1"/>
+    <w:lsdException w:name="heading 5" w:semiHidden="1" w:uiPriority="9" w:unhideWhenUsed="1" w:qFormat="1"/>
+    <w:lsdException w:name="heading 6" w:semiHidden="1" w:uiPriority="9" w:unhideWhenUsed="1" w:qFormat="1"/>
+    <w:lsdException w:name="heading 7" w:semiHidden="1" w:uiPriority="9" w:unhideWhenUsed="1" w:qFormat="1"/>
+    <w:lsdException w:name="heading 8" w:semiHidden="1" w:uiPriority="9" w:unhideWhenUsed="1" w:qFormat="1"/>
+    <w:lsdException w:name="heading 9" w:semiHidden="1" w:uiPriority="9" w:unhideWhenUsed="1" w:qFormat="1"/>
     <w:lsdException w:name="index 1" w:semiHidden="1" w:unhideWhenUsed="1"/>
     <w:lsdException w:name="index 2" w:semiHidden="1" w:unhideWhenUsed="1"/>
     <w:lsdException w:name="index 3" w:semiHidden="1" w:unhideWhenUsed="1"/>
@@ -13182,29 +12950,29 @@
     <w:lsdException w:name="index 7" w:semiHidden="1" w:unhideWhenUsed="1"/>
     <w:lsdException w:name="index 8" w:semiHidden="1" w:unhideWhenUsed="1"/>
     <w:lsdException w:name="index 9" w:semiHidden="1" w:unhideWhenUsed="1"/>
-    <w:lsdException w:name="toc 1" w:uiPriority="39" w:semiHidden="1" w:unhideWhenUsed="1"/>
-    <w:lsdException w:name="toc 2" w:uiPriority="39" w:semiHidden="1" w:unhideWhenUsed="1"/>
-    <w:lsdException w:name="toc 3" w:uiPriority="39" w:semiHidden="1" w:unhideWhenUsed="1"/>
-    <w:lsdException w:name="toc 4" w:uiPriority="39" w:semiHidden="1" w:unhideWhenUsed="1"/>
-    <w:lsdException w:name="toc 5" w:uiPriority="39" w:semiHidden="1" w:unhideWhenUsed="1"/>
-    <w:lsdException w:name="toc 6" w:uiPriority="39" w:semiHidden="1" w:unhideWhenUsed="1"/>
-    <w:lsdException w:name="toc 7" w:uiPriority="39" w:semiHidden="1" w:unhideWhenUsed="1"/>
-    <w:lsdException w:name="toc 8" w:uiPriority="39" w:semiHidden="1" w:unhideWhenUsed="1"/>
-    <w:lsdException w:name="toc 9" w:uiPriority="39" w:semiHidden="1" w:unhideWhenUsed="1"/>
+    <w:lsdException w:name="toc 1" w:semiHidden="1" w:uiPriority="39" w:unhideWhenUsed="1"/>
+    <w:lsdException w:name="toc 2" w:semiHidden="1" w:uiPriority="39" w:unhideWhenUsed="1"/>
+    <w:lsdException w:name="toc 3" w:semiHidden="1" w:uiPriority="39" w:unhideWhenUsed="1"/>
+    <w:lsdException w:name="toc 4" w:semiHidden="1" w:uiPriority="39" w:unhideWhenUsed="1"/>
+    <w:lsdException w:name="toc 5" w:semiHidden="1" w:uiPriority="39" w:unhideWhenUsed="1"/>
+    <w:lsdException w:name="toc 6" w:semiHidden="1" w:uiPriority="39" w:unhideWhenUsed="1"/>
+    <w:lsdException w:name="toc 7" w:semiHidden="1" w:uiPriority="39" w:unhideWhenUsed="1"/>
+    <w:lsdException w:name="toc 8" w:semiHidden="1" w:uiPriority="39" w:unhideWhenUsed="1"/>
+    <w:lsdException w:name="toc 9" w:semiHidden="1" w:uiPriority="39" w:unhideWhenUsed="1"/>
     <w:lsdException w:name="Normal Indent" w:semiHidden="1" w:unhideWhenUsed="1"/>
     <w:lsdException w:name="footnote text" w:semiHidden="1" w:unhideWhenUsed="1"/>
     <w:lsdException w:name="annotation text" w:semiHidden="1" w:unhideWhenUsed="1"/>
     <w:lsdException w:name="header" w:semiHidden="1" w:unhideWhenUsed="1"/>
     <w:lsdException w:name="footer" w:semiHidden="1" w:unhideWhenUsed="1"/>
     <w:lsdException w:name="index heading" w:semiHidden="1" w:unhideWhenUsed="1"/>
-    <w:lsdException w:name="caption" w:uiPriority="35" w:semiHidden="1" w:unhideWhenUsed="1" w:qFormat="1"/>
+    <w:lsdException w:name="caption" w:semiHidden="1" w:uiPriority="35" w:unhideWhenUsed="1" w:qFormat="1"/>
     <w:lsdException w:name="table of figures" w:semiHidden="1" w:unhideWhenUsed="1"/>
     <w:lsdException w:name="envelope address" w:semiHidden="1" w:unhideWhenUsed="1"/>
     <w:lsdException w:name="envelope return" w:semiHidden="1" w:unhideWhenUsed="1"/>
     <w:lsdException w:name="footnote reference" w:semiHidden="1" w:unhideWhenUsed="1"/>
     <w:lsdException w:name="annotation reference" w:semiHidden="1" w:unhideWhenUsed="1"/>
     <w:lsdException w:name="line number" w:semiHidden="1" w:unhideWhenUsed="1"/>
-    <w:lsdException w:name="page number" w:uiPriority="0" w:semiHidden="1" w:unhideWhenUsed="1"/>
+    <w:lsdException w:name="page number" w:semiHidden="1" w:uiPriority="0" w:unhideWhenUsed="1"/>
     <w:lsdException w:name="endnote reference" w:semiHidden="1" w:unhideWhenUsed="1"/>
     <w:lsdException w:name="endnote text" w:semiHidden="1" w:unhideWhenUsed="1"/>
     <w:lsdException w:name="table of authorities" w:semiHidden="1" w:unhideWhenUsed="1"/>
@@ -13228,7 +12996,7 @@
     <w:lsdException w:name="Title" w:uiPriority="10" w:qFormat="1"/>
     <w:lsdException w:name="Closing" w:semiHidden="1" w:unhideWhenUsed="1"/>
     <w:lsdException w:name="Signature" w:semiHidden="1" w:unhideWhenUsed="1"/>
-    <w:lsdException w:name="Default Paragraph Font" w:uiPriority="1" w:semiHidden="1" w:unhideWhenUsed="1"/>
+    <w:lsdException w:name="Default Paragraph Font" w:semiHidden="1" w:uiPriority="1" w:unhideWhenUsed="1"/>
     <w:lsdException w:name="Body Text" w:semiHidden="1" w:unhideWhenUsed="1"/>
     <w:lsdException w:name="Body Text Indent" w:semiHidden="1" w:unhideWhenUsed="1"/>
     <w:lsdException w:name="List Continue" w:semiHidden="1" w:unhideWhenUsed="1"/>
@@ -13428,8 +13196,8 @@
     <w:lsdException w:name="Subtle Reference" w:uiPriority="31" w:qFormat="1"/>
     <w:lsdException w:name="Intense Reference" w:uiPriority="32" w:qFormat="1"/>
     <w:lsdException w:name="Book Title" w:uiPriority="33" w:qFormat="1"/>
-    <w:lsdException w:name="Bibliography" w:uiPriority="37" w:semiHidden="1" w:unhideWhenUsed="1"/>
-    <w:lsdException w:name="TOC Heading" w:uiPriority="39" w:semiHidden="1" w:unhideWhenUsed="1" w:qFormat="1"/>
+    <w:lsdException w:name="Bibliography" w:semiHidden="1" w:uiPriority="37" w:unhideWhenUsed="1"/>
+    <w:lsdException w:name="TOC Heading" w:semiHidden="1" w:uiPriority="39" w:unhideWhenUsed="1" w:qFormat="1"/>
     <w:lsdException w:name="Grid Table 4" w:uiPriority="49"/>
     <w:lsdException w:name="Grid Table 5 Dark" w:uiPriority="50"/>
     <w:lsdException w:name="Grid Table 6 Colorful" w:uiPriority="51"/>
@@ -13531,12 +13299,12 @@
     <w:lsdException w:name="Unresolved Mention" w:semiHidden="1" w:unhideWhenUsed="1"/>
     <w:lsdException w:name="Smart Link" w:semiHidden="1" w:unhideWhenUsed="1"/>
   </w:latentStyles>
-  <w:style w:type="paragraph" w:styleId="Normal" w:default="1">
+  <w:style w:type="paragraph" w:default="1" w:styleId="Normal">
     <w:name w:val="Normal"/>
     <w:qFormat/>
     <w:rsid w:val="00765CD4"/>
     <w:rPr>
-      <w:rFonts w:ascii="Times New Roman" w:hAnsi="Times New Roman" w:eastAsia="Times New Roman" w:cs="Times New Roman"/>
+      <w:rFonts w:ascii="Times New Roman" w:eastAsia="Times New Roman" w:hAnsi="Times New Roman" w:cs="Times New Roman"/>
       <w:lang w:eastAsia="zh-CN"/>
     </w:rPr>
   </w:style>
@@ -13575,7 +13343,7 @@
       <w:outlineLvl w:val="1"/>
     </w:pPr>
     <w:rPr>
-      <w:rFonts w:asciiTheme="majorHAnsi" w:hAnsiTheme="majorHAnsi" w:eastAsiaTheme="majorEastAsia" w:cstheme="majorBidi"/>
+      <w:rFonts w:asciiTheme="majorHAnsi" w:eastAsiaTheme="majorEastAsia" w:hAnsiTheme="majorHAnsi" w:cstheme="majorBidi"/>
       <w:color w:val="2E74B5" w:themeColor="accent1" w:themeShade="BF"/>
       <w:sz w:val="26"/>
       <w:szCs w:val="26"/>
@@ -13599,13 +13367,13 @@
       <w:szCs w:val="27"/>
     </w:rPr>
   </w:style>
-  <w:style w:type="character" w:styleId="DefaultParagraphFont" w:default="1">
+  <w:style w:type="character" w:default="1" w:styleId="DefaultParagraphFont">
     <w:name w:val="Default Paragraph Font"/>
     <w:uiPriority w:val="1"/>
     <w:semiHidden/>
     <w:unhideWhenUsed/>
   </w:style>
-  <w:style w:type="table" w:styleId="TableNormal" w:default="1">
+  <w:style w:type="table" w:default="1" w:styleId="TableNormal">
     <w:name w:val="Normal Table"/>
     <w:uiPriority w:val="99"/>
     <w:semiHidden/>
@@ -13620,7 +13388,7 @@
       </w:tblCellMar>
     </w:tblPr>
   </w:style>
-  <w:style w:type="numbering" w:styleId="NoList" w:default="1">
+  <w:style w:type="numbering" w:default="1" w:styleId="NoList">
     <w:name w:val="No List"/>
     <w:uiPriority w:val="99"/>
     <w:semiHidden/>
@@ -13638,7 +13406,7 @@
       <w:contextualSpacing/>
     </w:pPr>
     <w:rPr>
-      <w:rFonts w:ascii="Arial" w:hAnsi="Arial" w:eastAsia="Arial" w:cs="Arial"/>
+      <w:rFonts w:ascii="Arial" w:eastAsia="Arial" w:hAnsi="Arial" w:cs="Arial"/>
       <w:color w:val="000000"/>
       <w:sz w:val="22"/>
       <w:szCs w:val="22"/>
@@ -13659,21 +13427,21 @@
       </w:tabs>
     </w:pPr>
     <w:rPr>
-      <w:rFonts w:ascii="Arial" w:hAnsi="Arial" w:eastAsia="Arial" w:cs="Arial"/>
+      <w:rFonts w:ascii="Arial" w:eastAsia="Arial" w:hAnsi="Arial" w:cs="Arial"/>
       <w:color w:val="000000"/>
       <w:sz w:val="22"/>
       <w:szCs w:val="22"/>
       <w:lang w:eastAsia="en-US"/>
     </w:rPr>
   </w:style>
-  <w:style w:type="character" w:styleId="HeaderChar" w:customStyle="1">
+  <w:style w:type="character" w:customStyle="1" w:styleId="HeaderChar">
     <w:name w:val="Header Char"/>
     <w:basedOn w:val="DefaultParagraphFont"/>
     <w:link w:val="Header"/>
     <w:uiPriority w:val="99"/>
     <w:rsid w:val="00BB438C"/>
     <w:rPr>
-      <w:rFonts w:ascii="Arial" w:hAnsi="Arial" w:eastAsia="Arial" w:cs="Arial"/>
+      <w:rFonts w:ascii="Arial" w:eastAsia="Arial" w:hAnsi="Arial" w:cs="Arial"/>
       <w:color w:val="000000"/>
       <w:sz w:val="22"/>
       <w:szCs w:val="22"/>
@@ -13693,27 +13461,27 @@
       </w:tabs>
     </w:pPr>
     <w:rPr>
-      <w:rFonts w:ascii="Arial" w:hAnsi="Arial" w:eastAsia="Arial" w:cs="Arial"/>
+      <w:rFonts w:ascii="Arial" w:eastAsia="Arial" w:hAnsi="Arial" w:cs="Arial"/>
       <w:color w:val="000000"/>
       <w:sz w:val="22"/>
       <w:szCs w:val="22"/>
       <w:lang w:eastAsia="en-US"/>
     </w:rPr>
   </w:style>
-  <w:style w:type="character" w:styleId="FooterChar" w:customStyle="1">
+  <w:style w:type="character" w:customStyle="1" w:styleId="FooterChar">
     <w:name w:val="Footer Char"/>
     <w:basedOn w:val="DefaultParagraphFont"/>
     <w:link w:val="Footer"/>
     <w:uiPriority w:val="99"/>
     <w:rsid w:val="00BB438C"/>
     <w:rPr>
-      <w:rFonts w:ascii="Arial" w:hAnsi="Arial" w:eastAsia="Arial" w:cs="Arial"/>
+      <w:rFonts w:ascii="Arial" w:eastAsia="Arial" w:hAnsi="Arial" w:cs="Arial"/>
       <w:color w:val="000000"/>
       <w:sz w:val="22"/>
       <w:szCs w:val="22"/>
     </w:rPr>
   </w:style>
-  <w:style w:type="paragraph" w:styleId="midg" w:customStyle="1">
+  <w:style w:type="paragraph" w:customStyle="1" w:styleId="midg">
     <w:name w:val="midg"/>
     <w:basedOn w:val="Normal"/>
     <w:rsid w:val="004334AB"/>
@@ -13729,7 +13497,7 @@
     <w:basedOn w:val="DefaultParagraphFont"/>
     <w:rsid w:val="004334AB"/>
   </w:style>
-  <w:style w:type="paragraph" w:styleId="reg" w:customStyle="1">
+  <w:style w:type="paragraph" w:customStyle="1" w:styleId="reg">
     <w:name w:val="reg"/>
     <w:basedOn w:val="Normal"/>
     <w:rsid w:val="004334AB"/>
@@ -13749,14 +13517,14 @@
     <w:unhideWhenUsed/>
     <w:rsid w:val="00444100"/>
     <w:rPr>
-      <w:rFonts w:ascii="Lucida Grande" w:hAnsi="Lucida Grande" w:eastAsia="Arial" w:cs="Lucida Grande"/>
+      <w:rFonts w:ascii="Lucida Grande" w:eastAsia="Arial" w:hAnsi="Lucida Grande" w:cs="Lucida Grande"/>
       <w:color w:val="000000"/>
       <w:sz w:val="18"/>
       <w:szCs w:val="18"/>
       <w:lang w:eastAsia="en-US"/>
     </w:rPr>
   </w:style>
-  <w:style w:type="character" w:styleId="BalloonTextChar" w:customStyle="1">
+  <w:style w:type="character" w:customStyle="1" w:styleId="BalloonTextChar">
     <w:name w:val="Balloon Text Char"/>
     <w:basedOn w:val="DefaultParagraphFont"/>
     <w:link w:val="BalloonText"/>
@@ -13764,20 +13532,20 @@
     <w:semiHidden/>
     <w:rsid w:val="00444100"/>
     <w:rPr>
-      <w:rFonts w:ascii="Lucida Grande" w:hAnsi="Lucida Grande" w:eastAsia="Arial" w:cs="Lucida Grande"/>
+      <w:rFonts w:ascii="Lucida Grande" w:eastAsia="Arial" w:hAnsi="Lucida Grande" w:cs="Lucida Grande"/>
       <w:color w:val="000000"/>
       <w:sz w:val="18"/>
       <w:szCs w:val="18"/>
     </w:rPr>
   </w:style>
-  <w:style w:type="paragraph" w:styleId="Normal1" w:customStyle="1">
+  <w:style w:type="paragraph" w:customStyle="1" w:styleId="Normal1">
     <w:name w:val="Normal1"/>
     <w:rsid w:val="00906C88"/>
     <w:pPr>
       <w:spacing w:line="276" w:lineRule="auto"/>
     </w:pPr>
     <w:rPr>
-      <w:rFonts w:ascii="Arial" w:hAnsi="Arial" w:eastAsia="Arial" w:cs="Arial"/>
+      <w:rFonts w:ascii="Arial" w:eastAsia="Arial" w:hAnsi="Arial" w:cs="Arial"/>
       <w:color w:val="000000"/>
       <w:sz w:val="22"/>
       <w:szCs w:val="22"/>
@@ -13790,12 +13558,12 @@
     <w:rsid w:val="00845556"/>
     <w:tblPr>
       <w:tblBorders>
-        <w:top w:val="single" w:color="auto" w:sz="4" w:space="0"/>
-        <w:left w:val="single" w:color="auto" w:sz="4" w:space="0"/>
-        <w:bottom w:val="single" w:color="auto" w:sz="4" w:space="0"/>
-        <w:right w:val="single" w:color="auto" w:sz="4" w:space="0"/>
-        <w:insideH w:val="single" w:color="auto" w:sz="4" w:space="0"/>
-        <w:insideV w:val="single" w:color="auto" w:sz="4" w:space="0"/>
+        <w:top w:val="single" w:sz="4" w:space="0" w:color="auto"/>
+        <w:left w:val="single" w:sz="4" w:space="0" w:color="auto"/>
+        <w:bottom w:val="single" w:sz="4" w:space="0" w:color="auto"/>
+        <w:right w:val="single" w:sz="4" w:space="0" w:color="auto"/>
+        <w:insideH w:val="single" w:sz="4" w:space="0" w:color="auto"/>
+        <w:insideV w:val="single" w:sz="4" w:space="0" w:color="auto"/>
       </w:tblBorders>
     </w:tblPr>
   </w:style>
@@ -13841,7 +13609,7 @@
       <w:color w:val="808080"/>
     </w:rPr>
   </w:style>
-  <w:style w:type="paragraph" w:styleId="NormalText" w:customStyle="1">
+  <w:style w:type="paragraph" w:customStyle="1" w:styleId="NormalText">
     <w:name w:val="Normal Text"/>
     <w:rsid w:val="003F3BFE"/>
     <w:pPr>
@@ -13851,20 +13619,20 @@
       <w:adjustRightInd w:val="0"/>
     </w:pPr>
     <w:rPr>
-      <w:rFonts w:ascii="Times New Roman" w:hAnsi="Times New Roman" w:eastAsia="Times New Roman" w:cs="Times New Roman"/>
+      <w:rFonts w:ascii="Times New Roman" w:eastAsia="Times New Roman" w:hAnsi="Times New Roman" w:cs="Times New Roman"/>
       <w:color w:val="000000"/>
       <w:sz w:val="20"/>
       <w:szCs w:val="20"/>
     </w:rPr>
   </w:style>
-  <w:style w:type="character" w:styleId="Heading1Char" w:customStyle="1">
+  <w:style w:type="character" w:customStyle="1" w:styleId="Heading1Char">
     <w:name w:val="Heading 1 Char"/>
     <w:basedOn w:val="DefaultParagraphFont"/>
     <w:link w:val="Heading1"/>
     <w:uiPriority w:val="9"/>
     <w:rsid w:val="00D00A5E"/>
     <w:rPr>
-      <w:rFonts w:ascii="Times New Roman" w:hAnsi="Times New Roman" w:eastAsia="Times New Roman" w:cs="Times New Roman"/>
+      <w:rFonts w:ascii="Times New Roman" w:eastAsia="Times New Roman" w:hAnsi="Times New Roman" w:cs="Times New Roman"/>
       <w:b/>
       <w:bCs/>
       <w:kern w:val="36"/>
@@ -13873,14 +13641,14 @@
       <w:lang w:eastAsia="zh-CN"/>
     </w:rPr>
   </w:style>
-  <w:style w:type="character" w:styleId="Heading3Char" w:customStyle="1">
+  <w:style w:type="character" w:customStyle="1" w:styleId="Heading3Char">
     <w:name w:val="Heading 3 Char"/>
     <w:basedOn w:val="DefaultParagraphFont"/>
     <w:link w:val="Heading3"/>
     <w:uiPriority w:val="9"/>
     <w:rsid w:val="00D00A5E"/>
     <w:rPr>
-      <w:rFonts w:ascii="Times New Roman" w:hAnsi="Times New Roman" w:eastAsia="Times New Roman" w:cs="Times New Roman"/>
+      <w:rFonts w:ascii="Times New Roman" w:eastAsia="Times New Roman" w:hAnsi="Times New Roman" w:cs="Times New Roman"/>
       <w:b/>
       <w:bCs/>
       <w:sz w:val="27"/>
@@ -13888,19 +13656,19 @@
       <w:lang w:eastAsia="zh-CN"/>
     </w:rPr>
   </w:style>
-  <w:style w:type="character" w:styleId="apple-converted-space" w:customStyle="1">
+  <w:style w:type="character" w:customStyle="1" w:styleId="apple-converted-space">
     <w:name w:val="apple-converted-space"/>
     <w:basedOn w:val="DefaultParagraphFont"/>
     <w:rsid w:val="00D00A5E"/>
   </w:style>
-  <w:style w:type="character" w:styleId="Heading2Char" w:customStyle="1">
+  <w:style w:type="character" w:customStyle="1" w:styleId="Heading2Char">
     <w:name w:val="Heading 2 Char"/>
     <w:basedOn w:val="DefaultParagraphFont"/>
     <w:link w:val="Heading2"/>
     <w:uiPriority w:val="9"/>
     <w:rsid w:val="00D00A5E"/>
     <w:rPr>
-      <w:rFonts w:asciiTheme="majorHAnsi" w:hAnsiTheme="majorHAnsi" w:eastAsiaTheme="majorEastAsia" w:cstheme="majorBidi"/>
+      <w:rFonts w:asciiTheme="majorHAnsi" w:eastAsiaTheme="majorEastAsia" w:hAnsiTheme="majorHAnsi" w:cstheme="majorBidi"/>
       <w:color w:val="2E74B5" w:themeColor="accent1" w:themeShade="BF"/>
       <w:sz w:val="26"/>
       <w:szCs w:val="26"/>
@@ -13919,17 +13687,17 @@
       <w:u w:val="single"/>
     </w:rPr>
   </w:style>
-  <w:style w:type="character" w:styleId="md-ignore" w:customStyle="1">
+  <w:style w:type="character" w:customStyle="1" w:styleId="md-ignore">
     <w:name w:val="md-ignore"/>
     <w:basedOn w:val="DefaultParagraphFont"/>
     <w:rsid w:val="00F43E07"/>
   </w:style>
-  <w:style w:type="character" w:styleId="mi" w:customStyle="1">
+  <w:style w:type="character" w:customStyle="1" w:styleId="mi">
     <w:name w:val="mi"/>
     <w:basedOn w:val="DefaultParagraphFont"/>
     <w:rsid w:val="00F43E07"/>
   </w:style>
-  <w:style w:type="character" w:styleId="mn" w:customStyle="1">
+  <w:style w:type="character" w:customStyle="1" w:styleId="mn">
     <w:name w:val="mn"/>
     <w:basedOn w:val="DefaultParagraphFont"/>
     <w:rsid w:val="00F43E07"/>
@@ -13968,7 +13736,7 @@
       <w:szCs w:val="20"/>
     </w:rPr>
   </w:style>
-  <w:style w:type="character" w:styleId="HTMLPreformattedChar" w:customStyle="1">
+  <w:style w:type="character" w:customStyle="1" w:styleId="HTMLPreformattedChar">
     <w:name w:val="HTML Preformatted Char"/>
     <w:basedOn w:val="DefaultParagraphFont"/>
     <w:link w:val="HTMLPreformatted"/>
@@ -13976,7 +13744,7 @@
     <w:semiHidden/>
     <w:rsid w:val="00802378"/>
     <w:rPr>
-      <w:rFonts w:ascii="Courier New" w:hAnsi="Courier New" w:eastAsia="Times New Roman" w:cs="Courier New"/>
+      <w:rFonts w:ascii="Courier New" w:eastAsia="Times New Roman" w:hAnsi="Courier New" w:cs="Courier New"/>
       <w:sz w:val="20"/>
       <w:szCs w:val="20"/>
       <w:lang w:eastAsia="zh-CN"/>
@@ -13986,7 +13754,7 @@
 </file>
 
 <file path=word/theme/theme1.xml><?xml version="1.0" encoding="utf-8"?>
-<a:theme xmlns:a="http://schemas.openxmlformats.org/drawingml/2006/main" xmlns:thm15="http://schemas.microsoft.com/office/thememl/2012/main" name="Office Theme">
+<a:theme xmlns:a="http://schemas.openxmlformats.org/drawingml/2006/main" name="Office Theme">
   <a:themeElements>
     <a:clrScheme name="Office">
       <a:dk1>

</xml_diff>